<commit_message>
docs: user guide and contracts without the removed old tools
- Guide (MD/HTML/Word/PDF): drop «Старі інструменти» section and the
  Tools/Old libraries nodes; v0.5.112.
- CONVERTER.md: owner decision + where the archived code lives.
- UI_CONTRACT, README, STATUS updated; ledger entry with the lesson.

Co-Authored-By: Claude Opus 5.5 <noreply@anthropic.com>
Claude-Session: https://claude.ai/code/session_01QCiqRcxM21fUhfrHmrRACL
</commit_message>
<xml_diff>
--- a/docs/ua/Posibnyk-Renault-Docs.docx
+++ b/docs/ua/Posibnyk-Renault-Docs.docx
@@ -13,7 +13,7 @@
           <w:sz w:val="18"/>
           <w:szCs w:val="18"/>
         </w:rPr>
-        <w:t xml:space="preserve">RENAULT DOCS · v0.5.111 · 12.10.2026</w:t>
+        <w:t xml:space="preserve">RENAULT DOCS · v0.5.112 · 12.10.2026</w:t>
       </w:r>
     </w:p>
     <w:p>
@@ -155,21 +155,6 @@
           <w:rFonts w:ascii="DejaVu Sans" w:cs="DejaVu Sans" w:eastAsia="DejaVu Sans" w:hAnsi="DejaVu Sans"/>
         </w:rPr>
         <w:t xml:space="preserve">Налаштування</w:t>
-      </w:r>
-    </w:p>
-    <w:p>
-      <w:pPr>
-        <w:pStyle w:val="ListParagraph"/>
-        <w:numPr>
-          <w:ilvl w:val="0"/>
-          <w:numId w:val="2"/>
-        </w:numPr>
-      </w:pPr>
-      <w:r>
-        <w:rPr>
-          <w:rFonts w:ascii="DejaVu Sans" w:cs="DejaVu Sans" w:eastAsia="DejaVu Sans" w:hAnsi="DejaVu Sans"/>
-        </w:rPr>
-        <w:t xml:space="preserve">Старі інструменти: Конвертер, Legacy, «Старі бібліотеки»</w:t>
       </w:r>
     </w:p>
     <w:p>
@@ -392,7 +377,7 @@
           <w:b w:val="false"/>
           <w:bCs w:val="false"/>
         </w:rPr>
-        <w:t xml:space="preserve">Зверху — панель «Додати». Її можна згорнути кнопкою ▼/▲ і закріпити 📌. Нижче — твої проєкти «Мої Renault», ще нижче — «Старі бібліотеки», якщо вони є. Значок ключа вгорі праворуч відкриває налаштування.</w:t>
+        <w:t xml:space="preserve">Зверху — панель «Додати». Її можна згорнути кнопкою ▼/▲ і закріпити 📌. Нижче — твої проєкти «Мої Renault». Значок ключа вгорі праворуч відкриває налаштування.</w:t>
       </w:r>
     </w:p>
     <w:p>
@@ -403,7 +388,7 @@
       <w:r>
         <w:drawing>
           <wp:inline distT="0" distB="0" distL="0" distR="0">
-            <wp:extent cx="5715000" cy="4152900"/>
+            <wp:extent cx="5715000" cy="3009900"/>
             <wp:effectExtent t="0" r="0" b="0" l="0"/>
             <wp:docPr id="1" name="" descr="" title=""/>
             <wp:cNvGraphicFramePr>
@@ -428,7 +413,7 @@
                   <pic:spPr bwMode="auto">
                     <a:xfrm>
                       <a:off x="0" y="0"/>
-                      <a:ext cx="5715000" cy="4152900"/>
+                      <a:ext cx="5715000" cy="3009900"/>
                     </a:xfrm>
                     <a:prstGeom prst="rect">
                       <a:avLst/>
@@ -1273,135 +1258,6 @@
         <w:rPr>
           <w:rFonts w:ascii="DejaVu Sans" w:cs="DejaVu Sans" w:eastAsia="DejaVu Sans" w:hAnsi="DejaVu Sans"/>
         </w:rPr>
-        <w:t xml:space="preserve">Старі інструменти: Конвертер, Legacy, «Старі бібліотеки»</w:t>
-      </w:r>
-    </w:p>
-    <w:p>
-      <w:pPr>
-        <w:spacing w:after="140"/>
-      </w:pPr>
-      <w:r>
-        <w:rPr>
-          <w:rFonts w:ascii="DejaVu Sans" w:cs="DejaVu Sans" w:eastAsia="DejaVu Sans" w:hAnsi="DejaVu Sans"/>
-          <w:b w:val="false"/>
-          <w:bCs w:val="false"/>
-        </w:rPr>
-        <w:t xml:space="preserve">Це перша сходинка проєкту, ще до нинішніх томів. Конвертер робить зі старої Windows-папки копію …_android з виправленими посиланнями. «Legacy» додає таку готову копію в застосунок, і вона зʼявляється в «Старих бібліотеках».</w:t>
-      </w:r>
-    </w:p>
-    <w:p>
-      <w:pPr>
-        <w:spacing w:after="160" w:before="120" w:line="240" w:lineRule="auto"/>
-        <w:jc w:val="center"/>
-      </w:pPr>
-      <w:r>
-        <w:drawing>
-          <wp:inline distT="0" distB="0" distL="0" distR="0">
-            <wp:extent cx="5715000" cy="3752850"/>
-            <wp:effectExtent t="0" r="0" b="0" l="0"/>
-            <wp:docPr id="1" name="" descr="" title=""/>
-            <wp:cNvGraphicFramePr>
-              <a:graphicFrameLocks xmlns:a="http://schemas.openxmlformats.org/drawingml/2006/main" noChangeAspect="1"/>
-            </wp:cNvGraphicFramePr>
-            <a:graphic xmlns:a="http://schemas.openxmlformats.org/drawingml/2006/main">
-              <a:graphicData uri="http://schemas.openxmlformats.org/drawingml/2006/picture">
-                <pic:pic xmlns:pic="http://schemas.openxmlformats.org/drawingml/2006/picture">
-                  <pic:nvPicPr>
-                    <pic:cNvPr id="0" name="" descr=""/>
-                    <pic:cNvPicPr>
-                      <a:picLocks noChangeAspect="1" noChangeArrowheads="1"/>
-                    </pic:cNvPicPr>
-                  </pic:nvPicPr>
-                  <pic:blipFill>
-                    <a:blip r:embed="rId14" cstate="none"/>
-                    <a:srcRect/>
-                    <a:stretch>
-                      <a:fillRect/>
-                    </a:stretch>
-                  </pic:blipFill>
-                  <pic:spPr bwMode="auto">
-                    <a:xfrm>
-                      <a:off x="0" y="0"/>
-                      <a:ext cx="5715000" cy="3752850"/>
-                    </a:xfrm>
-                    <a:prstGeom prst="rect">
-                      <a:avLst/>
-                    </a:prstGeom>
-                  </pic:spPr>
-                </pic:pic>
-              </a:graphicData>
-            </a:graphic>
-          </wp:inline>
-        </w:drawing>
-      </w:r>
-    </w:p>
-    <w:p>
-      <w:pPr>
-        <w:pStyle w:val="ListParagraph"/>
-        <w:numPr>
-          <w:ilvl w:val="0"/>
-          <w:numId w:val="3"/>
-        </w:numPr>
-        <w:spacing w:after="80"/>
-      </w:pPr>
-      <w:r>
-        <w:rPr>
-          <w:rFonts w:ascii="DejaVu Sans" w:cs="DejaVu Sans" w:eastAsia="DejaVu Sans" w:hAnsi="DejaVu Sans"/>
-          <w:b w:val="false"/>
-          <w:bCs w:val="false"/>
-        </w:rPr>
-        <w:t xml:space="preserve">Для звичайної роботи ці інструменти не потрібні: «Новий том» робить те саме краще.</w:t>
-      </w:r>
-    </w:p>
-    <w:p>
-      <w:pPr>
-        <w:pStyle w:val="ListParagraph"/>
-        <w:numPr>
-          <w:ilvl w:val="0"/>
-          <w:numId w:val="3"/>
-        </w:numPr>
-        <w:spacing w:after="80"/>
-      </w:pPr>
-      <w:r>
-        <w:rPr>
-          <w:rFonts w:ascii="DejaVu Sans" w:cs="DejaVu Sans" w:eastAsia="DejaVu Sans" w:hAnsi="DejaVu Sans"/>
-          <w:b w:val="false"/>
-          <w:bCs w:val="false"/>
-        </w:rPr>
-        <w:t xml:space="preserve">У браузері на телефоні копія сама не відкривається — потрібен локальний сервер.</w:t>
-      </w:r>
-    </w:p>
-    <w:p>
-      <w:pPr>
-        <w:pStyle w:val="ListParagraph"/>
-        <w:numPr>
-          <w:ilvl w:val="0"/>
-          <w:numId w:val="3"/>
-        </w:numPr>
-        <w:spacing w:after="80"/>
-      </w:pPr>
-      <w:r>
-        <w:rPr>
-          <w:rFonts w:ascii="DejaVu Sans" w:cs="DejaVu Sans" w:eastAsia="DejaVu Sans" w:hAnsi="DejaVu Sans"/>
-          <w:b w:val="false"/>
-          <w:bCs w:val="false"/>
-        </w:rPr>
-        <w:t xml:space="preserve">Що з ними робити далі (залишити, сховати чи прибрати), ще вирішується.</w:t>
-      </w:r>
-    </w:p>
-    <w:p>
-      <w:r>
-        <w:br w:type="page"/>
-      </w:r>
-    </w:p>
-    <w:p>
-      <w:pPr>
-        <w:pStyle w:val="Heading1"/>
-      </w:pPr>
-      <w:r>
-        <w:rPr>
-          <w:rFonts w:ascii="DejaVu Sans" w:cs="DejaVu Sans" w:eastAsia="DejaVu Sans" w:hAnsi="DejaVu Sans"/>
-        </w:rPr>
         <w:t xml:space="preserve">Безпека даних</w:t>
       </w:r>
     </w:p>
@@ -1490,7 +1346,7 @@
           <w:sz w:val="18"/>
           <w:szCs w:val="18"/>
         </w:rPr>
-        <w:t xml:space="preserve">Посібник зібрано з коду застосунку v0.5.111. Якщо кнопка на телефоні називається інакше — правда за телефоном.</w:t>
+        <w:t xml:space="preserve">Посібник зібрано з коду застосунку v0.5.112. Якщо кнопка на телефоні називається інакше — правда за телефоном.</w:t>
       </w:r>
     </w:p>
     <w:sectPr>

</xml_diff>

<commit_message>
docs: user guide updated to v0.5.121 (green frame, criteria, pinned card, PDF/print, companion navigator)
Co-Authored-By: Claude Opus 5.5 <noreply@anthropic.com>
Claude-Session: https://claude.ai/code/session_01QCiqRcxM21fUhfrHmrRACL
</commit_message>
<xml_diff>
--- a/docs/ua/Posibnyk-Renault-Docs.docx
+++ b/docs/ua/Posibnyk-Renault-Docs.docx
@@ -13,7 +13,7 @@
           <w:sz w:val="18"/>
           <w:szCs w:val="18"/>
         </w:rPr>
-        <w:t xml:space="preserve">RENAULT DOCS · v0.5.112 · 12.10.2026</w:t>
+        <w:t xml:space="preserve">RENAULT DOCS · v0.5.121 · 13.10.2026</w:t>
       </w:r>
     </w:p>
     <w:p>
@@ -110,6 +110,36 @@
           <w:rFonts w:ascii="DejaVu Sans" w:cs="DejaVu Sans" w:eastAsia="DejaVu Sans" w:hAnsi="DejaVu Sans"/>
         </w:rPr>
         <w:t xml:space="preserve">Як читати том</w:t>
+      </w:r>
+    </w:p>
+    <w:p>
+      <w:pPr>
+        <w:pStyle w:val="ListParagraph"/>
+        <w:numPr>
+          <w:ilvl w:val="0"/>
+          <w:numId w:val="2"/>
+        </w:numPr>
+      </w:pPr>
+      <w:r>
+        <w:rPr>
+          <w:rFonts w:ascii="DejaVu Sans" w:cs="DejaVu Sans" w:eastAsia="DejaVu Sans" w:hAnsi="DejaVu Sans"/>
+        </w:rPr>
+        <w:t xml:space="preserve">PDF, масштаб і друк</w:t>
+      </w:r>
+    </w:p>
+    <w:p>
+      <w:pPr>
+        <w:pStyle w:val="ListParagraph"/>
+        <w:numPr>
+          <w:ilvl w:val="0"/>
+          <w:numId w:val="2"/>
+        </w:numPr>
+      </w:pPr>
+      <w:r>
+        <w:rPr>
+          <w:rFonts w:ascii="DejaVu Sans" w:cs="DejaVu Sans" w:eastAsia="DejaVu Sans" w:hAnsi="DejaVu Sans"/>
+        </w:rPr>
+        <w:t xml:space="preserve">Друге вікно «Документація поруч»</w:t>
       </w:r>
     </w:p>
     <w:p>
@@ -711,7 +741,7 @@
       <w:r>
         <w:drawing>
           <wp:inline distT="0" distB="0" distL="0" distR="0">
-            <wp:extent cx="5715000" cy="2381250"/>
+            <wp:extent cx="5715000" cy="3238500"/>
             <wp:effectExtent t="0" r="0" b="0" l="0"/>
             <wp:docPr id="1" name="" descr="" title=""/>
             <wp:cNvGraphicFramePr>
@@ -736,7 +766,7 @@
                   <pic:spPr bwMode="auto">
                     <a:xfrm>
                       <a:off x="0" y="0"/>
-                      <a:ext cx="5715000" cy="2381250"/>
+                      <a:ext cx="5715000" cy="3238500"/>
                     </a:xfrm>
                     <a:prstGeom prst="rect">
                       <a:avLst/>
@@ -831,6 +861,84 @@
       <w:r>
         <w:rPr>
           <w:rFonts w:ascii="DejaVu Sans" w:cs="DejaVu Sans" w:eastAsia="DejaVu Sans" w:hAnsi="DejaVu Sans"/>
+          <w:b/>
+          <w:bCs/>
+        </w:rPr>
+        <w:t xml:space="preserve">Зелена рамка</w:t>
+      </w:r>
+      <w:r>
+        <w:rPr>
+          <w:rFonts w:ascii="DejaVu Sans" w:cs="DejaVu Sans" w:eastAsia="DejaVu Sans" w:hAnsi="DejaVu Sans"/>
+          <w:b w:val="false"/>
+          <w:bCs w:val="false"/>
+        </w:rPr>
+        <w:t xml:space="preserve"> — де вибираєш зі списку, вибране обведене зеленим: відкрита вкладка, схема, розʼєм, останній розділ. Рамка лишається після «Назад» і повороту екрана, поки працює застосунок.</w:t>
+      </w:r>
+    </w:p>
+    <w:p>
+      <w:pPr>
+        <w:pStyle w:val="ListParagraph"/>
+        <w:numPr>
+          <w:ilvl w:val="0"/>
+          <w:numId w:val="3"/>
+        </w:numPr>
+        <w:spacing w:after="80"/>
+      </w:pPr>
+      <w:r>
+        <w:rPr>
+          <w:rFonts w:ascii="DejaVu Sans" w:cs="DejaVu Sans" w:eastAsia="DejaVu Sans" w:hAnsi="DejaVu Sans"/>
+          <w:b/>
+          <w:bCs/>
+        </w:rPr>
+        <w:t xml:space="preserve">«Критерії / скорочення»</w:t>
+      </w:r>
+      <w:r>
+        <w:rPr>
+          <w:rFonts w:ascii="DejaVu Sans" w:cs="DejaVu Sans" w:eastAsia="DejaVu Sans" w:hAnsi="DejaVu Sans"/>
+          <w:b w:val="false"/>
+          <w:bCs w:val="false"/>
+        </w:rPr>
+        <w:t xml:space="preserve"> закріплені під меню розділу. Дотик відкриває таблицю скорочень поверх списку; ✕ або «Назад» закривають її, список не зрушує.</w:t>
+      </w:r>
+    </w:p>
+    <w:p>
+      <w:pPr>
+        <w:pStyle w:val="ListParagraph"/>
+        <w:numPr>
+          <w:ilvl w:val="0"/>
+          <w:numId w:val="3"/>
+        </w:numPr>
+        <w:spacing w:after="80"/>
+      </w:pPr>
+      <w:r>
+        <w:rPr>
+          <w:rFonts w:ascii="DejaVu Sans" w:cs="DejaVu Sans" w:eastAsia="DejaVu Sans" w:hAnsi="DejaVu Sans"/>
+          <w:b/>
+          <w:bCs/>
+        </w:rPr>
+        <w:t xml:space="preserve">Картка «ВИБРАНО»</w:t>
+      </w:r>
+      <w:r>
+        <w:rPr>
+          <w:rFonts w:ascii="DejaVu Sans" w:cs="DejaVu Sans" w:eastAsia="DejaVu Sans" w:hAnsi="DejaVu Sans"/>
+          <w:b w:val="false"/>
+          <w:bCs w:val="false"/>
+        </w:rPr>
+        <w:t xml:space="preserve"> — вибраний розʼєм і його документи («Схема + піни», «Схема розʼєму», «Опис контактів») стоять над списком. «Опис контактів» сам прокручує до таблиці.</w:t>
+      </w:r>
+    </w:p>
+    <w:p>
+      <w:pPr>
+        <w:pStyle w:val="ListParagraph"/>
+        <w:numPr>
+          <w:ilvl w:val="0"/>
+          <w:numId w:val="3"/>
+        </w:numPr>
+        <w:spacing w:after="80"/>
+      </w:pPr>
+      <w:r>
+        <w:rPr>
+          <w:rFonts w:ascii="DejaVu Sans" w:cs="DejaVu Sans" w:eastAsia="DejaVu Sans" w:hAnsi="DejaVu Sans"/>
           <w:b w:val="false"/>
           <w:bCs w:val="false"/>
         </w:rPr>
@@ -850,7 +958,7 @@
         <w:rPr>
           <w:rFonts w:ascii="DejaVu Sans" w:cs="DejaVu Sans" w:eastAsia="DejaVu Sans" w:hAnsi="DejaVu Sans"/>
         </w:rPr>
-        <w:t xml:space="preserve">Як поділитися</w:t>
+        <w:t xml:space="preserve">PDF, масштаб і друк</w:t>
       </w:r>
     </w:p>
     <w:p>
@@ -863,7 +971,7 @@
           <w:b w:val="false"/>
           <w:bCs w:val="false"/>
         </w:rPr>
-        <w:t xml:space="preserve">Є три способи — залежно від того, скільки томів потрібно передати.</w:t>
+        <w:t xml:space="preserve">Схеми PDF відкриваються у вбудованому переглядачі. Панель кнопок угорі однакового розміру скрізь: на окремому екрані, у «Схема + піни» і в другому вікні.</w:t>
       </w:r>
     </w:p>
     <w:p>
@@ -874,7 +982,7 @@
       <w:r>
         <w:drawing>
           <wp:inline distT="0" distB="0" distL="0" distR="0">
-            <wp:extent cx="5715000" cy="2495550"/>
+            <wp:extent cx="5715000" cy="3067050"/>
             <wp:effectExtent t="0" r="0" b="0" l="0"/>
             <wp:docPr id="1" name="" descr="" title=""/>
             <wp:cNvGraphicFramePr>
@@ -899,7 +1007,7 @@
                   <pic:spPr bwMode="auto">
                     <a:xfrm>
                       <a:off x="0" y="0"/>
-                      <a:ext cx="5715000" cy="2495550"/>
+                      <a:ext cx="5715000" cy="3067050"/>
                     </a:xfrm>
                     <a:prstGeom prst="rect">
                       <a:avLst/>
@@ -924,72 +1032,80 @@
       <w:r>
         <w:rPr>
           <w:rFonts w:ascii="DejaVu Sans" w:cs="DejaVu Sans" w:eastAsia="DejaVu Sans" w:hAnsi="DejaVu Sans"/>
+          <w:b w:val="false"/>
+          <w:bCs w:val="false"/>
+        </w:rPr>
+        <w:t xml:space="preserve">Меню ▾ біля відсотків має кроки аж до 450% і 500%.</w:t>
+      </w:r>
+    </w:p>
+    <w:p>
+      <w:pPr>
+        <w:pStyle w:val="ListParagraph"/>
+        <w:numPr>
+          <w:ilvl w:val="0"/>
+          <w:numId w:val="3"/>
+        </w:numPr>
+        <w:spacing w:after="80"/>
+      </w:pPr>
+      <w:r>
+        <w:rPr>
+          <w:rFonts w:ascii="DejaVu Sans" w:cs="DejaVu Sans" w:eastAsia="DejaVu Sans" w:hAnsi="DejaVu Sans"/>
+          <w:b w:val="false"/>
+          <w:bCs w:val="false"/>
+        </w:rPr>
+        <w:t xml:space="preserve">На «Схема + піни» сама сторінка не масштабується — збільшується кожен документ окремо, нижній не зникає.</w:t>
+      </w:r>
+    </w:p>
+    <w:p>
+      <w:pPr>
+        <w:pStyle w:val="ListParagraph"/>
+        <w:numPr>
+          <w:ilvl w:val="0"/>
+          <w:numId w:val="3"/>
+        </w:numPr>
+        <w:spacing w:after="80"/>
+      </w:pPr>
+      <w:r>
+        <w:rPr>
+          <w:rFonts w:ascii="DejaVu Sans" w:cs="DejaVu Sans" w:eastAsia="DejaVu Sans" w:hAnsi="DejaVu Sans"/>
+          <w:b w:val="false"/>
+          <w:bCs w:val="false"/>
+        </w:rPr>
+        <w:t xml:space="preserve">Друк — лише через </w:t>
+      </w:r>
+      <w:r>
+        <w:rPr>
+          <w:rFonts w:ascii="DejaVu Sans" w:cs="DejaVu Sans" w:eastAsia="DejaVu Sans" w:hAnsi="DejaVu Sans"/>
           <w:b/>
           <w:bCs/>
         </w:rPr>
-        <w:t xml:space="preserve">Правило ⇧:</w:t>
-      </w:r>
-      <w:r>
-        <w:rPr>
-          <w:rFonts w:ascii="DejaVu Sans" w:cs="DejaVu Sans" w:eastAsia="DejaVu Sans" w:hAnsi="DejaVu Sans"/>
-          <w:b w:val="false"/>
-          <w:bCs w:val="false"/>
-        </w:rPr>
-        <w:t xml:space="preserve"> один підготовлений файл на том і на проєкт. Щоб зробити новий — спершу видали старий через ⋮.</w:t>
-      </w:r>
-    </w:p>
-    <w:p>
-      <w:pPr>
-        <w:pStyle w:val="ListParagraph"/>
-        <w:numPr>
-          <w:ilvl w:val="0"/>
-          <w:numId w:val="3"/>
-        </w:numPr>
-        <w:spacing w:after="80"/>
-      </w:pPr>
-      <w:r>
-        <w:rPr>
-          <w:rFonts w:ascii="DejaVu Sans" w:cs="DejaVu Sans" w:eastAsia="DejaVu Sans" w:hAnsi="DejaVu Sans"/>
-          <w:b w:val="false"/>
-          <w:bCs w:val="false"/>
-        </w:rPr>
-        <w:t xml:space="preserve">Ще один шлях для одного тому: ⋮ тому → «Експортувати .rdpkg» → вибрати, куди зберегти.</w:t>
-      </w:r>
-    </w:p>
-    <w:p>
-      <w:pPr>
-        <w:pStyle w:val="ListParagraph"/>
-        <w:numPr>
-          <w:ilvl w:val="0"/>
-          <w:numId w:val="3"/>
-        </w:numPr>
-        <w:spacing w:after="80"/>
-      </w:pPr>
-      <w:r>
-        <w:rPr>
-          <w:rFonts w:ascii="DejaVu Sans" w:cs="DejaVu Sans" w:eastAsia="DejaVu Sans" w:hAnsi="DejaVu Sans"/>
-          <w:b w:val="false"/>
-          <w:bCs w:val="false"/>
-        </w:rPr>
-        <w:t xml:space="preserve">Однойменні файли в папці не перезаписуються.</w:t>
-      </w:r>
-    </w:p>
-    <w:p>
-      <w:pPr>
-        <w:pBdr>
-          <w:left w:val="single" w:color="8A5A12" w:sz="18" w:space="8"/>
-        </w:pBdr>
-        <w:shd w:fill="FBF1DF" w:color="auto" w:val="clear"/>
-        <w:spacing w:after="160" w:before="120"/>
-      </w:pPr>
-      <w:r>
-        <w:rPr>
-          <w:rFonts w:ascii="DejaVu Sans" w:cs="DejaVu Sans" w:eastAsia="DejaVu Sans" w:hAnsi="DejaVu Sans"/>
-          <w:b/>
-          <w:bCs/>
-          <w:color w:val="8A5A12"/>
-        </w:rPr>
-        <w:t xml:space="preserve">Файл .rdproject поки можна лише відправити. Відкрити його в застосунку на іншому телефоні ще не можна — це в плані. Для передачі краще томи .rdpkg: їх застосунок відкриває через «Авто».</w:t>
+        <w:t xml:space="preserve">оригінальний значок принтера</w:t>
+      </w:r>
+      <w:r>
+        <w:rPr>
+          <w:rFonts w:ascii="DejaVu Sans" w:cs="DejaVu Sans" w:eastAsia="DejaVu Sans" w:hAnsi="DejaVu Sans"/>
+          <w:b w:val="false"/>
+          <w:bCs w:val="false"/>
+        </w:rPr>
+        <w:t xml:space="preserve"> Renault на документі. Окремих кнопок «Друк» застосунок не додає.</w:t>
+      </w:r>
+    </w:p>
+    <w:p>
+      <w:pPr>
+        <w:pStyle w:val="ListParagraph"/>
+        <w:numPr>
+          <w:ilvl w:val="0"/>
+          <w:numId w:val="3"/>
+        </w:numPr>
+        <w:spacing w:after="80"/>
+      </w:pPr>
+      <w:r>
+        <w:rPr>
+          <w:rFonts w:ascii="DejaVu Sans" w:cs="DejaVu Sans" w:eastAsia="DejaVu Sans" w:hAnsi="DejaVu Sans"/>
+          <w:b w:val="false"/>
+          <w:bCs w:val="false"/>
+        </w:rPr>
+        <w:t xml:space="preserve">Якщо в документа є друкований варіант (чорно-білий), друкується саме він.</w:t>
       </w:r>
     </w:p>
     <w:p>
@@ -1005,7 +1121,7 @@
         <w:rPr>
           <w:rFonts w:ascii="DejaVu Sans" w:cs="DejaVu Sans" w:eastAsia="DejaVu Sans" w:hAnsi="DejaVu Sans"/>
         </w:rPr>
-        <w:t xml:space="preserve">Довгі операції і «Скасувати»</w:t>
+        <w:t xml:space="preserve">Друге вікно «Документація поруч»</w:t>
       </w:r>
     </w:p>
     <w:p>
@@ -1018,7 +1134,7 @@
           <w:b w:val="false"/>
           <w:bCs w:val="false"/>
         </w:rPr>
-        <w:t xml:space="preserve">Підготовка, експорт, імпорт і створення тому йдуть у фоні. Застосунок можна згорнути, прогрес видно у шторці. На екрані — картка з зеленою смугою.</w:t>
+        <w:t xml:space="preserve">Кнопка ◫ у панелі PDF відкриває друге вікно знизу. Верхній документ лишається, а знизу можна відкрити будь-який інший документ цього тому — так зверху і знизу стоять два різні документи.</w:t>
       </w:r>
     </w:p>
     <w:p>
@@ -1029,7 +1145,7 @@
       <w:r>
         <w:drawing>
           <wp:inline distT="0" distB="0" distL="0" distR="0">
-            <wp:extent cx="5715000" cy="2800350"/>
+            <wp:extent cx="5715000" cy="3609975"/>
             <wp:effectExtent t="0" r="0" b="0" l="0"/>
             <wp:docPr id="1" name="" descr="" title=""/>
             <wp:cNvGraphicFramePr>
@@ -1054,6 +1170,326 @@
                   <pic:spPr bwMode="auto">
                     <a:xfrm>
                       <a:off x="0" y="0"/>
+                      <a:ext cx="5715000" cy="3609975"/>
+                    </a:xfrm>
+                    <a:prstGeom prst="rect">
+                      <a:avLst/>
+                    </a:prstGeom>
+                  </pic:spPr>
+                </pic:pic>
+              </a:graphicData>
+            </a:graphic>
+          </wp:inline>
+        </w:drawing>
+      </w:r>
+    </w:p>
+    <w:p>
+      <w:pPr>
+        <w:pStyle w:val="ListParagraph"/>
+        <w:numPr>
+          <w:ilvl w:val="0"/>
+          <w:numId w:val="3"/>
+        </w:numPr>
+        <w:spacing w:after="80"/>
+      </w:pPr>
+      <w:r>
+        <w:rPr>
+          <w:rFonts w:ascii="DejaVu Sans" w:cs="DejaVu Sans" w:eastAsia="DejaVu Sans" w:hAnsi="DejaVu Sans"/>
+          <w:b w:val="false"/>
+          <w:bCs w:val="false"/>
+        </w:rPr>
+        <w:t xml:space="preserve">«←» у другому вікні — крок назад по ланцюжку: документ → розділ → том → закрити.</w:t>
+      </w:r>
+    </w:p>
+    <w:p>
+      <w:pPr>
+        <w:pStyle w:val="ListParagraph"/>
+        <w:numPr>
+          <w:ilvl w:val="0"/>
+          <w:numId w:val="3"/>
+        </w:numPr>
+        <w:spacing w:after="80"/>
+      </w:pPr>
+      <w:r>
+        <w:rPr>
+          <w:rFonts w:ascii="DejaVu Sans" w:cs="DejaVu Sans" w:eastAsia="DejaVu Sans" w:hAnsi="DejaVu Sans"/>
+          <w:b w:val="false"/>
+          <w:bCs w:val="false"/>
+        </w:rPr>
+        <w:t xml:space="preserve">Вкладки розділу міняють одна одну, тож «←» з розділу веде одразу в том.</w:t>
+      </w:r>
+    </w:p>
+    <w:p>
+      <w:pPr>
+        <w:pStyle w:val="ListParagraph"/>
+        <w:numPr>
+          <w:ilvl w:val="0"/>
+          <w:numId w:val="3"/>
+        </w:numPr>
+        <w:spacing w:after="80"/>
+      </w:pPr>
+      <w:r>
+        <w:rPr>
+          <w:rFonts w:ascii="DejaVu Sans" w:cs="DejaVu Sans" w:eastAsia="DejaVu Sans" w:hAnsi="DejaVu Sans"/>
+          <w:b w:val="false"/>
+          <w:bCs w:val="false"/>
+        </w:rPr>
+        <w:t xml:space="preserve">Таблиці («Опис контактів», «Критерії / скорочення») показуються прямо в другому вікні.</w:t>
+      </w:r>
+    </w:p>
+    <w:p>
+      <w:pPr>
+        <w:pStyle w:val="ListParagraph"/>
+        <w:numPr>
+          <w:ilvl w:val="0"/>
+          <w:numId w:val="3"/>
+        </w:numPr>
+        <w:spacing w:after="80"/>
+      </w:pPr>
+      <w:r>
+        <w:rPr>
+          <w:rFonts w:ascii="DejaVu Sans" w:cs="DejaVu Sans" w:eastAsia="DejaVu Sans" w:hAnsi="DejaVu Sans"/>
+          <w:b w:val="false"/>
+          <w:bCs w:val="false"/>
+        </w:rPr>
+        <w:t xml:space="preserve">Останнє відкрите на кожному кроці — у зеленій рамці.</w:t>
+      </w:r>
+    </w:p>
+    <w:p>
+      <w:pPr>
+        <w:pStyle w:val="ListParagraph"/>
+        <w:numPr>
+          <w:ilvl w:val="0"/>
+          <w:numId w:val="3"/>
+        </w:numPr>
+        <w:spacing w:after="80"/>
+      </w:pPr>
+      <w:r>
+        <w:rPr>
+          <w:rFonts w:ascii="DejaVu Sans" w:cs="DejaVu Sans" w:eastAsia="DejaVu Sans" w:hAnsi="DejaVu Sans"/>
+          <w:b w:val="false"/>
+          <w:bCs w:val="false"/>
+        </w:rPr>
+        <w:t xml:space="preserve">Межу між вікнами можна посунути.</w:t>
+      </w:r>
+    </w:p>
+    <w:p>
+      <w:r>
+        <w:br w:type="page"/>
+      </w:r>
+    </w:p>
+    <w:p>
+      <w:pPr>
+        <w:pStyle w:val="Heading1"/>
+      </w:pPr>
+      <w:r>
+        <w:rPr>
+          <w:rFonts w:ascii="DejaVu Sans" w:cs="DejaVu Sans" w:eastAsia="DejaVu Sans" w:hAnsi="DejaVu Sans"/>
+        </w:rPr>
+        <w:t xml:space="preserve">Як поділитися</w:t>
+      </w:r>
+    </w:p>
+    <w:p>
+      <w:pPr>
+        <w:spacing w:after="140"/>
+      </w:pPr>
+      <w:r>
+        <w:rPr>
+          <w:rFonts w:ascii="DejaVu Sans" w:cs="DejaVu Sans" w:eastAsia="DejaVu Sans" w:hAnsi="DejaVu Sans"/>
+          <w:b w:val="false"/>
+          <w:bCs w:val="false"/>
+        </w:rPr>
+        <w:t xml:space="preserve">Є три способи — залежно від того, скільки томів потрібно передати.</w:t>
+      </w:r>
+    </w:p>
+    <w:p>
+      <w:pPr>
+        <w:spacing w:after="160" w:before="120" w:line="240" w:lineRule="auto"/>
+        <w:jc w:val="center"/>
+      </w:pPr>
+      <w:r>
+        <w:drawing>
+          <wp:inline distT="0" distB="0" distL="0" distR="0">
+            <wp:extent cx="5715000" cy="2495550"/>
+            <wp:effectExtent t="0" r="0" b="0" l="0"/>
+            <wp:docPr id="1" name="" descr="" title=""/>
+            <wp:cNvGraphicFramePr>
+              <a:graphicFrameLocks xmlns:a="http://schemas.openxmlformats.org/drawingml/2006/main" noChangeAspect="1"/>
+            </wp:cNvGraphicFramePr>
+            <a:graphic xmlns:a="http://schemas.openxmlformats.org/drawingml/2006/main">
+              <a:graphicData uri="http://schemas.openxmlformats.org/drawingml/2006/picture">
+                <pic:pic xmlns:pic="http://schemas.openxmlformats.org/drawingml/2006/picture">
+                  <pic:nvPicPr>
+                    <pic:cNvPr id="0" name="" descr=""/>
+                    <pic:cNvPicPr>
+                      <a:picLocks noChangeAspect="1" noChangeArrowheads="1"/>
+                    </pic:cNvPicPr>
+                  </pic:nvPicPr>
+                  <pic:blipFill>
+                    <a:blip r:embed="rId14" cstate="none"/>
+                    <a:srcRect/>
+                    <a:stretch>
+                      <a:fillRect/>
+                    </a:stretch>
+                  </pic:blipFill>
+                  <pic:spPr bwMode="auto">
+                    <a:xfrm>
+                      <a:off x="0" y="0"/>
+                      <a:ext cx="5715000" cy="2495550"/>
+                    </a:xfrm>
+                    <a:prstGeom prst="rect">
+                      <a:avLst/>
+                    </a:prstGeom>
+                  </pic:spPr>
+                </pic:pic>
+              </a:graphicData>
+            </a:graphic>
+          </wp:inline>
+        </w:drawing>
+      </w:r>
+    </w:p>
+    <w:p>
+      <w:pPr>
+        <w:pStyle w:val="ListParagraph"/>
+        <w:numPr>
+          <w:ilvl w:val="0"/>
+          <w:numId w:val="3"/>
+        </w:numPr>
+        <w:spacing w:after="80"/>
+      </w:pPr>
+      <w:r>
+        <w:rPr>
+          <w:rFonts w:ascii="DejaVu Sans" w:cs="DejaVu Sans" w:eastAsia="DejaVu Sans" w:hAnsi="DejaVu Sans"/>
+          <w:b/>
+          <w:bCs/>
+        </w:rPr>
+        <w:t xml:space="preserve">Правило ⇧:</w:t>
+      </w:r>
+      <w:r>
+        <w:rPr>
+          <w:rFonts w:ascii="DejaVu Sans" w:cs="DejaVu Sans" w:eastAsia="DejaVu Sans" w:hAnsi="DejaVu Sans"/>
+          <w:b w:val="false"/>
+          <w:bCs w:val="false"/>
+        </w:rPr>
+        <w:t xml:space="preserve"> один підготовлений файл на том і на проєкт. Щоб зробити новий — спершу видали старий через ⋮.</w:t>
+      </w:r>
+    </w:p>
+    <w:p>
+      <w:pPr>
+        <w:pStyle w:val="ListParagraph"/>
+        <w:numPr>
+          <w:ilvl w:val="0"/>
+          <w:numId w:val="3"/>
+        </w:numPr>
+        <w:spacing w:after="80"/>
+      </w:pPr>
+      <w:r>
+        <w:rPr>
+          <w:rFonts w:ascii="DejaVu Sans" w:cs="DejaVu Sans" w:eastAsia="DejaVu Sans" w:hAnsi="DejaVu Sans"/>
+          <w:b w:val="false"/>
+          <w:bCs w:val="false"/>
+        </w:rPr>
+        <w:t xml:space="preserve">Ще один шлях для одного тому: ⋮ тому → «Експортувати .rdpkg» → вибрати, куди зберегти.</w:t>
+      </w:r>
+    </w:p>
+    <w:p>
+      <w:pPr>
+        <w:pStyle w:val="ListParagraph"/>
+        <w:numPr>
+          <w:ilvl w:val="0"/>
+          <w:numId w:val="3"/>
+        </w:numPr>
+        <w:spacing w:after="80"/>
+      </w:pPr>
+      <w:r>
+        <w:rPr>
+          <w:rFonts w:ascii="DejaVu Sans" w:cs="DejaVu Sans" w:eastAsia="DejaVu Sans" w:hAnsi="DejaVu Sans"/>
+          <w:b w:val="false"/>
+          <w:bCs w:val="false"/>
+        </w:rPr>
+        <w:t xml:space="preserve">Однойменні файли в папці не перезаписуються.</w:t>
+      </w:r>
+    </w:p>
+    <w:p>
+      <w:pPr>
+        <w:pBdr>
+          <w:left w:val="single" w:color="8A5A12" w:sz="18" w:space="8"/>
+        </w:pBdr>
+        <w:shd w:fill="FBF1DF" w:color="auto" w:val="clear"/>
+        <w:spacing w:after="160" w:before="120"/>
+      </w:pPr>
+      <w:r>
+        <w:rPr>
+          <w:rFonts w:ascii="DejaVu Sans" w:cs="DejaVu Sans" w:eastAsia="DejaVu Sans" w:hAnsi="DejaVu Sans"/>
+          <w:b/>
+          <w:bCs/>
+          <w:color w:val="8A5A12"/>
+        </w:rPr>
+        <w:t xml:space="preserve">Файл .rdproject поки можна лише відправити. Відкрити його в застосунку на іншому телефоні ще не можна — це в плані. Для передачі краще томи .rdpkg: їх застосунок відкриває через «Авто».</w:t>
+      </w:r>
+    </w:p>
+    <w:p>
+      <w:r>
+        <w:br w:type="page"/>
+      </w:r>
+    </w:p>
+    <w:p>
+      <w:pPr>
+        <w:pStyle w:val="Heading1"/>
+      </w:pPr>
+      <w:r>
+        <w:rPr>
+          <w:rFonts w:ascii="DejaVu Sans" w:cs="DejaVu Sans" w:eastAsia="DejaVu Sans" w:hAnsi="DejaVu Sans"/>
+        </w:rPr>
+        <w:t xml:space="preserve">Довгі операції і «Скасувати»</w:t>
+      </w:r>
+    </w:p>
+    <w:p>
+      <w:pPr>
+        <w:spacing w:after="140"/>
+      </w:pPr>
+      <w:r>
+        <w:rPr>
+          <w:rFonts w:ascii="DejaVu Sans" w:cs="DejaVu Sans" w:eastAsia="DejaVu Sans" w:hAnsi="DejaVu Sans"/>
+          <w:b w:val="false"/>
+          <w:bCs w:val="false"/>
+        </w:rPr>
+        <w:t xml:space="preserve">Підготовка, експорт, імпорт і створення тому йдуть у фоні. Застосунок можна згорнути, прогрес видно у шторці. На екрані — картка з зеленою смугою.</w:t>
+      </w:r>
+    </w:p>
+    <w:p>
+      <w:pPr>
+        <w:spacing w:after="160" w:before="120" w:line="240" w:lineRule="auto"/>
+        <w:jc w:val="center"/>
+      </w:pPr>
+      <w:r>
+        <w:drawing>
+          <wp:inline distT="0" distB="0" distL="0" distR="0">
+            <wp:extent cx="5715000" cy="2800350"/>
+            <wp:effectExtent t="0" r="0" b="0" l="0"/>
+            <wp:docPr id="1" name="" descr="" title=""/>
+            <wp:cNvGraphicFramePr>
+              <a:graphicFrameLocks xmlns:a="http://schemas.openxmlformats.org/drawingml/2006/main" noChangeAspect="1"/>
+            </wp:cNvGraphicFramePr>
+            <a:graphic xmlns:a="http://schemas.openxmlformats.org/drawingml/2006/main">
+              <a:graphicData uri="http://schemas.openxmlformats.org/drawingml/2006/picture">
+                <pic:pic xmlns:pic="http://schemas.openxmlformats.org/drawingml/2006/picture">
+                  <pic:nvPicPr>
+                    <pic:cNvPr id="0" name="" descr=""/>
+                    <pic:cNvPicPr>
+                      <a:picLocks noChangeAspect="1" noChangeArrowheads="1"/>
+                    </pic:cNvPicPr>
+                  </pic:nvPicPr>
+                  <pic:blipFill>
+                    <a:blip r:embed="rId15" cstate="none"/>
+                    <a:srcRect/>
+                    <a:stretch>
+                      <a:fillRect/>
+                    </a:stretch>
+                  </pic:blipFill>
+                  <pic:spPr bwMode="auto">
+                    <a:xfrm>
+                      <a:off x="0" y="0"/>
                       <a:ext cx="5715000" cy="2800350"/>
                     </a:xfrm>
                     <a:prstGeom prst="rect">
@@ -1346,7 +1782,7 @@
           <w:sz w:val="18"/>
           <w:szCs w:val="18"/>
         </w:rPr>
-        <w:t xml:space="preserve">Посібник зібрано з коду застосунку v0.5.112. Якщо кнопка на телефоні називається інакше — правда за телефоном.</w:t>
+        <w:t xml:space="preserve">Посібник зібрано з коду застосунку v0.5.121. Якщо кнопка на телефоні називається інакше — правда за телефоном.</w:t>
       </w:r>
     </w:p>
     <w:sectPr>

</xml_diff>

<commit_message>
docs: user guide updated to v0.5.121 (green frame, criteria, pinned card, PDF/print, companion navigator) (#252)
Claude-Session: https://claude.ai/code/session_01QCiqRcxM21fUhfrHmrRACL

Co-authored-by: Claude <noreply@anthropic.com>
</commit_message>
<xml_diff>
--- a/docs/ua/Posibnyk-Renault-Docs.docx
+++ b/docs/ua/Posibnyk-Renault-Docs.docx
@@ -13,7 +13,7 @@
           <w:sz w:val="18"/>
           <w:szCs w:val="18"/>
         </w:rPr>
-        <w:t xml:space="preserve">RENAULT DOCS · v0.5.112 · 12.10.2026</w:t>
+        <w:t xml:space="preserve">RENAULT DOCS · v0.5.121 · 13.10.2026</w:t>
       </w:r>
     </w:p>
     <w:p>
@@ -110,6 +110,36 @@
           <w:rFonts w:ascii="DejaVu Sans" w:cs="DejaVu Sans" w:eastAsia="DejaVu Sans" w:hAnsi="DejaVu Sans"/>
         </w:rPr>
         <w:t xml:space="preserve">Як читати том</w:t>
+      </w:r>
+    </w:p>
+    <w:p>
+      <w:pPr>
+        <w:pStyle w:val="ListParagraph"/>
+        <w:numPr>
+          <w:ilvl w:val="0"/>
+          <w:numId w:val="2"/>
+        </w:numPr>
+      </w:pPr>
+      <w:r>
+        <w:rPr>
+          <w:rFonts w:ascii="DejaVu Sans" w:cs="DejaVu Sans" w:eastAsia="DejaVu Sans" w:hAnsi="DejaVu Sans"/>
+        </w:rPr>
+        <w:t xml:space="preserve">PDF, масштаб і друк</w:t>
+      </w:r>
+    </w:p>
+    <w:p>
+      <w:pPr>
+        <w:pStyle w:val="ListParagraph"/>
+        <w:numPr>
+          <w:ilvl w:val="0"/>
+          <w:numId w:val="2"/>
+        </w:numPr>
+      </w:pPr>
+      <w:r>
+        <w:rPr>
+          <w:rFonts w:ascii="DejaVu Sans" w:cs="DejaVu Sans" w:eastAsia="DejaVu Sans" w:hAnsi="DejaVu Sans"/>
+        </w:rPr>
+        <w:t xml:space="preserve">Друге вікно «Документація поруч»</w:t>
       </w:r>
     </w:p>
     <w:p>
@@ -711,7 +741,7 @@
       <w:r>
         <w:drawing>
           <wp:inline distT="0" distB="0" distL="0" distR="0">
-            <wp:extent cx="5715000" cy="2381250"/>
+            <wp:extent cx="5715000" cy="3238500"/>
             <wp:effectExtent t="0" r="0" b="0" l="0"/>
             <wp:docPr id="1" name="" descr="" title=""/>
             <wp:cNvGraphicFramePr>
@@ -736,7 +766,7 @@
                   <pic:spPr bwMode="auto">
                     <a:xfrm>
                       <a:off x="0" y="0"/>
-                      <a:ext cx="5715000" cy="2381250"/>
+                      <a:ext cx="5715000" cy="3238500"/>
                     </a:xfrm>
                     <a:prstGeom prst="rect">
                       <a:avLst/>
@@ -831,6 +861,84 @@
       <w:r>
         <w:rPr>
           <w:rFonts w:ascii="DejaVu Sans" w:cs="DejaVu Sans" w:eastAsia="DejaVu Sans" w:hAnsi="DejaVu Sans"/>
+          <w:b/>
+          <w:bCs/>
+        </w:rPr>
+        <w:t xml:space="preserve">Зелена рамка</w:t>
+      </w:r>
+      <w:r>
+        <w:rPr>
+          <w:rFonts w:ascii="DejaVu Sans" w:cs="DejaVu Sans" w:eastAsia="DejaVu Sans" w:hAnsi="DejaVu Sans"/>
+          <w:b w:val="false"/>
+          <w:bCs w:val="false"/>
+        </w:rPr>
+        <w:t xml:space="preserve"> — де вибираєш зі списку, вибране обведене зеленим: відкрита вкладка, схема, розʼєм, останній розділ. Рамка лишається після «Назад» і повороту екрана, поки працює застосунок.</w:t>
+      </w:r>
+    </w:p>
+    <w:p>
+      <w:pPr>
+        <w:pStyle w:val="ListParagraph"/>
+        <w:numPr>
+          <w:ilvl w:val="0"/>
+          <w:numId w:val="3"/>
+        </w:numPr>
+        <w:spacing w:after="80"/>
+      </w:pPr>
+      <w:r>
+        <w:rPr>
+          <w:rFonts w:ascii="DejaVu Sans" w:cs="DejaVu Sans" w:eastAsia="DejaVu Sans" w:hAnsi="DejaVu Sans"/>
+          <w:b/>
+          <w:bCs/>
+        </w:rPr>
+        <w:t xml:space="preserve">«Критерії / скорочення»</w:t>
+      </w:r>
+      <w:r>
+        <w:rPr>
+          <w:rFonts w:ascii="DejaVu Sans" w:cs="DejaVu Sans" w:eastAsia="DejaVu Sans" w:hAnsi="DejaVu Sans"/>
+          <w:b w:val="false"/>
+          <w:bCs w:val="false"/>
+        </w:rPr>
+        <w:t xml:space="preserve"> закріплені під меню розділу. Дотик відкриває таблицю скорочень поверх списку; ✕ або «Назад» закривають її, список не зрушує.</w:t>
+      </w:r>
+    </w:p>
+    <w:p>
+      <w:pPr>
+        <w:pStyle w:val="ListParagraph"/>
+        <w:numPr>
+          <w:ilvl w:val="0"/>
+          <w:numId w:val="3"/>
+        </w:numPr>
+        <w:spacing w:after="80"/>
+      </w:pPr>
+      <w:r>
+        <w:rPr>
+          <w:rFonts w:ascii="DejaVu Sans" w:cs="DejaVu Sans" w:eastAsia="DejaVu Sans" w:hAnsi="DejaVu Sans"/>
+          <w:b/>
+          <w:bCs/>
+        </w:rPr>
+        <w:t xml:space="preserve">Картка «ВИБРАНО»</w:t>
+      </w:r>
+      <w:r>
+        <w:rPr>
+          <w:rFonts w:ascii="DejaVu Sans" w:cs="DejaVu Sans" w:eastAsia="DejaVu Sans" w:hAnsi="DejaVu Sans"/>
+          <w:b w:val="false"/>
+          <w:bCs w:val="false"/>
+        </w:rPr>
+        <w:t xml:space="preserve"> — вибраний розʼєм і його документи («Схема + піни», «Схема розʼєму», «Опис контактів») стоять над списком. «Опис контактів» сам прокручує до таблиці.</w:t>
+      </w:r>
+    </w:p>
+    <w:p>
+      <w:pPr>
+        <w:pStyle w:val="ListParagraph"/>
+        <w:numPr>
+          <w:ilvl w:val="0"/>
+          <w:numId w:val="3"/>
+        </w:numPr>
+        <w:spacing w:after="80"/>
+      </w:pPr>
+      <w:r>
+        <w:rPr>
+          <w:rFonts w:ascii="DejaVu Sans" w:cs="DejaVu Sans" w:eastAsia="DejaVu Sans" w:hAnsi="DejaVu Sans"/>
           <w:b w:val="false"/>
           <w:bCs w:val="false"/>
         </w:rPr>
@@ -850,7 +958,7 @@
         <w:rPr>
           <w:rFonts w:ascii="DejaVu Sans" w:cs="DejaVu Sans" w:eastAsia="DejaVu Sans" w:hAnsi="DejaVu Sans"/>
         </w:rPr>
-        <w:t xml:space="preserve">Як поділитися</w:t>
+        <w:t xml:space="preserve">PDF, масштаб і друк</w:t>
       </w:r>
     </w:p>
     <w:p>
@@ -863,7 +971,7 @@
           <w:b w:val="false"/>
           <w:bCs w:val="false"/>
         </w:rPr>
-        <w:t xml:space="preserve">Є три способи — залежно від того, скільки томів потрібно передати.</w:t>
+        <w:t xml:space="preserve">Схеми PDF відкриваються у вбудованому переглядачі. Панель кнопок угорі однакового розміру скрізь: на окремому екрані, у «Схема + піни» і в другому вікні.</w:t>
       </w:r>
     </w:p>
     <w:p>
@@ -874,7 +982,7 @@
       <w:r>
         <w:drawing>
           <wp:inline distT="0" distB="0" distL="0" distR="0">
-            <wp:extent cx="5715000" cy="2495550"/>
+            <wp:extent cx="5715000" cy="3067050"/>
             <wp:effectExtent t="0" r="0" b="0" l="0"/>
             <wp:docPr id="1" name="" descr="" title=""/>
             <wp:cNvGraphicFramePr>
@@ -899,7 +1007,7 @@
                   <pic:spPr bwMode="auto">
                     <a:xfrm>
                       <a:off x="0" y="0"/>
-                      <a:ext cx="5715000" cy="2495550"/>
+                      <a:ext cx="5715000" cy="3067050"/>
                     </a:xfrm>
                     <a:prstGeom prst="rect">
                       <a:avLst/>
@@ -924,72 +1032,80 @@
       <w:r>
         <w:rPr>
           <w:rFonts w:ascii="DejaVu Sans" w:cs="DejaVu Sans" w:eastAsia="DejaVu Sans" w:hAnsi="DejaVu Sans"/>
+          <w:b w:val="false"/>
+          <w:bCs w:val="false"/>
+        </w:rPr>
+        <w:t xml:space="preserve">Меню ▾ біля відсотків має кроки аж до 450% і 500%.</w:t>
+      </w:r>
+    </w:p>
+    <w:p>
+      <w:pPr>
+        <w:pStyle w:val="ListParagraph"/>
+        <w:numPr>
+          <w:ilvl w:val="0"/>
+          <w:numId w:val="3"/>
+        </w:numPr>
+        <w:spacing w:after="80"/>
+      </w:pPr>
+      <w:r>
+        <w:rPr>
+          <w:rFonts w:ascii="DejaVu Sans" w:cs="DejaVu Sans" w:eastAsia="DejaVu Sans" w:hAnsi="DejaVu Sans"/>
+          <w:b w:val="false"/>
+          <w:bCs w:val="false"/>
+        </w:rPr>
+        <w:t xml:space="preserve">На «Схема + піни» сама сторінка не масштабується — збільшується кожен документ окремо, нижній не зникає.</w:t>
+      </w:r>
+    </w:p>
+    <w:p>
+      <w:pPr>
+        <w:pStyle w:val="ListParagraph"/>
+        <w:numPr>
+          <w:ilvl w:val="0"/>
+          <w:numId w:val="3"/>
+        </w:numPr>
+        <w:spacing w:after="80"/>
+      </w:pPr>
+      <w:r>
+        <w:rPr>
+          <w:rFonts w:ascii="DejaVu Sans" w:cs="DejaVu Sans" w:eastAsia="DejaVu Sans" w:hAnsi="DejaVu Sans"/>
+          <w:b w:val="false"/>
+          <w:bCs w:val="false"/>
+        </w:rPr>
+        <w:t xml:space="preserve">Друк — лише через </w:t>
+      </w:r>
+      <w:r>
+        <w:rPr>
+          <w:rFonts w:ascii="DejaVu Sans" w:cs="DejaVu Sans" w:eastAsia="DejaVu Sans" w:hAnsi="DejaVu Sans"/>
           <w:b/>
           <w:bCs/>
         </w:rPr>
-        <w:t xml:space="preserve">Правило ⇧:</w:t>
-      </w:r>
-      <w:r>
-        <w:rPr>
-          <w:rFonts w:ascii="DejaVu Sans" w:cs="DejaVu Sans" w:eastAsia="DejaVu Sans" w:hAnsi="DejaVu Sans"/>
-          <w:b w:val="false"/>
-          <w:bCs w:val="false"/>
-        </w:rPr>
-        <w:t xml:space="preserve"> один підготовлений файл на том і на проєкт. Щоб зробити новий — спершу видали старий через ⋮.</w:t>
-      </w:r>
-    </w:p>
-    <w:p>
-      <w:pPr>
-        <w:pStyle w:val="ListParagraph"/>
-        <w:numPr>
-          <w:ilvl w:val="0"/>
-          <w:numId w:val="3"/>
-        </w:numPr>
-        <w:spacing w:after="80"/>
-      </w:pPr>
-      <w:r>
-        <w:rPr>
-          <w:rFonts w:ascii="DejaVu Sans" w:cs="DejaVu Sans" w:eastAsia="DejaVu Sans" w:hAnsi="DejaVu Sans"/>
-          <w:b w:val="false"/>
-          <w:bCs w:val="false"/>
-        </w:rPr>
-        <w:t xml:space="preserve">Ще один шлях для одного тому: ⋮ тому → «Експортувати .rdpkg» → вибрати, куди зберегти.</w:t>
-      </w:r>
-    </w:p>
-    <w:p>
-      <w:pPr>
-        <w:pStyle w:val="ListParagraph"/>
-        <w:numPr>
-          <w:ilvl w:val="0"/>
-          <w:numId w:val="3"/>
-        </w:numPr>
-        <w:spacing w:after="80"/>
-      </w:pPr>
-      <w:r>
-        <w:rPr>
-          <w:rFonts w:ascii="DejaVu Sans" w:cs="DejaVu Sans" w:eastAsia="DejaVu Sans" w:hAnsi="DejaVu Sans"/>
-          <w:b w:val="false"/>
-          <w:bCs w:val="false"/>
-        </w:rPr>
-        <w:t xml:space="preserve">Однойменні файли в папці не перезаписуються.</w:t>
-      </w:r>
-    </w:p>
-    <w:p>
-      <w:pPr>
-        <w:pBdr>
-          <w:left w:val="single" w:color="8A5A12" w:sz="18" w:space="8"/>
-        </w:pBdr>
-        <w:shd w:fill="FBF1DF" w:color="auto" w:val="clear"/>
-        <w:spacing w:after="160" w:before="120"/>
-      </w:pPr>
-      <w:r>
-        <w:rPr>
-          <w:rFonts w:ascii="DejaVu Sans" w:cs="DejaVu Sans" w:eastAsia="DejaVu Sans" w:hAnsi="DejaVu Sans"/>
-          <w:b/>
-          <w:bCs/>
-          <w:color w:val="8A5A12"/>
-        </w:rPr>
-        <w:t xml:space="preserve">Файл .rdproject поки можна лише відправити. Відкрити його в застосунку на іншому телефоні ще не можна — це в плані. Для передачі краще томи .rdpkg: їх застосунок відкриває через «Авто».</w:t>
+        <w:t xml:space="preserve">оригінальний значок принтера</w:t>
+      </w:r>
+      <w:r>
+        <w:rPr>
+          <w:rFonts w:ascii="DejaVu Sans" w:cs="DejaVu Sans" w:eastAsia="DejaVu Sans" w:hAnsi="DejaVu Sans"/>
+          <w:b w:val="false"/>
+          <w:bCs w:val="false"/>
+        </w:rPr>
+        <w:t xml:space="preserve"> Renault на документі. Окремих кнопок «Друк» застосунок не додає.</w:t>
+      </w:r>
+    </w:p>
+    <w:p>
+      <w:pPr>
+        <w:pStyle w:val="ListParagraph"/>
+        <w:numPr>
+          <w:ilvl w:val="0"/>
+          <w:numId w:val="3"/>
+        </w:numPr>
+        <w:spacing w:after="80"/>
+      </w:pPr>
+      <w:r>
+        <w:rPr>
+          <w:rFonts w:ascii="DejaVu Sans" w:cs="DejaVu Sans" w:eastAsia="DejaVu Sans" w:hAnsi="DejaVu Sans"/>
+          <w:b w:val="false"/>
+          <w:bCs w:val="false"/>
+        </w:rPr>
+        <w:t xml:space="preserve">Якщо в документа є друкований варіант (чорно-білий), друкується саме він.</w:t>
       </w:r>
     </w:p>
     <w:p>
@@ -1005,7 +1121,7 @@
         <w:rPr>
           <w:rFonts w:ascii="DejaVu Sans" w:cs="DejaVu Sans" w:eastAsia="DejaVu Sans" w:hAnsi="DejaVu Sans"/>
         </w:rPr>
-        <w:t xml:space="preserve">Довгі операції і «Скасувати»</w:t>
+        <w:t xml:space="preserve">Друге вікно «Документація поруч»</w:t>
       </w:r>
     </w:p>
     <w:p>
@@ -1018,7 +1134,7 @@
           <w:b w:val="false"/>
           <w:bCs w:val="false"/>
         </w:rPr>
-        <w:t xml:space="preserve">Підготовка, експорт, імпорт і створення тому йдуть у фоні. Застосунок можна згорнути, прогрес видно у шторці. На екрані — картка з зеленою смугою.</w:t>
+        <w:t xml:space="preserve">Кнопка ◫ у панелі PDF відкриває друге вікно знизу. Верхній документ лишається, а знизу можна відкрити будь-який інший документ цього тому — так зверху і знизу стоять два різні документи.</w:t>
       </w:r>
     </w:p>
     <w:p>
@@ -1029,7 +1145,7 @@
       <w:r>
         <w:drawing>
           <wp:inline distT="0" distB="0" distL="0" distR="0">
-            <wp:extent cx="5715000" cy="2800350"/>
+            <wp:extent cx="5715000" cy="3609975"/>
             <wp:effectExtent t="0" r="0" b="0" l="0"/>
             <wp:docPr id="1" name="" descr="" title=""/>
             <wp:cNvGraphicFramePr>
@@ -1054,6 +1170,326 @@
                   <pic:spPr bwMode="auto">
                     <a:xfrm>
                       <a:off x="0" y="0"/>
+                      <a:ext cx="5715000" cy="3609975"/>
+                    </a:xfrm>
+                    <a:prstGeom prst="rect">
+                      <a:avLst/>
+                    </a:prstGeom>
+                  </pic:spPr>
+                </pic:pic>
+              </a:graphicData>
+            </a:graphic>
+          </wp:inline>
+        </w:drawing>
+      </w:r>
+    </w:p>
+    <w:p>
+      <w:pPr>
+        <w:pStyle w:val="ListParagraph"/>
+        <w:numPr>
+          <w:ilvl w:val="0"/>
+          <w:numId w:val="3"/>
+        </w:numPr>
+        <w:spacing w:after="80"/>
+      </w:pPr>
+      <w:r>
+        <w:rPr>
+          <w:rFonts w:ascii="DejaVu Sans" w:cs="DejaVu Sans" w:eastAsia="DejaVu Sans" w:hAnsi="DejaVu Sans"/>
+          <w:b w:val="false"/>
+          <w:bCs w:val="false"/>
+        </w:rPr>
+        <w:t xml:space="preserve">«←» у другому вікні — крок назад по ланцюжку: документ → розділ → том → закрити.</w:t>
+      </w:r>
+    </w:p>
+    <w:p>
+      <w:pPr>
+        <w:pStyle w:val="ListParagraph"/>
+        <w:numPr>
+          <w:ilvl w:val="0"/>
+          <w:numId w:val="3"/>
+        </w:numPr>
+        <w:spacing w:after="80"/>
+      </w:pPr>
+      <w:r>
+        <w:rPr>
+          <w:rFonts w:ascii="DejaVu Sans" w:cs="DejaVu Sans" w:eastAsia="DejaVu Sans" w:hAnsi="DejaVu Sans"/>
+          <w:b w:val="false"/>
+          <w:bCs w:val="false"/>
+        </w:rPr>
+        <w:t xml:space="preserve">Вкладки розділу міняють одна одну, тож «←» з розділу веде одразу в том.</w:t>
+      </w:r>
+    </w:p>
+    <w:p>
+      <w:pPr>
+        <w:pStyle w:val="ListParagraph"/>
+        <w:numPr>
+          <w:ilvl w:val="0"/>
+          <w:numId w:val="3"/>
+        </w:numPr>
+        <w:spacing w:after="80"/>
+      </w:pPr>
+      <w:r>
+        <w:rPr>
+          <w:rFonts w:ascii="DejaVu Sans" w:cs="DejaVu Sans" w:eastAsia="DejaVu Sans" w:hAnsi="DejaVu Sans"/>
+          <w:b w:val="false"/>
+          <w:bCs w:val="false"/>
+        </w:rPr>
+        <w:t xml:space="preserve">Таблиці («Опис контактів», «Критерії / скорочення») показуються прямо в другому вікні.</w:t>
+      </w:r>
+    </w:p>
+    <w:p>
+      <w:pPr>
+        <w:pStyle w:val="ListParagraph"/>
+        <w:numPr>
+          <w:ilvl w:val="0"/>
+          <w:numId w:val="3"/>
+        </w:numPr>
+        <w:spacing w:after="80"/>
+      </w:pPr>
+      <w:r>
+        <w:rPr>
+          <w:rFonts w:ascii="DejaVu Sans" w:cs="DejaVu Sans" w:eastAsia="DejaVu Sans" w:hAnsi="DejaVu Sans"/>
+          <w:b w:val="false"/>
+          <w:bCs w:val="false"/>
+        </w:rPr>
+        <w:t xml:space="preserve">Останнє відкрите на кожному кроці — у зеленій рамці.</w:t>
+      </w:r>
+    </w:p>
+    <w:p>
+      <w:pPr>
+        <w:pStyle w:val="ListParagraph"/>
+        <w:numPr>
+          <w:ilvl w:val="0"/>
+          <w:numId w:val="3"/>
+        </w:numPr>
+        <w:spacing w:after="80"/>
+      </w:pPr>
+      <w:r>
+        <w:rPr>
+          <w:rFonts w:ascii="DejaVu Sans" w:cs="DejaVu Sans" w:eastAsia="DejaVu Sans" w:hAnsi="DejaVu Sans"/>
+          <w:b w:val="false"/>
+          <w:bCs w:val="false"/>
+        </w:rPr>
+        <w:t xml:space="preserve">Межу між вікнами можна посунути.</w:t>
+      </w:r>
+    </w:p>
+    <w:p>
+      <w:r>
+        <w:br w:type="page"/>
+      </w:r>
+    </w:p>
+    <w:p>
+      <w:pPr>
+        <w:pStyle w:val="Heading1"/>
+      </w:pPr>
+      <w:r>
+        <w:rPr>
+          <w:rFonts w:ascii="DejaVu Sans" w:cs="DejaVu Sans" w:eastAsia="DejaVu Sans" w:hAnsi="DejaVu Sans"/>
+        </w:rPr>
+        <w:t xml:space="preserve">Як поділитися</w:t>
+      </w:r>
+    </w:p>
+    <w:p>
+      <w:pPr>
+        <w:spacing w:after="140"/>
+      </w:pPr>
+      <w:r>
+        <w:rPr>
+          <w:rFonts w:ascii="DejaVu Sans" w:cs="DejaVu Sans" w:eastAsia="DejaVu Sans" w:hAnsi="DejaVu Sans"/>
+          <w:b w:val="false"/>
+          <w:bCs w:val="false"/>
+        </w:rPr>
+        <w:t xml:space="preserve">Є три способи — залежно від того, скільки томів потрібно передати.</w:t>
+      </w:r>
+    </w:p>
+    <w:p>
+      <w:pPr>
+        <w:spacing w:after="160" w:before="120" w:line="240" w:lineRule="auto"/>
+        <w:jc w:val="center"/>
+      </w:pPr>
+      <w:r>
+        <w:drawing>
+          <wp:inline distT="0" distB="0" distL="0" distR="0">
+            <wp:extent cx="5715000" cy="2495550"/>
+            <wp:effectExtent t="0" r="0" b="0" l="0"/>
+            <wp:docPr id="1" name="" descr="" title=""/>
+            <wp:cNvGraphicFramePr>
+              <a:graphicFrameLocks xmlns:a="http://schemas.openxmlformats.org/drawingml/2006/main" noChangeAspect="1"/>
+            </wp:cNvGraphicFramePr>
+            <a:graphic xmlns:a="http://schemas.openxmlformats.org/drawingml/2006/main">
+              <a:graphicData uri="http://schemas.openxmlformats.org/drawingml/2006/picture">
+                <pic:pic xmlns:pic="http://schemas.openxmlformats.org/drawingml/2006/picture">
+                  <pic:nvPicPr>
+                    <pic:cNvPr id="0" name="" descr=""/>
+                    <pic:cNvPicPr>
+                      <a:picLocks noChangeAspect="1" noChangeArrowheads="1"/>
+                    </pic:cNvPicPr>
+                  </pic:nvPicPr>
+                  <pic:blipFill>
+                    <a:blip r:embed="rId14" cstate="none"/>
+                    <a:srcRect/>
+                    <a:stretch>
+                      <a:fillRect/>
+                    </a:stretch>
+                  </pic:blipFill>
+                  <pic:spPr bwMode="auto">
+                    <a:xfrm>
+                      <a:off x="0" y="0"/>
+                      <a:ext cx="5715000" cy="2495550"/>
+                    </a:xfrm>
+                    <a:prstGeom prst="rect">
+                      <a:avLst/>
+                    </a:prstGeom>
+                  </pic:spPr>
+                </pic:pic>
+              </a:graphicData>
+            </a:graphic>
+          </wp:inline>
+        </w:drawing>
+      </w:r>
+    </w:p>
+    <w:p>
+      <w:pPr>
+        <w:pStyle w:val="ListParagraph"/>
+        <w:numPr>
+          <w:ilvl w:val="0"/>
+          <w:numId w:val="3"/>
+        </w:numPr>
+        <w:spacing w:after="80"/>
+      </w:pPr>
+      <w:r>
+        <w:rPr>
+          <w:rFonts w:ascii="DejaVu Sans" w:cs="DejaVu Sans" w:eastAsia="DejaVu Sans" w:hAnsi="DejaVu Sans"/>
+          <w:b/>
+          <w:bCs/>
+        </w:rPr>
+        <w:t xml:space="preserve">Правило ⇧:</w:t>
+      </w:r>
+      <w:r>
+        <w:rPr>
+          <w:rFonts w:ascii="DejaVu Sans" w:cs="DejaVu Sans" w:eastAsia="DejaVu Sans" w:hAnsi="DejaVu Sans"/>
+          <w:b w:val="false"/>
+          <w:bCs w:val="false"/>
+        </w:rPr>
+        <w:t xml:space="preserve"> один підготовлений файл на том і на проєкт. Щоб зробити новий — спершу видали старий через ⋮.</w:t>
+      </w:r>
+    </w:p>
+    <w:p>
+      <w:pPr>
+        <w:pStyle w:val="ListParagraph"/>
+        <w:numPr>
+          <w:ilvl w:val="0"/>
+          <w:numId w:val="3"/>
+        </w:numPr>
+        <w:spacing w:after="80"/>
+      </w:pPr>
+      <w:r>
+        <w:rPr>
+          <w:rFonts w:ascii="DejaVu Sans" w:cs="DejaVu Sans" w:eastAsia="DejaVu Sans" w:hAnsi="DejaVu Sans"/>
+          <w:b w:val="false"/>
+          <w:bCs w:val="false"/>
+        </w:rPr>
+        <w:t xml:space="preserve">Ще один шлях для одного тому: ⋮ тому → «Експортувати .rdpkg» → вибрати, куди зберегти.</w:t>
+      </w:r>
+    </w:p>
+    <w:p>
+      <w:pPr>
+        <w:pStyle w:val="ListParagraph"/>
+        <w:numPr>
+          <w:ilvl w:val="0"/>
+          <w:numId w:val="3"/>
+        </w:numPr>
+        <w:spacing w:after="80"/>
+      </w:pPr>
+      <w:r>
+        <w:rPr>
+          <w:rFonts w:ascii="DejaVu Sans" w:cs="DejaVu Sans" w:eastAsia="DejaVu Sans" w:hAnsi="DejaVu Sans"/>
+          <w:b w:val="false"/>
+          <w:bCs w:val="false"/>
+        </w:rPr>
+        <w:t xml:space="preserve">Однойменні файли в папці не перезаписуються.</w:t>
+      </w:r>
+    </w:p>
+    <w:p>
+      <w:pPr>
+        <w:pBdr>
+          <w:left w:val="single" w:color="8A5A12" w:sz="18" w:space="8"/>
+        </w:pBdr>
+        <w:shd w:fill="FBF1DF" w:color="auto" w:val="clear"/>
+        <w:spacing w:after="160" w:before="120"/>
+      </w:pPr>
+      <w:r>
+        <w:rPr>
+          <w:rFonts w:ascii="DejaVu Sans" w:cs="DejaVu Sans" w:eastAsia="DejaVu Sans" w:hAnsi="DejaVu Sans"/>
+          <w:b/>
+          <w:bCs/>
+          <w:color w:val="8A5A12"/>
+        </w:rPr>
+        <w:t xml:space="preserve">Файл .rdproject поки можна лише відправити. Відкрити його в застосунку на іншому телефоні ще не можна — це в плані. Для передачі краще томи .rdpkg: їх застосунок відкриває через «Авто».</w:t>
+      </w:r>
+    </w:p>
+    <w:p>
+      <w:r>
+        <w:br w:type="page"/>
+      </w:r>
+    </w:p>
+    <w:p>
+      <w:pPr>
+        <w:pStyle w:val="Heading1"/>
+      </w:pPr>
+      <w:r>
+        <w:rPr>
+          <w:rFonts w:ascii="DejaVu Sans" w:cs="DejaVu Sans" w:eastAsia="DejaVu Sans" w:hAnsi="DejaVu Sans"/>
+        </w:rPr>
+        <w:t xml:space="preserve">Довгі операції і «Скасувати»</w:t>
+      </w:r>
+    </w:p>
+    <w:p>
+      <w:pPr>
+        <w:spacing w:after="140"/>
+      </w:pPr>
+      <w:r>
+        <w:rPr>
+          <w:rFonts w:ascii="DejaVu Sans" w:cs="DejaVu Sans" w:eastAsia="DejaVu Sans" w:hAnsi="DejaVu Sans"/>
+          <w:b w:val="false"/>
+          <w:bCs w:val="false"/>
+        </w:rPr>
+        <w:t xml:space="preserve">Підготовка, експорт, імпорт і створення тому йдуть у фоні. Застосунок можна згорнути, прогрес видно у шторці. На екрані — картка з зеленою смугою.</w:t>
+      </w:r>
+    </w:p>
+    <w:p>
+      <w:pPr>
+        <w:spacing w:after="160" w:before="120" w:line="240" w:lineRule="auto"/>
+        <w:jc w:val="center"/>
+      </w:pPr>
+      <w:r>
+        <w:drawing>
+          <wp:inline distT="0" distB="0" distL="0" distR="0">
+            <wp:extent cx="5715000" cy="2800350"/>
+            <wp:effectExtent t="0" r="0" b="0" l="0"/>
+            <wp:docPr id="1" name="" descr="" title=""/>
+            <wp:cNvGraphicFramePr>
+              <a:graphicFrameLocks xmlns:a="http://schemas.openxmlformats.org/drawingml/2006/main" noChangeAspect="1"/>
+            </wp:cNvGraphicFramePr>
+            <a:graphic xmlns:a="http://schemas.openxmlformats.org/drawingml/2006/main">
+              <a:graphicData uri="http://schemas.openxmlformats.org/drawingml/2006/picture">
+                <pic:pic xmlns:pic="http://schemas.openxmlformats.org/drawingml/2006/picture">
+                  <pic:nvPicPr>
+                    <pic:cNvPr id="0" name="" descr=""/>
+                    <pic:cNvPicPr>
+                      <a:picLocks noChangeAspect="1" noChangeArrowheads="1"/>
+                    </pic:cNvPicPr>
+                  </pic:nvPicPr>
+                  <pic:blipFill>
+                    <a:blip r:embed="rId15" cstate="none"/>
+                    <a:srcRect/>
+                    <a:stretch>
+                      <a:fillRect/>
+                    </a:stretch>
+                  </pic:blipFill>
+                  <pic:spPr bwMode="auto">
+                    <a:xfrm>
+                      <a:off x="0" y="0"/>
                       <a:ext cx="5715000" cy="2800350"/>
                     </a:xfrm>
                     <a:prstGeom prst="rect">
@@ -1346,7 +1782,7 @@
           <w:sz w:val="18"/>
           <w:szCs w:val="18"/>
         </w:rPr>
-        <w:t xml:space="preserve">Посібник зібрано з коду застосунку v0.5.112. Якщо кнопка на телефоні називається інакше — правда за телефоном.</w:t>
+        <w:t xml:space="preserve">Посібник зібрано з коду застосунку v0.5.121. Якщо кнопка на телефоні називається інакше — правда за телефоном.</w:t>
       </w:r>
     </w:p>
     <w:sectPr>

</xml_diff>

<commit_message>
v0.5.130: user guide inside the app (Settings → Про програму)
Co-Authored-By: Claude Opus 5.5 <noreply@anthropic.com>
Claude-Session: https://claude.ai/code/session_01VPquYZFFEbKUhD3JuP77cq
</commit_message>
<xml_diff>
--- a/docs/ua/Posibnyk-Renault-Docs.docx
+++ b/docs/ua/Posibnyk-Renault-Docs.docx
@@ -13,7 +13,7 @@
           <w:sz w:val="18"/>
           <w:szCs w:val="18"/>
         </w:rPr>
-        <w:t xml:space="preserve">RENAULT DOCS · v0.5.121 · 13.10.2026</w:t>
+        <w:t xml:space="preserve">RENAULT DOCS · v0.5.130 · 14.10.2026</w:t>
       </w:r>
     </w:p>
     <w:p>
@@ -95,6 +95,21 @@
           <w:rFonts w:ascii="DejaVu Sans" w:cs="DejaVu Sans" w:eastAsia="DejaVu Sans" w:hAnsi="DejaVu Sans"/>
         </w:rPr>
         <w:t xml:space="preserve">Як додати том</w:t>
+      </w:r>
+    </w:p>
+    <w:p>
+      <w:pPr>
+        <w:pStyle w:val="ListParagraph"/>
+        <w:numPr>
+          <w:ilvl w:val="0"/>
+          <w:numId w:val="2"/>
+        </w:numPr>
+      </w:pPr>
+      <w:r>
+        <w:rPr>
+          <w:rFonts w:ascii="DejaVu Sans" w:cs="DejaVu Sans" w:eastAsia="DejaVu Sans" w:hAnsi="DejaVu Sans"/>
+        </w:rPr>
+        <w:t xml:space="preserve">Готові проєкти з Google Диска</w:t>
       </w:r>
     </w:p>
     <w:p>
@@ -520,7 +535,7 @@
           <w:b w:val="false"/>
           <w:bCs w:val="false"/>
         </w:rPr>
-        <w:t xml:space="preserve">«Видалити підготовлений .rdproject» — видаляє лише файл ⇧, проєкт лишається.</w:t>
+        <w:t xml:space="preserve">«Видалити підготовлений .rdproject» — видаляє лише файл ⇧, проєкт лишається. Додавання чи видалення тому підготовлений файл не прибирає — меню лише підкаже, що він зроблений для старого набору томів.</w:t>
       </w:r>
     </w:p>
     <w:p>
@@ -717,7 +732,7 @@
         <w:rPr>
           <w:rFonts w:ascii="DejaVu Sans" w:cs="DejaVu Sans" w:eastAsia="DejaVu Sans" w:hAnsi="DejaVu Sans"/>
         </w:rPr>
-        <w:t xml:space="preserve">Як читати том</w:t>
+        <w:t xml:space="preserve">Готові проєкти з Google Диска</w:t>
       </w:r>
     </w:p>
     <w:p>
@@ -730,7 +745,7 @@
           <w:b w:val="false"/>
           <w:bCs w:val="false"/>
         </w:rPr>
-        <w:t xml:space="preserve">Дотик по тому відкриває його в режимі, вибраному в налаштуваннях: Modern (стоїть спочатку) або Classic. Перемкнутися можна кнопками Modern / Classic вгорі.</w:t>
+        <w:t xml:space="preserve">Головне → «Готові проєкти» відкриває каталог Renault Docs з Google Диска (потрібен інтернет). Угорі видно версію каталогу, нижче — картки проєктів: роки документації і скільки томів.</w:t>
       </w:r>
     </w:p>
     <w:p>
@@ -741,7 +756,7 @@
       <w:r>
         <w:drawing>
           <wp:inline distT="0" distB="0" distL="0" distR="0">
-            <wp:extent cx="5715000" cy="3238500"/>
+            <wp:extent cx="4838700" cy="6858000"/>
             <wp:effectExtent t="0" r="0" b="0" l="0"/>
             <wp:docPr id="1" name="" descr="" title=""/>
             <wp:cNvGraphicFramePr>
@@ -766,7 +781,7 @@
                   <pic:spPr bwMode="auto">
                     <a:xfrm>
                       <a:off x="0" y="0"/>
-                      <a:ext cx="5715000" cy="3238500"/>
+                      <a:ext cx="4838700" cy="6858000"/>
                     </a:xfrm>
                     <a:prstGeom prst="rect">
                       <a:avLst/>
@@ -791,158 +806,72 @@
       <w:r>
         <w:rPr>
           <w:rFonts w:ascii="DejaVu Sans" w:cs="DejaVu Sans" w:eastAsia="DejaVu Sans" w:hAnsi="DejaVu Sans"/>
+          <w:b w:val="false"/>
+          <w:bCs w:val="false"/>
+        </w:rPr>
+        <w:t xml:space="preserve">Кожен том — окремий файл: бери лише ті, що потрібні, а не всі одразу.</w:t>
+      </w:r>
+    </w:p>
+    <w:p>
+      <w:pPr>
+        <w:pStyle w:val="ListParagraph"/>
+        <w:numPr>
+          <w:ilvl w:val="0"/>
+          <w:numId w:val="3"/>
+        </w:numPr>
+        <w:spacing w:after="80"/>
+      </w:pPr>
+      <w:r>
+        <w:rPr>
+          <w:rFonts w:ascii="DejaVu Sans" w:cs="DejaVu Sans" w:eastAsia="DejaVu Sans" w:hAnsi="DejaVu Sans"/>
           <w:b/>
           <w:bCs/>
         </w:rPr>
-        <w:t xml:space="preserve">Modern</w:t>
-      </w:r>
-      <w:r>
-        <w:rPr>
-          <w:rFonts w:ascii="DejaVu Sans" w:cs="DejaVu Sans" w:eastAsia="DejaVu Sans" w:hAnsi="DejaVu Sans"/>
-          <w:b w:val="false"/>
-          <w:bCs w:val="false"/>
-        </w:rPr>
-        <w:t xml:space="preserve"> — зручні списки, пошук і таблиці. Таблицю можна зберегти як PDF.</w:t>
-      </w:r>
-    </w:p>
-    <w:p>
-      <w:pPr>
-        <w:pStyle w:val="ListParagraph"/>
-        <w:numPr>
-          <w:ilvl w:val="0"/>
-          <w:numId w:val="3"/>
-        </w:numPr>
-        <w:spacing w:after="80"/>
-      </w:pPr>
-      <w:r>
-        <w:rPr>
-          <w:rFonts w:ascii="DejaVu Sans" w:cs="DejaVu Sans" w:eastAsia="DejaVu Sans" w:hAnsi="DejaVu Sans"/>
-          <w:b/>
-          <w:bCs/>
-        </w:rPr>
-        <w:t xml:space="preserve">Classic</w:t>
-      </w:r>
-      <w:r>
-        <w:rPr>
-          <w:rFonts w:ascii="DejaVu Sans" w:cs="DejaVu Sans" w:eastAsia="DejaVu Sans" w:hAnsi="DejaVu Sans"/>
-          <w:b w:val="false"/>
-          <w:bCs w:val="false"/>
-        </w:rPr>
-        <w:t xml:space="preserve"> — все як у оригіналі на Windows: ті самі меню, сторінки й переходи.</w:t>
-      </w:r>
-    </w:p>
-    <w:p>
-      <w:pPr>
-        <w:pStyle w:val="ListParagraph"/>
-        <w:numPr>
-          <w:ilvl w:val="0"/>
-          <w:numId w:val="3"/>
-        </w:numPr>
-        <w:spacing w:after="80"/>
-      </w:pPr>
-      <w:r>
-        <w:rPr>
-          <w:rFonts w:ascii="DejaVu Sans" w:cs="DejaVu Sans" w:eastAsia="DejaVu Sans" w:hAnsi="DejaVu Sans"/>
-          <w:b w:val="false"/>
-          <w:bCs w:val="false"/>
-        </w:rPr>
-        <w:t xml:space="preserve">Якщо пункт ще не перенесено в Modern, застосунок відкриє його через Classic.</w:t>
-      </w:r>
-    </w:p>
-    <w:p>
-      <w:pPr>
-        <w:pStyle w:val="ListParagraph"/>
-        <w:numPr>
-          <w:ilvl w:val="0"/>
-          <w:numId w:val="3"/>
-        </w:numPr>
-        <w:spacing w:after="80"/>
-      </w:pPr>
-      <w:r>
-        <w:rPr>
-          <w:rFonts w:ascii="DejaVu Sans" w:cs="DejaVu Sans" w:eastAsia="DejaVu Sans" w:hAnsi="DejaVu Sans"/>
-          <w:b/>
-          <w:bCs/>
-        </w:rPr>
-        <w:t xml:space="preserve">Зелена рамка</w:t>
-      </w:r>
-      <w:r>
-        <w:rPr>
-          <w:rFonts w:ascii="DejaVu Sans" w:cs="DejaVu Sans" w:eastAsia="DejaVu Sans" w:hAnsi="DejaVu Sans"/>
-          <w:b w:val="false"/>
-          <w:bCs w:val="false"/>
-        </w:rPr>
-        <w:t xml:space="preserve"> — де вибираєш зі списку, вибране обведене зеленим: відкрита вкладка, схема, розʼєм, останній розділ. Рамка лишається після «Назад» і повороту екрана, поки працює застосунок.</w:t>
-      </w:r>
-    </w:p>
-    <w:p>
-      <w:pPr>
-        <w:pStyle w:val="ListParagraph"/>
-        <w:numPr>
-          <w:ilvl w:val="0"/>
-          <w:numId w:val="3"/>
-        </w:numPr>
-        <w:spacing w:after="80"/>
-      </w:pPr>
-      <w:r>
-        <w:rPr>
-          <w:rFonts w:ascii="DejaVu Sans" w:cs="DejaVu Sans" w:eastAsia="DejaVu Sans" w:hAnsi="DejaVu Sans"/>
-          <w:b/>
-          <w:bCs/>
-        </w:rPr>
-        <w:t xml:space="preserve">«Критерії / скорочення»</w:t>
-      </w:r>
-      <w:r>
-        <w:rPr>
-          <w:rFonts w:ascii="DejaVu Sans" w:cs="DejaVu Sans" w:eastAsia="DejaVu Sans" w:hAnsi="DejaVu Sans"/>
-          <w:b w:val="false"/>
-          <w:bCs w:val="false"/>
-        </w:rPr>
-        <w:t xml:space="preserve"> закріплені під меню розділу. Дотик відкриває таблицю скорочень поверх списку; ✕ або «Назад» закривають її, список не зрушує.</w:t>
-      </w:r>
-    </w:p>
-    <w:p>
-      <w:pPr>
-        <w:pStyle w:val="ListParagraph"/>
-        <w:numPr>
-          <w:ilvl w:val="0"/>
-          <w:numId w:val="3"/>
-        </w:numPr>
-        <w:spacing w:after="80"/>
-      </w:pPr>
-      <w:r>
-        <w:rPr>
-          <w:rFonts w:ascii="DejaVu Sans" w:cs="DejaVu Sans" w:eastAsia="DejaVu Sans" w:hAnsi="DejaVu Sans"/>
-          <w:b/>
-          <w:bCs/>
-        </w:rPr>
-        <w:t xml:space="preserve">Картка «ВИБРАНО»</w:t>
-      </w:r>
-      <w:r>
-        <w:rPr>
-          <w:rFonts w:ascii="DejaVu Sans" w:cs="DejaVu Sans" w:eastAsia="DejaVu Sans" w:hAnsi="DejaVu Sans"/>
-          <w:b w:val="false"/>
-          <w:bCs w:val="false"/>
-        </w:rPr>
-        <w:t xml:space="preserve"> — вибраний розʼєм і його документи («Схема + піни», «Схема розʼєму», «Опис контактів») стоять над списком. «Опис контактів» сам прокручує до таблиці.</w:t>
-      </w:r>
-    </w:p>
-    <w:p>
-      <w:pPr>
-        <w:pStyle w:val="ListParagraph"/>
-        <w:numPr>
-          <w:ilvl w:val="0"/>
-          <w:numId w:val="3"/>
-        </w:numPr>
-        <w:spacing w:after="80"/>
-      </w:pPr>
-      <w:r>
-        <w:rPr>
-          <w:rFonts w:ascii="DejaVu Sans" w:cs="DejaVu Sans" w:eastAsia="DejaVu Sans" w:hAnsi="DejaVu Sans"/>
-          <w:b w:val="false"/>
-          <w:bCs w:val="false"/>
-        </w:rPr>
-        <w:t xml:space="preserve">Кнопка «⇩ PDF» зберігає оригінальний PDF у вибрану папку.</w:t>
+        <w:t xml:space="preserve">«✓ Встановлено»</w:t>
+      </w:r>
+      <w:r>
+        <w:rPr>
+          <w:rFonts w:ascii="DejaVu Sans" w:cs="DejaVu Sans" w:eastAsia="DejaVu Sans" w:hAnsi="DejaVu Sans"/>
+          <w:b w:val="false"/>
+          <w:bCs w:val="false"/>
+        </w:rPr>
+        <w:t xml:space="preserve"> — зелений рядок під томом, який уже є на телефоні. Його качати не треба.</w:t>
+      </w:r>
+    </w:p>
+    <w:p>
+      <w:pPr>
+        <w:pStyle w:val="ListParagraph"/>
+        <w:numPr>
+          <w:ilvl w:val="0"/>
+          <w:numId w:val="3"/>
+        </w:numPr>
+        <w:spacing w:after="80"/>
+      </w:pPr>
+      <w:r>
+        <w:rPr>
+          <w:rFonts w:ascii="DejaVu Sans" w:cs="DejaVu Sans" w:eastAsia="DejaVu Sans" w:hAnsi="DejaVu Sans"/>
+          <w:b w:val="false"/>
+          <w:bCs w:val="false"/>
+        </w:rPr>
+        <w:t xml:space="preserve">Після завантаження застосунок звіряє контрольну суму SHA-256. Пошкоджений файл не встановиться.</w:t>
+      </w:r>
+    </w:p>
+    <w:p>
+      <w:pPr>
+        <w:pStyle w:val="ListParagraph"/>
+        <w:numPr>
+          <w:ilvl w:val="0"/>
+          <w:numId w:val="3"/>
+        </w:numPr>
+        <w:spacing w:after="80"/>
+      </w:pPr>
+      <w:r>
+        <w:rPr>
+          <w:rFonts w:ascii="DejaVu Sans" w:cs="DejaVu Sans" w:eastAsia="DejaVu Sans" w:hAnsi="DejaVu Sans"/>
+          <w:b w:val="false"/>
+          <w:bCs w:val="false"/>
+        </w:rPr>
+        <w:t xml:space="preserve">Томи великі — від 30 до 240 МБ. Краще качати через Wi-Fi.</w:t>
       </w:r>
     </w:p>
     <w:p>
@@ -958,7 +887,7 @@
         <w:rPr>
           <w:rFonts w:ascii="DejaVu Sans" w:cs="DejaVu Sans" w:eastAsia="DejaVu Sans" w:hAnsi="DejaVu Sans"/>
         </w:rPr>
-        <w:t xml:space="preserve">PDF, масштаб і друк</w:t>
+        <w:t xml:space="preserve">Як читати том</w:t>
       </w:r>
     </w:p>
     <w:p>
@@ -971,7 +900,7 @@
           <w:b w:val="false"/>
           <w:bCs w:val="false"/>
         </w:rPr>
-        <w:t xml:space="preserve">Схеми PDF відкриваються у вбудованому переглядачі. Панель кнопок угорі однакового розміру скрізь: на окремому екрані, у «Схема + піни» і в другому вікні.</w:t>
+        <w:t xml:space="preserve">Дотик по тому відкриває його в режимі, вибраному в налаштуваннях: Modern (стоїть спочатку) або Classic. Перемкнутися можна кнопками Modern / Classic вгорі.</w:t>
       </w:r>
     </w:p>
     <w:p>
@@ -982,7 +911,7 @@
       <w:r>
         <w:drawing>
           <wp:inline distT="0" distB="0" distL="0" distR="0">
-            <wp:extent cx="5715000" cy="3067050"/>
+            <wp:extent cx="5715000" cy="3238500"/>
             <wp:effectExtent t="0" r="0" b="0" l="0"/>
             <wp:docPr id="1" name="" descr="" title=""/>
             <wp:cNvGraphicFramePr>
@@ -1007,7 +936,7 @@
                   <pic:spPr bwMode="auto">
                     <a:xfrm>
                       <a:off x="0" y="0"/>
-                      <a:ext cx="5715000" cy="3067050"/>
+                      <a:ext cx="5715000" cy="3238500"/>
                     </a:xfrm>
                     <a:prstGeom prst="rect">
                       <a:avLst/>
@@ -1032,80 +961,158 @@
       <w:r>
         <w:rPr>
           <w:rFonts w:ascii="DejaVu Sans" w:cs="DejaVu Sans" w:eastAsia="DejaVu Sans" w:hAnsi="DejaVu Sans"/>
-          <w:b w:val="false"/>
-          <w:bCs w:val="false"/>
-        </w:rPr>
-        <w:t xml:space="preserve">Меню ▾ біля відсотків має кроки аж до 450% і 500%.</w:t>
-      </w:r>
-    </w:p>
-    <w:p>
-      <w:pPr>
-        <w:pStyle w:val="ListParagraph"/>
-        <w:numPr>
-          <w:ilvl w:val="0"/>
-          <w:numId w:val="3"/>
-        </w:numPr>
-        <w:spacing w:after="80"/>
-      </w:pPr>
-      <w:r>
-        <w:rPr>
-          <w:rFonts w:ascii="DejaVu Sans" w:cs="DejaVu Sans" w:eastAsia="DejaVu Sans" w:hAnsi="DejaVu Sans"/>
-          <w:b w:val="false"/>
-          <w:bCs w:val="false"/>
-        </w:rPr>
-        <w:t xml:space="preserve">На «Схема + піни» сама сторінка не масштабується — збільшується кожен документ окремо, нижній не зникає.</w:t>
-      </w:r>
-    </w:p>
-    <w:p>
-      <w:pPr>
-        <w:pStyle w:val="ListParagraph"/>
-        <w:numPr>
-          <w:ilvl w:val="0"/>
-          <w:numId w:val="3"/>
-        </w:numPr>
-        <w:spacing w:after="80"/>
-      </w:pPr>
-      <w:r>
-        <w:rPr>
-          <w:rFonts w:ascii="DejaVu Sans" w:cs="DejaVu Sans" w:eastAsia="DejaVu Sans" w:hAnsi="DejaVu Sans"/>
-          <w:b w:val="false"/>
-          <w:bCs w:val="false"/>
-        </w:rPr>
-        <w:t xml:space="preserve">Друк — лише через </w:t>
-      </w:r>
-      <w:r>
-        <w:rPr>
-          <w:rFonts w:ascii="DejaVu Sans" w:cs="DejaVu Sans" w:eastAsia="DejaVu Sans" w:hAnsi="DejaVu Sans"/>
           <w:b/>
           <w:bCs/>
         </w:rPr>
-        <w:t xml:space="preserve">оригінальний значок принтера</w:t>
-      </w:r>
-      <w:r>
-        <w:rPr>
-          <w:rFonts w:ascii="DejaVu Sans" w:cs="DejaVu Sans" w:eastAsia="DejaVu Sans" w:hAnsi="DejaVu Sans"/>
-          <w:b w:val="false"/>
-          <w:bCs w:val="false"/>
-        </w:rPr>
-        <w:t xml:space="preserve"> Renault на документі. Окремих кнопок «Друк» застосунок не додає.</w:t>
-      </w:r>
-    </w:p>
-    <w:p>
-      <w:pPr>
-        <w:pStyle w:val="ListParagraph"/>
-        <w:numPr>
-          <w:ilvl w:val="0"/>
-          <w:numId w:val="3"/>
-        </w:numPr>
-        <w:spacing w:after="80"/>
-      </w:pPr>
-      <w:r>
-        <w:rPr>
-          <w:rFonts w:ascii="DejaVu Sans" w:cs="DejaVu Sans" w:eastAsia="DejaVu Sans" w:hAnsi="DejaVu Sans"/>
-          <w:b w:val="false"/>
-          <w:bCs w:val="false"/>
-        </w:rPr>
-        <w:t xml:space="preserve">Якщо в документа є друкований варіант (чорно-білий), друкується саме він.</w:t>
+        <w:t xml:space="preserve">Modern</w:t>
+      </w:r>
+      <w:r>
+        <w:rPr>
+          <w:rFonts w:ascii="DejaVu Sans" w:cs="DejaVu Sans" w:eastAsia="DejaVu Sans" w:hAnsi="DejaVu Sans"/>
+          <w:b w:val="false"/>
+          <w:bCs w:val="false"/>
+        </w:rPr>
+        <w:t xml:space="preserve"> — зручні списки, пошук і таблиці. Таблицю можна зберегти як PDF.</w:t>
+      </w:r>
+    </w:p>
+    <w:p>
+      <w:pPr>
+        <w:pStyle w:val="ListParagraph"/>
+        <w:numPr>
+          <w:ilvl w:val="0"/>
+          <w:numId w:val="3"/>
+        </w:numPr>
+        <w:spacing w:after="80"/>
+      </w:pPr>
+      <w:r>
+        <w:rPr>
+          <w:rFonts w:ascii="DejaVu Sans" w:cs="DejaVu Sans" w:eastAsia="DejaVu Sans" w:hAnsi="DejaVu Sans"/>
+          <w:b/>
+          <w:bCs/>
+        </w:rPr>
+        <w:t xml:space="preserve">Classic</w:t>
+      </w:r>
+      <w:r>
+        <w:rPr>
+          <w:rFonts w:ascii="DejaVu Sans" w:cs="DejaVu Sans" w:eastAsia="DejaVu Sans" w:hAnsi="DejaVu Sans"/>
+          <w:b w:val="false"/>
+          <w:bCs w:val="false"/>
+        </w:rPr>
+        <w:t xml:space="preserve"> — все як у оригіналі на Windows: ті самі меню, сторінки й переходи.</w:t>
+      </w:r>
+    </w:p>
+    <w:p>
+      <w:pPr>
+        <w:pStyle w:val="ListParagraph"/>
+        <w:numPr>
+          <w:ilvl w:val="0"/>
+          <w:numId w:val="3"/>
+        </w:numPr>
+        <w:spacing w:after="80"/>
+      </w:pPr>
+      <w:r>
+        <w:rPr>
+          <w:rFonts w:ascii="DejaVu Sans" w:cs="DejaVu Sans" w:eastAsia="DejaVu Sans" w:hAnsi="DejaVu Sans"/>
+          <w:b w:val="false"/>
+          <w:bCs w:val="false"/>
+        </w:rPr>
+        <w:t xml:space="preserve">Якщо пункт ще не перенесено в Modern, застосунок відкриє його через Classic.</w:t>
+      </w:r>
+    </w:p>
+    <w:p>
+      <w:pPr>
+        <w:pStyle w:val="ListParagraph"/>
+        <w:numPr>
+          <w:ilvl w:val="0"/>
+          <w:numId w:val="3"/>
+        </w:numPr>
+        <w:spacing w:after="80"/>
+      </w:pPr>
+      <w:r>
+        <w:rPr>
+          <w:rFonts w:ascii="DejaVu Sans" w:cs="DejaVu Sans" w:eastAsia="DejaVu Sans" w:hAnsi="DejaVu Sans"/>
+          <w:b/>
+          <w:bCs/>
+        </w:rPr>
+        <w:t xml:space="preserve">Зелена рамка</w:t>
+      </w:r>
+      <w:r>
+        <w:rPr>
+          <w:rFonts w:ascii="DejaVu Sans" w:cs="DejaVu Sans" w:eastAsia="DejaVu Sans" w:hAnsi="DejaVu Sans"/>
+          <w:b w:val="false"/>
+          <w:bCs w:val="false"/>
+        </w:rPr>
+        <w:t xml:space="preserve"> — де вибираєш зі списку, вибране обведене зеленим: відкрита вкладка, схема, розʼєм, останній розділ. Рамка лишається після «Назад» і повороту екрана, поки працює застосунок.</w:t>
+      </w:r>
+    </w:p>
+    <w:p>
+      <w:pPr>
+        <w:pStyle w:val="ListParagraph"/>
+        <w:numPr>
+          <w:ilvl w:val="0"/>
+          <w:numId w:val="3"/>
+        </w:numPr>
+        <w:spacing w:after="80"/>
+      </w:pPr>
+      <w:r>
+        <w:rPr>
+          <w:rFonts w:ascii="DejaVu Sans" w:cs="DejaVu Sans" w:eastAsia="DejaVu Sans" w:hAnsi="DejaVu Sans"/>
+          <w:b/>
+          <w:bCs/>
+        </w:rPr>
+        <w:t xml:space="preserve">«Критерії / скорочення»</w:t>
+      </w:r>
+      <w:r>
+        <w:rPr>
+          <w:rFonts w:ascii="DejaVu Sans" w:cs="DejaVu Sans" w:eastAsia="DejaVu Sans" w:hAnsi="DejaVu Sans"/>
+          <w:b w:val="false"/>
+          <w:bCs w:val="false"/>
+        </w:rPr>
+        <w:t xml:space="preserve"> закріплені під меню розділу. Дотик відкриває таблицю скорочень поверх списку; ✕ або «Назад» закривають її, список не зрушує.</w:t>
+      </w:r>
+    </w:p>
+    <w:p>
+      <w:pPr>
+        <w:pStyle w:val="ListParagraph"/>
+        <w:numPr>
+          <w:ilvl w:val="0"/>
+          <w:numId w:val="3"/>
+        </w:numPr>
+        <w:spacing w:after="80"/>
+      </w:pPr>
+      <w:r>
+        <w:rPr>
+          <w:rFonts w:ascii="DejaVu Sans" w:cs="DejaVu Sans" w:eastAsia="DejaVu Sans" w:hAnsi="DejaVu Sans"/>
+          <w:b/>
+          <w:bCs/>
+        </w:rPr>
+        <w:t xml:space="preserve">Картка «ВИБРАНО»</w:t>
+      </w:r>
+      <w:r>
+        <w:rPr>
+          <w:rFonts w:ascii="DejaVu Sans" w:cs="DejaVu Sans" w:eastAsia="DejaVu Sans" w:hAnsi="DejaVu Sans"/>
+          <w:b w:val="false"/>
+          <w:bCs w:val="false"/>
+        </w:rPr>
+        <w:t xml:space="preserve"> — вибраний розʼєм і його документи («Схема + піни», «Схема розʼєму», «Опис контактів») стоять над списком. «Опис контактів» сам прокручує до таблиці.</w:t>
+      </w:r>
+    </w:p>
+    <w:p>
+      <w:pPr>
+        <w:pStyle w:val="ListParagraph"/>
+        <w:numPr>
+          <w:ilvl w:val="0"/>
+          <w:numId w:val="3"/>
+        </w:numPr>
+        <w:spacing w:after="80"/>
+      </w:pPr>
+      <w:r>
+        <w:rPr>
+          <w:rFonts w:ascii="DejaVu Sans" w:cs="DejaVu Sans" w:eastAsia="DejaVu Sans" w:hAnsi="DejaVu Sans"/>
+          <w:b w:val="false"/>
+          <w:bCs w:val="false"/>
+        </w:rPr>
+        <w:t xml:space="preserve">Кнопка «⇩ PDF» зберігає оригінальний PDF у вибрану папку.</w:t>
       </w:r>
     </w:p>
     <w:p>
@@ -1121,7 +1128,7 @@
         <w:rPr>
           <w:rFonts w:ascii="DejaVu Sans" w:cs="DejaVu Sans" w:eastAsia="DejaVu Sans" w:hAnsi="DejaVu Sans"/>
         </w:rPr>
-        <w:t xml:space="preserve">Друге вікно «Документація поруч»</w:t>
+        <w:t xml:space="preserve">PDF, масштаб і друк</w:t>
       </w:r>
     </w:p>
     <w:p>
@@ -1134,7 +1141,7 @@
           <w:b w:val="false"/>
           <w:bCs w:val="false"/>
         </w:rPr>
-        <w:t xml:space="preserve">Кнопка ◫ у панелі PDF відкриває друге вікно знизу. Верхній документ лишається, а знизу можна відкрити будь-який інший документ цього тому — так зверху і знизу стоять два різні документи.</w:t>
+        <w:t xml:space="preserve">Схеми PDF відкриваються у вбудованому переглядачі. Панель кнопок угорі однакового розміру скрізь: на окремому екрані, у «Схема + піни» і в другому вікні.</w:t>
       </w:r>
     </w:p>
     <w:p>
@@ -1145,7 +1152,7 @@
       <w:r>
         <w:drawing>
           <wp:inline distT="0" distB="0" distL="0" distR="0">
-            <wp:extent cx="5715000" cy="3609975"/>
+            <wp:extent cx="5715000" cy="3067050"/>
             <wp:effectExtent t="0" r="0" b="0" l="0"/>
             <wp:docPr id="1" name="" descr="" title=""/>
             <wp:cNvGraphicFramePr>
@@ -1170,7 +1177,7 @@
                   <pic:spPr bwMode="auto">
                     <a:xfrm>
                       <a:off x="0" y="0"/>
-                      <a:ext cx="5715000" cy="3609975"/>
+                      <a:ext cx="5715000" cy="3067050"/>
                     </a:xfrm>
                     <a:prstGeom prst="rect">
                       <a:avLst/>
@@ -1198,79 +1205,77 @@
           <w:b w:val="false"/>
           <w:bCs w:val="false"/>
         </w:rPr>
-        <w:t xml:space="preserve">«←» у другому вікні — крок назад по ланцюжку: документ → розділ → том → закрити.</w:t>
-      </w:r>
-    </w:p>
-    <w:p>
-      <w:pPr>
-        <w:pStyle w:val="ListParagraph"/>
-        <w:numPr>
-          <w:ilvl w:val="0"/>
-          <w:numId w:val="3"/>
-        </w:numPr>
-        <w:spacing w:after="80"/>
-      </w:pPr>
-      <w:r>
-        <w:rPr>
-          <w:rFonts w:ascii="DejaVu Sans" w:cs="DejaVu Sans" w:eastAsia="DejaVu Sans" w:hAnsi="DejaVu Sans"/>
-          <w:b w:val="false"/>
-          <w:bCs w:val="false"/>
-        </w:rPr>
-        <w:t xml:space="preserve">Вкладки розділу міняють одна одну, тож «←» з розділу веде одразу в том.</w:t>
-      </w:r>
-    </w:p>
-    <w:p>
-      <w:pPr>
-        <w:pStyle w:val="ListParagraph"/>
-        <w:numPr>
-          <w:ilvl w:val="0"/>
-          <w:numId w:val="3"/>
-        </w:numPr>
-        <w:spacing w:after="80"/>
-      </w:pPr>
-      <w:r>
-        <w:rPr>
-          <w:rFonts w:ascii="DejaVu Sans" w:cs="DejaVu Sans" w:eastAsia="DejaVu Sans" w:hAnsi="DejaVu Sans"/>
-          <w:b w:val="false"/>
-          <w:bCs w:val="false"/>
-        </w:rPr>
-        <w:t xml:space="preserve">Таблиці («Опис контактів», «Критерії / скорочення») показуються прямо в другому вікні.</w:t>
-      </w:r>
-    </w:p>
-    <w:p>
-      <w:pPr>
-        <w:pStyle w:val="ListParagraph"/>
-        <w:numPr>
-          <w:ilvl w:val="0"/>
-          <w:numId w:val="3"/>
-        </w:numPr>
-        <w:spacing w:after="80"/>
-      </w:pPr>
-      <w:r>
-        <w:rPr>
-          <w:rFonts w:ascii="DejaVu Sans" w:cs="DejaVu Sans" w:eastAsia="DejaVu Sans" w:hAnsi="DejaVu Sans"/>
-          <w:b w:val="false"/>
-          <w:bCs w:val="false"/>
-        </w:rPr>
-        <w:t xml:space="preserve">Останнє відкрите на кожному кроці — у зеленій рамці.</w:t>
-      </w:r>
-    </w:p>
-    <w:p>
-      <w:pPr>
-        <w:pStyle w:val="ListParagraph"/>
-        <w:numPr>
-          <w:ilvl w:val="0"/>
-          <w:numId w:val="3"/>
-        </w:numPr>
-        <w:spacing w:after="80"/>
-      </w:pPr>
-      <w:r>
-        <w:rPr>
-          <w:rFonts w:ascii="DejaVu Sans" w:cs="DejaVu Sans" w:eastAsia="DejaVu Sans" w:hAnsi="DejaVu Sans"/>
-          <w:b w:val="false"/>
-          <w:bCs w:val="false"/>
-        </w:rPr>
-        <w:t xml:space="preserve">Межу між вікнами можна посунути.</w:t>
+        <w:t xml:space="preserve">Меню ▾ біля відсотків має кроки аж до 450% і 500%.</w:t>
+      </w:r>
+    </w:p>
+    <w:p>
+      <w:pPr>
+        <w:pStyle w:val="ListParagraph"/>
+        <w:numPr>
+          <w:ilvl w:val="0"/>
+          <w:numId w:val="3"/>
+        </w:numPr>
+        <w:spacing w:after="80"/>
+      </w:pPr>
+      <w:r>
+        <w:rPr>
+          <w:rFonts w:ascii="DejaVu Sans" w:cs="DejaVu Sans" w:eastAsia="DejaVu Sans" w:hAnsi="DejaVu Sans"/>
+          <w:b w:val="false"/>
+          <w:bCs w:val="false"/>
+        </w:rPr>
+        <w:t xml:space="preserve">На «Схема + піни» сама сторінка не масштабується — збільшується кожен документ окремо, нижній не зникає.</w:t>
+      </w:r>
+    </w:p>
+    <w:p>
+      <w:pPr>
+        <w:pStyle w:val="ListParagraph"/>
+        <w:numPr>
+          <w:ilvl w:val="0"/>
+          <w:numId w:val="3"/>
+        </w:numPr>
+        <w:spacing w:after="80"/>
+      </w:pPr>
+      <w:r>
+        <w:rPr>
+          <w:rFonts w:ascii="DejaVu Sans" w:cs="DejaVu Sans" w:eastAsia="DejaVu Sans" w:hAnsi="DejaVu Sans"/>
+          <w:b w:val="false"/>
+          <w:bCs w:val="false"/>
+        </w:rPr>
+        <w:t xml:space="preserve">Друк — лише через </w:t>
+      </w:r>
+      <w:r>
+        <w:rPr>
+          <w:rFonts w:ascii="DejaVu Sans" w:cs="DejaVu Sans" w:eastAsia="DejaVu Sans" w:hAnsi="DejaVu Sans"/>
+          <w:b/>
+          <w:bCs/>
+        </w:rPr>
+        <w:t xml:space="preserve">оригінальний значок принтера</w:t>
+      </w:r>
+      <w:r>
+        <w:rPr>
+          <w:rFonts w:ascii="DejaVu Sans" w:cs="DejaVu Sans" w:eastAsia="DejaVu Sans" w:hAnsi="DejaVu Sans"/>
+          <w:b w:val="false"/>
+          <w:bCs w:val="false"/>
+        </w:rPr>
+        <w:t xml:space="preserve"> Renault на документі. Окремих кнопок «Друк» застосунок не додає.</w:t>
+      </w:r>
+    </w:p>
+    <w:p>
+      <w:pPr>
+        <w:pStyle w:val="ListParagraph"/>
+        <w:numPr>
+          <w:ilvl w:val="0"/>
+          <w:numId w:val="3"/>
+        </w:numPr>
+        <w:spacing w:after="80"/>
+      </w:pPr>
+      <w:r>
+        <w:rPr>
+          <w:rFonts w:ascii="DejaVu Sans" w:cs="DejaVu Sans" w:eastAsia="DejaVu Sans" w:hAnsi="DejaVu Sans"/>
+          <w:b w:val="false"/>
+          <w:bCs w:val="false"/>
+        </w:rPr>
+        <w:t xml:space="preserve">Якщо в документа є друкований варіант (чорно-білий), друкується саме він.</w:t>
       </w:r>
     </w:p>
     <w:p>
@@ -1286,7 +1291,7 @@
         <w:rPr>
           <w:rFonts w:ascii="DejaVu Sans" w:cs="DejaVu Sans" w:eastAsia="DejaVu Sans" w:hAnsi="DejaVu Sans"/>
         </w:rPr>
-        <w:t xml:space="preserve">Як поділитися</w:t>
+        <w:t xml:space="preserve">Друге вікно «Документація поруч»</w:t>
       </w:r>
     </w:p>
     <w:p>
@@ -1299,7 +1304,7 @@
           <w:b w:val="false"/>
           <w:bCs w:val="false"/>
         </w:rPr>
-        <w:t xml:space="preserve">Є три способи — залежно від того, скільки томів потрібно передати.</w:t>
+        <w:t xml:space="preserve">Кнопка ◫ у панелі PDF відкриває друге вікно знизу. Верхній документ лишається, а знизу можна відкрити будь-який інший документ цього тому — так зверху і знизу стоять два різні документи.</w:t>
       </w:r>
     </w:p>
     <w:p>
@@ -1310,7 +1315,7 @@
       <w:r>
         <w:drawing>
           <wp:inline distT="0" distB="0" distL="0" distR="0">
-            <wp:extent cx="5715000" cy="2495550"/>
+            <wp:extent cx="5715000" cy="3609975"/>
             <wp:effectExtent t="0" r="0" b="0" l="0"/>
             <wp:docPr id="1" name="" descr="" title=""/>
             <wp:cNvGraphicFramePr>
@@ -1335,7 +1340,7 @@
                   <pic:spPr bwMode="auto">
                     <a:xfrm>
                       <a:off x="0" y="0"/>
-                      <a:ext cx="5715000" cy="2495550"/>
+                      <a:ext cx="5715000" cy="3609975"/>
                     </a:xfrm>
                     <a:prstGeom prst="rect">
                       <a:avLst/>
@@ -1360,72 +1365,82 @@
       <w:r>
         <w:rPr>
           <w:rFonts w:ascii="DejaVu Sans" w:cs="DejaVu Sans" w:eastAsia="DejaVu Sans" w:hAnsi="DejaVu Sans"/>
-          <w:b/>
-          <w:bCs/>
-        </w:rPr>
-        <w:t xml:space="preserve">Правило ⇧:</w:t>
-      </w:r>
-      <w:r>
-        <w:rPr>
-          <w:rFonts w:ascii="DejaVu Sans" w:cs="DejaVu Sans" w:eastAsia="DejaVu Sans" w:hAnsi="DejaVu Sans"/>
-          <w:b w:val="false"/>
-          <w:bCs w:val="false"/>
-        </w:rPr>
-        <w:t xml:space="preserve"> один підготовлений файл на том і на проєкт. Щоб зробити новий — спершу видали старий через ⋮.</w:t>
-      </w:r>
-    </w:p>
-    <w:p>
-      <w:pPr>
-        <w:pStyle w:val="ListParagraph"/>
-        <w:numPr>
-          <w:ilvl w:val="0"/>
-          <w:numId w:val="3"/>
-        </w:numPr>
-        <w:spacing w:after="80"/>
-      </w:pPr>
-      <w:r>
-        <w:rPr>
-          <w:rFonts w:ascii="DejaVu Sans" w:cs="DejaVu Sans" w:eastAsia="DejaVu Sans" w:hAnsi="DejaVu Sans"/>
-          <w:b w:val="false"/>
-          <w:bCs w:val="false"/>
-        </w:rPr>
-        <w:t xml:space="preserve">Ще один шлях для одного тому: ⋮ тому → «Експортувати .rdpkg» → вибрати, куди зберегти.</w:t>
-      </w:r>
-    </w:p>
-    <w:p>
-      <w:pPr>
-        <w:pStyle w:val="ListParagraph"/>
-        <w:numPr>
-          <w:ilvl w:val="0"/>
-          <w:numId w:val="3"/>
-        </w:numPr>
-        <w:spacing w:after="80"/>
-      </w:pPr>
-      <w:r>
-        <w:rPr>
-          <w:rFonts w:ascii="DejaVu Sans" w:cs="DejaVu Sans" w:eastAsia="DejaVu Sans" w:hAnsi="DejaVu Sans"/>
-          <w:b w:val="false"/>
-          <w:bCs w:val="false"/>
-        </w:rPr>
-        <w:t xml:space="preserve">Однойменні файли в папці не перезаписуються.</w:t>
-      </w:r>
-    </w:p>
-    <w:p>
-      <w:pPr>
-        <w:pBdr>
-          <w:left w:val="single" w:color="8A5A12" w:sz="18" w:space="8"/>
-        </w:pBdr>
-        <w:shd w:fill="FBF1DF" w:color="auto" w:val="clear"/>
-        <w:spacing w:after="160" w:before="120"/>
-      </w:pPr>
-      <w:r>
-        <w:rPr>
-          <w:rFonts w:ascii="DejaVu Sans" w:cs="DejaVu Sans" w:eastAsia="DejaVu Sans" w:hAnsi="DejaVu Sans"/>
-          <w:b/>
-          <w:bCs/>
-          <w:color w:val="8A5A12"/>
-        </w:rPr>
-        <w:t xml:space="preserve">Файл .rdproject поки можна лише відправити. Відкрити його в застосунку на іншому телефоні ще не можна — це в плані. Для передачі краще томи .rdpkg: їх застосунок відкриває через «Авто».</w:t>
+          <w:b w:val="false"/>
+          <w:bCs w:val="false"/>
+        </w:rPr>
+        <w:t xml:space="preserve">«←» у другому вікні — крок назад по ланцюжку: документ → розділ → том → закрити.</w:t>
+      </w:r>
+    </w:p>
+    <w:p>
+      <w:pPr>
+        <w:pStyle w:val="ListParagraph"/>
+        <w:numPr>
+          <w:ilvl w:val="0"/>
+          <w:numId w:val="3"/>
+        </w:numPr>
+        <w:spacing w:after="80"/>
+      </w:pPr>
+      <w:r>
+        <w:rPr>
+          <w:rFonts w:ascii="DejaVu Sans" w:cs="DejaVu Sans" w:eastAsia="DejaVu Sans" w:hAnsi="DejaVu Sans"/>
+          <w:b w:val="false"/>
+          <w:bCs w:val="false"/>
+        </w:rPr>
+        <w:t xml:space="preserve">Вкладки розділу міняють одна одну, тож «←» з розділу веде одразу в том.</w:t>
+      </w:r>
+    </w:p>
+    <w:p>
+      <w:pPr>
+        <w:pStyle w:val="ListParagraph"/>
+        <w:numPr>
+          <w:ilvl w:val="0"/>
+          <w:numId w:val="3"/>
+        </w:numPr>
+        <w:spacing w:after="80"/>
+      </w:pPr>
+      <w:r>
+        <w:rPr>
+          <w:rFonts w:ascii="DejaVu Sans" w:cs="DejaVu Sans" w:eastAsia="DejaVu Sans" w:hAnsi="DejaVu Sans"/>
+          <w:b w:val="false"/>
+          <w:bCs w:val="false"/>
+        </w:rPr>
+        <w:t xml:space="preserve">Таблиці («Опис контактів», «Критерії / скорочення») показуються прямо в другому вікні.</w:t>
+      </w:r>
+    </w:p>
+    <w:p>
+      <w:pPr>
+        <w:pStyle w:val="ListParagraph"/>
+        <w:numPr>
+          <w:ilvl w:val="0"/>
+          <w:numId w:val="3"/>
+        </w:numPr>
+        <w:spacing w:after="80"/>
+      </w:pPr>
+      <w:r>
+        <w:rPr>
+          <w:rFonts w:ascii="DejaVu Sans" w:cs="DejaVu Sans" w:eastAsia="DejaVu Sans" w:hAnsi="DejaVu Sans"/>
+          <w:b w:val="false"/>
+          <w:bCs w:val="false"/>
+        </w:rPr>
+        <w:t xml:space="preserve">Останнє відкрите на кожному кроці — у зеленій рамці.</w:t>
+      </w:r>
+    </w:p>
+    <w:p>
+      <w:pPr>
+        <w:pStyle w:val="ListParagraph"/>
+        <w:numPr>
+          <w:ilvl w:val="0"/>
+          <w:numId w:val="3"/>
+        </w:numPr>
+        <w:spacing w:after="80"/>
+      </w:pPr>
+      <w:r>
+        <w:rPr>
+          <w:rFonts w:ascii="DejaVu Sans" w:cs="DejaVu Sans" w:eastAsia="DejaVu Sans" w:hAnsi="DejaVu Sans"/>
+          <w:b w:val="false"/>
+          <w:bCs w:val="false"/>
+        </w:rPr>
+        <w:t xml:space="preserve">Межу між вікнами можна посунути.</w:t>
       </w:r>
     </w:p>
     <w:p>
@@ -1441,7 +1456,7 @@
         <w:rPr>
           <w:rFonts w:ascii="DejaVu Sans" w:cs="DejaVu Sans" w:eastAsia="DejaVu Sans" w:hAnsi="DejaVu Sans"/>
         </w:rPr>
-        <w:t xml:space="preserve">Довгі операції і «Скасувати»</w:t>
+        <w:t xml:space="preserve">Як поділитися</w:t>
       </w:r>
     </w:p>
     <w:p>
@@ -1454,7 +1469,7 @@
           <w:b w:val="false"/>
           <w:bCs w:val="false"/>
         </w:rPr>
-        <w:t xml:space="preserve">Підготовка, експорт, імпорт і створення тому йдуть у фоні. Застосунок можна згорнути, прогрес видно у шторці. На екрані — картка з зеленою смугою.</w:t>
+        <w:t xml:space="preserve">Є три способи — залежно від того, скільки томів потрібно передати.</w:t>
       </w:r>
     </w:p>
     <w:p>
@@ -1465,7 +1480,7 @@
       <w:r>
         <w:drawing>
           <wp:inline distT="0" distB="0" distL="0" distR="0">
-            <wp:extent cx="5715000" cy="2800350"/>
+            <wp:extent cx="5715000" cy="2495550"/>
             <wp:effectExtent t="0" r="0" b="0" l="0"/>
             <wp:docPr id="1" name="" descr="" title=""/>
             <wp:cNvGraphicFramePr>
@@ -1490,6 +1505,223 @@
                   <pic:spPr bwMode="auto">
                     <a:xfrm>
                       <a:off x="0" y="0"/>
+                      <a:ext cx="5715000" cy="2495550"/>
+                    </a:xfrm>
+                    <a:prstGeom prst="rect">
+                      <a:avLst/>
+                    </a:prstGeom>
+                  </pic:spPr>
+                </pic:pic>
+              </a:graphicData>
+            </a:graphic>
+          </wp:inline>
+        </w:drawing>
+      </w:r>
+    </w:p>
+    <w:p>
+      <w:pPr>
+        <w:pStyle w:val="ListParagraph"/>
+        <w:numPr>
+          <w:ilvl w:val="0"/>
+          <w:numId w:val="3"/>
+        </w:numPr>
+        <w:spacing w:after="80"/>
+      </w:pPr>
+      <w:r>
+        <w:rPr>
+          <w:rFonts w:ascii="DejaVu Sans" w:cs="DejaVu Sans" w:eastAsia="DejaVu Sans" w:hAnsi="DejaVu Sans"/>
+          <w:b/>
+          <w:bCs/>
+        </w:rPr>
+        <w:t xml:space="preserve">Правило ⇧:</w:t>
+      </w:r>
+      <w:r>
+        <w:rPr>
+          <w:rFonts w:ascii="DejaVu Sans" w:cs="DejaVu Sans" w:eastAsia="DejaVu Sans" w:hAnsi="DejaVu Sans"/>
+          <w:b w:val="false"/>
+          <w:bCs w:val="false"/>
+        </w:rPr>
+        <w:t xml:space="preserve"> один підготовлений файл на том і на проєкт. Щоб зробити новий — спершу видали старий через ⋮.</w:t>
+      </w:r>
+    </w:p>
+    <w:p>
+      <w:pPr>
+        <w:pStyle w:val="ListParagraph"/>
+        <w:numPr>
+          <w:ilvl w:val="0"/>
+          <w:numId w:val="3"/>
+        </w:numPr>
+        <w:spacing w:after="80"/>
+      </w:pPr>
+      <w:r>
+        <w:rPr>
+          <w:rFonts w:ascii="DejaVu Sans" w:cs="DejaVu Sans" w:eastAsia="DejaVu Sans" w:hAnsi="DejaVu Sans"/>
+          <w:b w:val="false"/>
+          <w:bCs w:val="false"/>
+        </w:rPr>
+        <w:t xml:space="preserve">Ще один шлях для одного тому: ⋮ тому → «Експортувати .rdpkg» → вибрати, куди зберегти.</w:t>
+      </w:r>
+    </w:p>
+    <w:p>
+      <w:pPr>
+        <w:pStyle w:val="ListParagraph"/>
+        <w:numPr>
+          <w:ilvl w:val="0"/>
+          <w:numId w:val="3"/>
+        </w:numPr>
+        <w:spacing w:after="80"/>
+      </w:pPr>
+      <w:r>
+        <w:rPr>
+          <w:rFonts w:ascii="DejaVu Sans" w:cs="DejaVu Sans" w:eastAsia="DejaVu Sans" w:hAnsi="DejaVu Sans"/>
+          <w:b w:val="false"/>
+          <w:bCs w:val="false"/>
+        </w:rPr>
+        <w:t xml:space="preserve">Однойменні файли в папці не перезаписуються. Файл, який уже лежить у папці, застосунок звіряє за SHA-256: якщо збігся — пише «уже був», не копіює вдруге.</w:t>
+      </w:r>
+    </w:p>
+    <w:p>
+      <w:pPr>
+        <w:pStyle w:val="ListParagraph"/>
+        <w:numPr>
+          <w:ilvl w:val="0"/>
+          <w:numId w:val="3"/>
+        </w:numPr>
+        <w:spacing w:after="80"/>
+      </w:pPr>
+      <w:r>
+        <w:rPr>
+          <w:rFonts w:ascii="DejaVu Sans" w:cs="DejaVu Sans" w:eastAsia="DejaVu Sans" w:hAnsi="DejaVu Sans"/>
+          <w:b/>
+          <w:bCs/>
+        </w:rPr>
+        <w:t xml:space="preserve">«Вибрати лише нові для каталогу»</w:t>
+      </w:r>
+      <w:r>
+        <w:rPr>
+          <w:rFonts w:ascii="DejaVu Sans" w:cs="DejaVu Sans" w:eastAsia="DejaVu Sans" w:hAnsi="DejaVu Sans"/>
+          <w:b w:val="false"/>
+          <w:bCs w:val="false"/>
+        </w:rPr>
+        <w:t xml:space="preserve"> у кроці 1 сам ставить галочки на томи, яких ще нема в «Готові проєкти».</w:t>
+      </w:r>
+    </w:p>
+    <w:p>
+      <w:pPr>
+        <w:pStyle w:val="ListParagraph"/>
+        <w:numPr>
+          <w:ilvl w:val="0"/>
+          <w:numId w:val="3"/>
+        </w:numPr>
+        <w:spacing w:after="80"/>
+      </w:pPr>
+      <w:r>
+        <w:rPr>
+          <w:rFonts w:ascii="DejaVu Sans" w:cs="DejaVu Sans" w:eastAsia="DejaVu Sans" w:hAnsi="DejaVu Sans"/>
+          <w:b w:val="false"/>
+          <w:bCs w:val="false"/>
+        </w:rPr>
+        <w:t xml:space="preserve">На кроках 2 і 3 видно назву вибраної папки. У кінці в папку пишеться короткий JSON-звіт — навіть якщо щось не вдалося.</w:t>
+      </w:r>
+    </w:p>
+    <w:p>
+      <w:pPr>
+        <w:pBdr>
+          <w:left w:val="single" w:color="8A5A12" w:sz="18" w:space="8"/>
+        </w:pBdr>
+        <w:shd w:fill="FBF1DF" w:color="auto" w:val="clear"/>
+        <w:spacing w:after="160" w:before="120"/>
+      </w:pPr>
+      <w:r>
+        <w:rPr>
+          <w:rFonts w:ascii="DejaVu Sans" w:cs="DejaVu Sans" w:eastAsia="DejaVu Sans" w:hAnsi="DejaVu Sans"/>
+          <w:b/>
+          <w:bCs/>
+          <w:color w:val="8A5A12"/>
+        </w:rPr>
+        <w:t xml:space="preserve">Порада: експортуй томи в папку на телефоні, а на Google Диск вивантаж їх кнопкою «+» у застосунку Диск. Якщо одразу вибрати папку Диска, файли бере застосунок Диск і вивантажує сам — великі томи можуть годинами висіти в його черзі.</w:t>
+      </w:r>
+    </w:p>
+    <w:p>
+      <w:pPr>
+        <w:pBdr>
+          <w:left w:val="single" w:color="8A5A12" w:sz="18" w:space="8"/>
+        </w:pBdr>
+        <w:shd w:fill="FBF1DF" w:color="auto" w:val="clear"/>
+        <w:spacing w:after="160" w:before="120"/>
+      </w:pPr>
+      <w:r>
+        <w:rPr>
+          <w:rFonts w:ascii="DejaVu Sans" w:cs="DejaVu Sans" w:eastAsia="DejaVu Sans" w:hAnsi="DejaVu Sans"/>
+          <w:b/>
+          <w:bCs/>
+          <w:color w:val="8A5A12"/>
+        </w:rPr>
+        <w:t xml:space="preserve">Файл .rdproject поки можна лише відправити. Відкрити його в застосунку на іншому телефоні ще не можна — це в плані. Для передачі краще томи .rdpkg: їх застосунок відкриває через «Авто».</w:t>
+      </w:r>
+    </w:p>
+    <w:p>
+      <w:r>
+        <w:br w:type="page"/>
+      </w:r>
+    </w:p>
+    <w:p>
+      <w:pPr>
+        <w:pStyle w:val="Heading1"/>
+      </w:pPr>
+      <w:r>
+        <w:rPr>
+          <w:rFonts w:ascii="DejaVu Sans" w:cs="DejaVu Sans" w:eastAsia="DejaVu Sans" w:hAnsi="DejaVu Sans"/>
+        </w:rPr>
+        <w:t xml:space="preserve">Довгі операції і «Скасувати»</w:t>
+      </w:r>
+    </w:p>
+    <w:p>
+      <w:pPr>
+        <w:spacing w:after="140"/>
+      </w:pPr>
+      <w:r>
+        <w:rPr>
+          <w:rFonts w:ascii="DejaVu Sans" w:cs="DejaVu Sans" w:eastAsia="DejaVu Sans" w:hAnsi="DejaVu Sans"/>
+          <w:b w:val="false"/>
+          <w:bCs w:val="false"/>
+        </w:rPr>
+        <w:t xml:space="preserve">Підготовка, експорт, імпорт і створення тому йдуть у фоні. Застосунок можна згорнути, прогрес видно у шторці. На екрані — картка з зеленою смугою.</w:t>
+      </w:r>
+    </w:p>
+    <w:p>
+      <w:pPr>
+        <w:spacing w:after="160" w:before="120" w:line="240" w:lineRule="auto"/>
+        <w:jc w:val="center"/>
+      </w:pPr>
+      <w:r>
+        <w:drawing>
+          <wp:inline distT="0" distB="0" distL="0" distR="0">
+            <wp:extent cx="5715000" cy="2800350"/>
+            <wp:effectExtent t="0" r="0" b="0" l="0"/>
+            <wp:docPr id="1" name="" descr="" title=""/>
+            <wp:cNvGraphicFramePr>
+              <a:graphicFrameLocks xmlns:a="http://schemas.openxmlformats.org/drawingml/2006/main" noChangeAspect="1"/>
+            </wp:cNvGraphicFramePr>
+            <a:graphic xmlns:a="http://schemas.openxmlformats.org/drawingml/2006/main">
+              <a:graphicData uri="http://schemas.openxmlformats.org/drawingml/2006/picture">
+                <pic:pic xmlns:pic="http://schemas.openxmlformats.org/drawingml/2006/picture">
+                  <pic:nvPicPr>
+                    <pic:cNvPr id="0" name="" descr=""/>
+                    <pic:cNvPicPr>
+                      <a:picLocks noChangeAspect="1" noChangeArrowheads="1"/>
+                    </pic:cNvPicPr>
+                  </pic:nvPicPr>
+                  <pic:blipFill>
+                    <a:blip r:embed="rId16" cstate="none"/>
+                    <a:srcRect/>
+                    <a:stretch>
+                      <a:fillRect/>
+                    </a:stretch>
+                  </pic:blipFill>
+                  <pic:spPr bwMode="auto">
+                    <a:xfrm>
+                      <a:off x="0" y="0"/>
                       <a:ext cx="5715000" cy="2800350"/>
                     </a:xfrm>
                     <a:prstGeom prst="rect">
@@ -1576,6 +1808,24 @@
       </w:r>
     </w:p>
     <w:p>
+      <w:pPr>
+        <w:pStyle w:val="ListParagraph"/>
+        <w:numPr>
+          <w:ilvl w:val="0"/>
+          <w:numId w:val="3"/>
+        </w:numPr>
+        <w:spacing w:after="80"/>
+      </w:pPr>
+      <w:r>
+        <w:rPr>
+          <w:rFonts w:ascii="DejaVu Sans" w:cs="DejaVu Sans" w:eastAsia="DejaVu Sans" w:hAnsi="DejaVu Sans"/>
+          <w:b w:val="false"/>
+          <w:bCs w:val="false"/>
+        </w:rPr>
+        <w:t xml:space="preserve">Коли операція завершилась або сталася помилка — шторка подає звук. Прогрес і «скасовано» — тихо.</w:t>
+      </w:r>
+    </w:p>
+    <w:p>
       <w:r>
         <w:br w:type="page"/>
       </w:r>
@@ -1679,6 +1929,24 @@
           <w:bCs w:val="false"/>
         </w:rPr>
         <w:t xml:space="preserve">Зміни зберігаються автоматично.</w:t>
+      </w:r>
+    </w:p>
+    <w:p>
+      <w:pPr>
+        <w:pStyle w:val="ListParagraph"/>
+        <w:numPr>
+          <w:ilvl w:val="0"/>
+          <w:numId w:val="3"/>
+        </w:numPr>
+        <w:spacing w:after="80"/>
+      </w:pPr>
+      <w:r>
+        <w:rPr>
+          <w:rFonts w:ascii="DejaVu Sans" w:cs="DejaVu Sans" w:eastAsia="DejaVu Sans" w:hAnsi="DejaVu Sans"/>
+          <w:b w:val="false"/>
+          <w:bCs w:val="false"/>
+        </w:rPr>
+        <w:t xml:space="preserve">«Про програму» → «Інструкція користувача» — ця інструкція всередині застосунку, працює без інтернету.</w:t>
       </w:r>
     </w:p>
     <w:p>
@@ -1782,7 +2050,7 @@
           <w:sz w:val="18"/>
           <w:szCs w:val="18"/>
         </w:rPr>
-        <w:t xml:space="preserve">Посібник зібрано з коду застосунку v0.5.121. Якщо кнопка на телефоні називається інакше — правда за телефоном.</w:t>
+        <w:t xml:space="preserve">Посібник зібрано з коду застосунку v0.5.130. Якщо кнопка на телефоні називається інакше — правда за телефоном.</w:t>
       </w:r>
     </w:p>
     <w:sectPr>

</xml_diff>

<commit_message>
v0.5.130: user guide inside the app (Settings → Про програму) (#278)
Claude-Session: https://claude.ai/code/session_01VPquYZFFEbKUhD3JuP77cq

Co-authored-by: Claude <noreply@anthropic.com>
</commit_message>
<xml_diff>
--- a/docs/ua/Posibnyk-Renault-Docs.docx
+++ b/docs/ua/Posibnyk-Renault-Docs.docx
@@ -13,7 +13,7 @@
           <w:sz w:val="18"/>
           <w:szCs w:val="18"/>
         </w:rPr>
-        <w:t xml:space="preserve">RENAULT DOCS · v0.5.121 · 13.10.2026</w:t>
+        <w:t xml:space="preserve">RENAULT DOCS · v0.5.130 · 14.10.2026</w:t>
       </w:r>
     </w:p>
     <w:p>
@@ -95,6 +95,21 @@
           <w:rFonts w:ascii="DejaVu Sans" w:cs="DejaVu Sans" w:eastAsia="DejaVu Sans" w:hAnsi="DejaVu Sans"/>
         </w:rPr>
         <w:t xml:space="preserve">Як додати том</w:t>
+      </w:r>
+    </w:p>
+    <w:p>
+      <w:pPr>
+        <w:pStyle w:val="ListParagraph"/>
+        <w:numPr>
+          <w:ilvl w:val="0"/>
+          <w:numId w:val="2"/>
+        </w:numPr>
+      </w:pPr>
+      <w:r>
+        <w:rPr>
+          <w:rFonts w:ascii="DejaVu Sans" w:cs="DejaVu Sans" w:eastAsia="DejaVu Sans" w:hAnsi="DejaVu Sans"/>
+        </w:rPr>
+        <w:t xml:space="preserve">Готові проєкти з Google Диска</w:t>
       </w:r>
     </w:p>
     <w:p>
@@ -520,7 +535,7 @@
           <w:b w:val="false"/>
           <w:bCs w:val="false"/>
         </w:rPr>
-        <w:t xml:space="preserve">«Видалити підготовлений .rdproject» — видаляє лише файл ⇧, проєкт лишається.</w:t>
+        <w:t xml:space="preserve">«Видалити підготовлений .rdproject» — видаляє лише файл ⇧, проєкт лишається. Додавання чи видалення тому підготовлений файл не прибирає — меню лише підкаже, що він зроблений для старого набору томів.</w:t>
       </w:r>
     </w:p>
     <w:p>
@@ -717,7 +732,7 @@
         <w:rPr>
           <w:rFonts w:ascii="DejaVu Sans" w:cs="DejaVu Sans" w:eastAsia="DejaVu Sans" w:hAnsi="DejaVu Sans"/>
         </w:rPr>
-        <w:t xml:space="preserve">Як читати том</w:t>
+        <w:t xml:space="preserve">Готові проєкти з Google Диска</w:t>
       </w:r>
     </w:p>
     <w:p>
@@ -730,7 +745,7 @@
           <w:b w:val="false"/>
           <w:bCs w:val="false"/>
         </w:rPr>
-        <w:t xml:space="preserve">Дотик по тому відкриває його в режимі, вибраному в налаштуваннях: Modern (стоїть спочатку) або Classic. Перемкнутися можна кнопками Modern / Classic вгорі.</w:t>
+        <w:t xml:space="preserve">Головне → «Готові проєкти» відкриває каталог Renault Docs з Google Диска (потрібен інтернет). Угорі видно версію каталогу, нижче — картки проєктів: роки документації і скільки томів.</w:t>
       </w:r>
     </w:p>
     <w:p>
@@ -741,7 +756,7 @@
       <w:r>
         <w:drawing>
           <wp:inline distT="0" distB="0" distL="0" distR="0">
-            <wp:extent cx="5715000" cy="3238500"/>
+            <wp:extent cx="4838700" cy="6858000"/>
             <wp:effectExtent t="0" r="0" b="0" l="0"/>
             <wp:docPr id="1" name="" descr="" title=""/>
             <wp:cNvGraphicFramePr>
@@ -766,7 +781,7 @@
                   <pic:spPr bwMode="auto">
                     <a:xfrm>
                       <a:off x="0" y="0"/>
-                      <a:ext cx="5715000" cy="3238500"/>
+                      <a:ext cx="4838700" cy="6858000"/>
                     </a:xfrm>
                     <a:prstGeom prst="rect">
                       <a:avLst/>
@@ -791,158 +806,72 @@
       <w:r>
         <w:rPr>
           <w:rFonts w:ascii="DejaVu Sans" w:cs="DejaVu Sans" w:eastAsia="DejaVu Sans" w:hAnsi="DejaVu Sans"/>
+          <w:b w:val="false"/>
+          <w:bCs w:val="false"/>
+        </w:rPr>
+        <w:t xml:space="preserve">Кожен том — окремий файл: бери лише ті, що потрібні, а не всі одразу.</w:t>
+      </w:r>
+    </w:p>
+    <w:p>
+      <w:pPr>
+        <w:pStyle w:val="ListParagraph"/>
+        <w:numPr>
+          <w:ilvl w:val="0"/>
+          <w:numId w:val="3"/>
+        </w:numPr>
+        <w:spacing w:after="80"/>
+      </w:pPr>
+      <w:r>
+        <w:rPr>
+          <w:rFonts w:ascii="DejaVu Sans" w:cs="DejaVu Sans" w:eastAsia="DejaVu Sans" w:hAnsi="DejaVu Sans"/>
           <w:b/>
           <w:bCs/>
         </w:rPr>
-        <w:t xml:space="preserve">Modern</w:t>
-      </w:r>
-      <w:r>
-        <w:rPr>
-          <w:rFonts w:ascii="DejaVu Sans" w:cs="DejaVu Sans" w:eastAsia="DejaVu Sans" w:hAnsi="DejaVu Sans"/>
-          <w:b w:val="false"/>
-          <w:bCs w:val="false"/>
-        </w:rPr>
-        <w:t xml:space="preserve"> — зручні списки, пошук і таблиці. Таблицю можна зберегти як PDF.</w:t>
-      </w:r>
-    </w:p>
-    <w:p>
-      <w:pPr>
-        <w:pStyle w:val="ListParagraph"/>
-        <w:numPr>
-          <w:ilvl w:val="0"/>
-          <w:numId w:val="3"/>
-        </w:numPr>
-        <w:spacing w:after="80"/>
-      </w:pPr>
-      <w:r>
-        <w:rPr>
-          <w:rFonts w:ascii="DejaVu Sans" w:cs="DejaVu Sans" w:eastAsia="DejaVu Sans" w:hAnsi="DejaVu Sans"/>
-          <w:b/>
-          <w:bCs/>
-        </w:rPr>
-        <w:t xml:space="preserve">Classic</w:t>
-      </w:r>
-      <w:r>
-        <w:rPr>
-          <w:rFonts w:ascii="DejaVu Sans" w:cs="DejaVu Sans" w:eastAsia="DejaVu Sans" w:hAnsi="DejaVu Sans"/>
-          <w:b w:val="false"/>
-          <w:bCs w:val="false"/>
-        </w:rPr>
-        <w:t xml:space="preserve"> — все як у оригіналі на Windows: ті самі меню, сторінки й переходи.</w:t>
-      </w:r>
-    </w:p>
-    <w:p>
-      <w:pPr>
-        <w:pStyle w:val="ListParagraph"/>
-        <w:numPr>
-          <w:ilvl w:val="0"/>
-          <w:numId w:val="3"/>
-        </w:numPr>
-        <w:spacing w:after="80"/>
-      </w:pPr>
-      <w:r>
-        <w:rPr>
-          <w:rFonts w:ascii="DejaVu Sans" w:cs="DejaVu Sans" w:eastAsia="DejaVu Sans" w:hAnsi="DejaVu Sans"/>
-          <w:b w:val="false"/>
-          <w:bCs w:val="false"/>
-        </w:rPr>
-        <w:t xml:space="preserve">Якщо пункт ще не перенесено в Modern, застосунок відкриє його через Classic.</w:t>
-      </w:r>
-    </w:p>
-    <w:p>
-      <w:pPr>
-        <w:pStyle w:val="ListParagraph"/>
-        <w:numPr>
-          <w:ilvl w:val="0"/>
-          <w:numId w:val="3"/>
-        </w:numPr>
-        <w:spacing w:after="80"/>
-      </w:pPr>
-      <w:r>
-        <w:rPr>
-          <w:rFonts w:ascii="DejaVu Sans" w:cs="DejaVu Sans" w:eastAsia="DejaVu Sans" w:hAnsi="DejaVu Sans"/>
-          <w:b/>
-          <w:bCs/>
-        </w:rPr>
-        <w:t xml:space="preserve">Зелена рамка</w:t>
-      </w:r>
-      <w:r>
-        <w:rPr>
-          <w:rFonts w:ascii="DejaVu Sans" w:cs="DejaVu Sans" w:eastAsia="DejaVu Sans" w:hAnsi="DejaVu Sans"/>
-          <w:b w:val="false"/>
-          <w:bCs w:val="false"/>
-        </w:rPr>
-        <w:t xml:space="preserve"> — де вибираєш зі списку, вибране обведене зеленим: відкрита вкладка, схема, розʼєм, останній розділ. Рамка лишається після «Назад» і повороту екрана, поки працює застосунок.</w:t>
-      </w:r>
-    </w:p>
-    <w:p>
-      <w:pPr>
-        <w:pStyle w:val="ListParagraph"/>
-        <w:numPr>
-          <w:ilvl w:val="0"/>
-          <w:numId w:val="3"/>
-        </w:numPr>
-        <w:spacing w:after="80"/>
-      </w:pPr>
-      <w:r>
-        <w:rPr>
-          <w:rFonts w:ascii="DejaVu Sans" w:cs="DejaVu Sans" w:eastAsia="DejaVu Sans" w:hAnsi="DejaVu Sans"/>
-          <w:b/>
-          <w:bCs/>
-        </w:rPr>
-        <w:t xml:space="preserve">«Критерії / скорочення»</w:t>
-      </w:r>
-      <w:r>
-        <w:rPr>
-          <w:rFonts w:ascii="DejaVu Sans" w:cs="DejaVu Sans" w:eastAsia="DejaVu Sans" w:hAnsi="DejaVu Sans"/>
-          <w:b w:val="false"/>
-          <w:bCs w:val="false"/>
-        </w:rPr>
-        <w:t xml:space="preserve"> закріплені під меню розділу. Дотик відкриває таблицю скорочень поверх списку; ✕ або «Назад» закривають її, список не зрушує.</w:t>
-      </w:r>
-    </w:p>
-    <w:p>
-      <w:pPr>
-        <w:pStyle w:val="ListParagraph"/>
-        <w:numPr>
-          <w:ilvl w:val="0"/>
-          <w:numId w:val="3"/>
-        </w:numPr>
-        <w:spacing w:after="80"/>
-      </w:pPr>
-      <w:r>
-        <w:rPr>
-          <w:rFonts w:ascii="DejaVu Sans" w:cs="DejaVu Sans" w:eastAsia="DejaVu Sans" w:hAnsi="DejaVu Sans"/>
-          <w:b/>
-          <w:bCs/>
-        </w:rPr>
-        <w:t xml:space="preserve">Картка «ВИБРАНО»</w:t>
-      </w:r>
-      <w:r>
-        <w:rPr>
-          <w:rFonts w:ascii="DejaVu Sans" w:cs="DejaVu Sans" w:eastAsia="DejaVu Sans" w:hAnsi="DejaVu Sans"/>
-          <w:b w:val="false"/>
-          <w:bCs w:val="false"/>
-        </w:rPr>
-        <w:t xml:space="preserve"> — вибраний розʼєм і його документи («Схема + піни», «Схема розʼєму», «Опис контактів») стоять над списком. «Опис контактів» сам прокручує до таблиці.</w:t>
-      </w:r>
-    </w:p>
-    <w:p>
-      <w:pPr>
-        <w:pStyle w:val="ListParagraph"/>
-        <w:numPr>
-          <w:ilvl w:val="0"/>
-          <w:numId w:val="3"/>
-        </w:numPr>
-        <w:spacing w:after="80"/>
-      </w:pPr>
-      <w:r>
-        <w:rPr>
-          <w:rFonts w:ascii="DejaVu Sans" w:cs="DejaVu Sans" w:eastAsia="DejaVu Sans" w:hAnsi="DejaVu Sans"/>
-          <w:b w:val="false"/>
-          <w:bCs w:val="false"/>
-        </w:rPr>
-        <w:t xml:space="preserve">Кнопка «⇩ PDF» зберігає оригінальний PDF у вибрану папку.</w:t>
+        <w:t xml:space="preserve">«✓ Встановлено»</w:t>
+      </w:r>
+      <w:r>
+        <w:rPr>
+          <w:rFonts w:ascii="DejaVu Sans" w:cs="DejaVu Sans" w:eastAsia="DejaVu Sans" w:hAnsi="DejaVu Sans"/>
+          <w:b w:val="false"/>
+          <w:bCs w:val="false"/>
+        </w:rPr>
+        <w:t xml:space="preserve"> — зелений рядок під томом, який уже є на телефоні. Його качати не треба.</w:t>
+      </w:r>
+    </w:p>
+    <w:p>
+      <w:pPr>
+        <w:pStyle w:val="ListParagraph"/>
+        <w:numPr>
+          <w:ilvl w:val="0"/>
+          <w:numId w:val="3"/>
+        </w:numPr>
+        <w:spacing w:after="80"/>
+      </w:pPr>
+      <w:r>
+        <w:rPr>
+          <w:rFonts w:ascii="DejaVu Sans" w:cs="DejaVu Sans" w:eastAsia="DejaVu Sans" w:hAnsi="DejaVu Sans"/>
+          <w:b w:val="false"/>
+          <w:bCs w:val="false"/>
+        </w:rPr>
+        <w:t xml:space="preserve">Після завантаження застосунок звіряє контрольну суму SHA-256. Пошкоджений файл не встановиться.</w:t>
+      </w:r>
+    </w:p>
+    <w:p>
+      <w:pPr>
+        <w:pStyle w:val="ListParagraph"/>
+        <w:numPr>
+          <w:ilvl w:val="0"/>
+          <w:numId w:val="3"/>
+        </w:numPr>
+        <w:spacing w:after="80"/>
+      </w:pPr>
+      <w:r>
+        <w:rPr>
+          <w:rFonts w:ascii="DejaVu Sans" w:cs="DejaVu Sans" w:eastAsia="DejaVu Sans" w:hAnsi="DejaVu Sans"/>
+          <w:b w:val="false"/>
+          <w:bCs w:val="false"/>
+        </w:rPr>
+        <w:t xml:space="preserve">Томи великі — від 30 до 240 МБ. Краще качати через Wi-Fi.</w:t>
       </w:r>
     </w:p>
     <w:p>
@@ -958,7 +887,7 @@
         <w:rPr>
           <w:rFonts w:ascii="DejaVu Sans" w:cs="DejaVu Sans" w:eastAsia="DejaVu Sans" w:hAnsi="DejaVu Sans"/>
         </w:rPr>
-        <w:t xml:space="preserve">PDF, масштаб і друк</w:t>
+        <w:t xml:space="preserve">Як читати том</w:t>
       </w:r>
     </w:p>
     <w:p>
@@ -971,7 +900,7 @@
           <w:b w:val="false"/>
           <w:bCs w:val="false"/>
         </w:rPr>
-        <w:t xml:space="preserve">Схеми PDF відкриваються у вбудованому переглядачі. Панель кнопок угорі однакового розміру скрізь: на окремому екрані, у «Схема + піни» і в другому вікні.</w:t>
+        <w:t xml:space="preserve">Дотик по тому відкриває його в режимі, вибраному в налаштуваннях: Modern (стоїть спочатку) або Classic. Перемкнутися можна кнопками Modern / Classic вгорі.</w:t>
       </w:r>
     </w:p>
     <w:p>
@@ -982,7 +911,7 @@
       <w:r>
         <w:drawing>
           <wp:inline distT="0" distB="0" distL="0" distR="0">
-            <wp:extent cx="5715000" cy="3067050"/>
+            <wp:extent cx="5715000" cy="3238500"/>
             <wp:effectExtent t="0" r="0" b="0" l="0"/>
             <wp:docPr id="1" name="" descr="" title=""/>
             <wp:cNvGraphicFramePr>
@@ -1007,7 +936,7 @@
                   <pic:spPr bwMode="auto">
                     <a:xfrm>
                       <a:off x="0" y="0"/>
-                      <a:ext cx="5715000" cy="3067050"/>
+                      <a:ext cx="5715000" cy="3238500"/>
                     </a:xfrm>
                     <a:prstGeom prst="rect">
                       <a:avLst/>
@@ -1032,80 +961,158 @@
       <w:r>
         <w:rPr>
           <w:rFonts w:ascii="DejaVu Sans" w:cs="DejaVu Sans" w:eastAsia="DejaVu Sans" w:hAnsi="DejaVu Sans"/>
-          <w:b w:val="false"/>
-          <w:bCs w:val="false"/>
-        </w:rPr>
-        <w:t xml:space="preserve">Меню ▾ біля відсотків має кроки аж до 450% і 500%.</w:t>
-      </w:r>
-    </w:p>
-    <w:p>
-      <w:pPr>
-        <w:pStyle w:val="ListParagraph"/>
-        <w:numPr>
-          <w:ilvl w:val="0"/>
-          <w:numId w:val="3"/>
-        </w:numPr>
-        <w:spacing w:after="80"/>
-      </w:pPr>
-      <w:r>
-        <w:rPr>
-          <w:rFonts w:ascii="DejaVu Sans" w:cs="DejaVu Sans" w:eastAsia="DejaVu Sans" w:hAnsi="DejaVu Sans"/>
-          <w:b w:val="false"/>
-          <w:bCs w:val="false"/>
-        </w:rPr>
-        <w:t xml:space="preserve">На «Схема + піни» сама сторінка не масштабується — збільшується кожен документ окремо, нижній не зникає.</w:t>
-      </w:r>
-    </w:p>
-    <w:p>
-      <w:pPr>
-        <w:pStyle w:val="ListParagraph"/>
-        <w:numPr>
-          <w:ilvl w:val="0"/>
-          <w:numId w:val="3"/>
-        </w:numPr>
-        <w:spacing w:after="80"/>
-      </w:pPr>
-      <w:r>
-        <w:rPr>
-          <w:rFonts w:ascii="DejaVu Sans" w:cs="DejaVu Sans" w:eastAsia="DejaVu Sans" w:hAnsi="DejaVu Sans"/>
-          <w:b w:val="false"/>
-          <w:bCs w:val="false"/>
-        </w:rPr>
-        <w:t xml:space="preserve">Друк — лише через </w:t>
-      </w:r>
-      <w:r>
-        <w:rPr>
-          <w:rFonts w:ascii="DejaVu Sans" w:cs="DejaVu Sans" w:eastAsia="DejaVu Sans" w:hAnsi="DejaVu Sans"/>
           <w:b/>
           <w:bCs/>
         </w:rPr>
-        <w:t xml:space="preserve">оригінальний значок принтера</w:t>
-      </w:r>
-      <w:r>
-        <w:rPr>
-          <w:rFonts w:ascii="DejaVu Sans" w:cs="DejaVu Sans" w:eastAsia="DejaVu Sans" w:hAnsi="DejaVu Sans"/>
-          <w:b w:val="false"/>
-          <w:bCs w:val="false"/>
-        </w:rPr>
-        <w:t xml:space="preserve"> Renault на документі. Окремих кнопок «Друк» застосунок не додає.</w:t>
-      </w:r>
-    </w:p>
-    <w:p>
-      <w:pPr>
-        <w:pStyle w:val="ListParagraph"/>
-        <w:numPr>
-          <w:ilvl w:val="0"/>
-          <w:numId w:val="3"/>
-        </w:numPr>
-        <w:spacing w:after="80"/>
-      </w:pPr>
-      <w:r>
-        <w:rPr>
-          <w:rFonts w:ascii="DejaVu Sans" w:cs="DejaVu Sans" w:eastAsia="DejaVu Sans" w:hAnsi="DejaVu Sans"/>
-          <w:b w:val="false"/>
-          <w:bCs w:val="false"/>
-        </w:rPr>
-        <w:t xml:space="preserve">Якщо в документа є друкований варіант (чорно-білий), друкується саме він.</w:t>
+        <w:t xml:space="preserve">Modern</w:t>
+      </w:r>
+      <w:r>
+        <w:rPr>
+          <w:rFonts w:ascii="DejaVu Sans" w:cs="DejaVu Sans" w:eastAsia="DejaVu Sans" w:hAnsi="DejaVu Sans"/>
+          <w:b w:val="false"/>
+          <w:bCs w:val="false"/>
+        </w:rPr>
+        <w:t xml:space="preserve"> — зручні списки, пошук і таблиці. Таблицю можна зберегти як PDF.</w:t>
+      </w:r>
+    </w:p>
+    <w:p>
+      <w:pPr>
+        <w:pStyle w:val="ListParagraph"/>
+        <w:numPr>
+          <w:ilvl w:val="0"/>
+          <w:numId w:val="3"/>
+        </w:numPr>
+        <w:spacing w:after="80"/>
+      </w:pPr>
+      <w:r>
+        <w:rPr>
+          <w:rFonts w:ascii="DejaVu Sans" w:cs="DejaVu Sans" w:eastAsia="DejaVu Sans" w:hAnsi="DejaVu Sans"/>
+          <w:b/>
+          <w:bCs/>
+        </w:rPr>
+        <w:t xml:space="preserve">Classic</w:t>
+      </w:r>
+      <w:r>
+        <w:rPr>
+          <w:rFonts w:ascii="DejaVu Sans" w:cs="DejaVu Sans" w:eastAsia="DejaVu Sans" w:hAnsi="DejaVu Sans"/>
+          <w:b w:val="false"/>
+          <w:bCs w:val="false"/>
+        </w:rPr>
+        <w:t xml:space="preserve"> — все як у оригіналі на Windows: ті самі меню, сторінки й переходи.</w:t>
+      </w:r>
+    </w:p>
+    <w:p>
+      <w:pPr>
+        <w:pStyle w:val="ListParagraph"/>
+        <w:numPr>
+          <w:ilvl w:val="0"/>
+          <w:numId w:val="3"/>
+        </w:numPr>
+        <w:spacing w:after="80"/>
+      </w:pPr>
+      <w:r>
+        <w:rPr>
+          <w:rFonts w:ascii="DejaVu Sans" w:cs="DejaVu Sans" w:eastAsia="DejaVu Sans" w:hAnsi="DejaVu Sans"/>
+          <w:b w:val="false"/>
+          <w:bCs w:val="false"/>
+        </w:rPr>
+        <w:t xml:space="preserve">Якщо пункт ще не перенесено в Modern, застосунок відкриє його через Classic.</w:t>
+      </w:r>
+    </w:p>
+    <w:p>
+      <w:pPr>
+        <w:pStyle w:val="ListParagraph"/>
+        <w:numPr>
+          <w:ilvl w:val="0"/>
+          <w:numId w:val="3"/>
+        </w:numPr>
+        <w:spacing w:after="80"/>
+      </w:pPr>
+      <w:r>
+        <w:rPr>
+          <w:rFonts w:ascii="DejaVu Sans" w:cs="DejaVu Sans" w:eastAsia="DejaVu Sans" w:hAnsi="DejaVu Sans"/>
+          <w:b/>
+          <w:bCs/>
+        </w:rPr>
+        <w:t xml:space="preserve">Зелена рамка</w:t>
+      </w:r>
+      <w:r>
+        <w:rPr>
+          <w:rFonts w:ascii="DejaVu Sans" w:cs="DejaVu Sans" w:eastAsia="DejaVu Sans" w:hAnsi="DejaVu Sans"/>
+          <w:b w:val="false"/>
+          <w:bCs w:val="false"/>
+        </w:rPr>
+        <w:t xml:space="preserve"> — де вибираєш зі списку, вибране обведене зеленим: відкрита вкладка, схема, розʼєм, останній розділ. Рамка лишається після «Назад» і повороту екрана, поки працює застосунок.</w:t>
+      </w:r>
+    </w:p>
+    <w:p>
+      <w:pPr>
+        <w:pStyle w:val="ListParagraph"/>
+        <w:numPr>
+          <w:ilvl w:val="0"/>
+          <w:numId w:val="3"/>
+        </w:numPr>
+        <w:spacing w:after="80"/>
+      </w:pPr>
+      <w:r>
+        <w:rPr>
+          <w:rFonts w:ascii="DejaVu Sans" w:cs="DejaVu Sans" w:eastAsia="DejaVu Sans" w:hAnsi="DejaVu Sans"/>
+          <w:b/>
+          <w:bCs/>
+        </w:rPr>
+        <w:t xml:space="preserve">«Критерії / скорочення»</w:t>
+      </w:r>
+      <w:r>
+        <w:rPr>
+          <w:rFonts w:ascii="DejaVu Sans" w:cs="DejaVu Sans" w:eastAsia="DejaVu Sans" w:hAnsi="DejaVu Sans"/>
+          <w:b w:val="false"/>
+          <w:bCs w:val="false"/>
+        </w:rPr>
+        <w:t xml:space="preserve"> закріплені під меню розділу. Дотик відкриває таблицю скорочень поверх списку; ✕ або «Назад» закривають її, список не зрушує.</w:t>
+      </w:r>
+    </w:p>
+    <w:p>
+      <w:pPr>
+        <w:pStyle w:val="ListParagraph"/>
+        <w:numPr>
+          <w:ilvl w:val="0"/>
+          <w:numId w:val="3"/>
+        </w:numPr>
+        <w:spacing w:after="80"/>
+      </w:pPr>
+      <w:r>
+        <w:rPr>
+          <w:rFonts w:ascii="DejaVu Sans" w:cs="DejaVu Sans" w:eastAsia="DejaVu Sans" w:hAnsi="DejaVu Sans"/>
+          <w:b/>
+          <w:bCs/>
+        </w:rPr>
+        <w:t xml:space="preserve">Картка «ВИБРАНО»</w:t>
+      </w:r>
+      <w:r>
+        <w:rPr>
+          <w:rFonts w:ascii="DejaVu Sans" w:cs="DejaVu Sans" w:eastAsia="DejaVu Sans" w:hAnsi="DejaVu Sans"/>
+          <w:b w:val="false"/>
+          <w:bCs w:val="false"/>
+        </w:rPr>
+        <w:t xml:space="preserve"> — вибраний розʼєм і його документи («Схема + піни», «Схема розʼєму», «Опис контактів») стоять над списком. «Опис контактів» сам прокручує до таблиці.</w:t>
+      </w:r>
+    </w:p>
+    <w:p>
+      <w:pPr>
+        <w:pStyle w:val="ListParagraph"/>
+        <w:numPr>
+          <w:ilvl w:val="0"/>
+          <w:numId w:val="3"/>
+        </w:numPr>
+        <w:spacing w:after="80"/>
+      </w:pPr>
+      <w:r>
+        <w:rPr>
+          <w:rFonts w:ascii="DejaVu Sans" w:cs="DejaVu Sans" w:eastAsia="DejaVu Sans" w:hAnsi="DejaVu Sans"/>
+          <w:b w:val="false"/>
+          <w:bCs w:val="false"/>
+        </w:rPr>
+        <w:t xml:space="preserve">Кнопка «⇩ PDF» зберігає оригінальний PDF у вибрану папку.</w:t>
       </w:r>
     </w:p>
     <w:p>
@@ -1121,7 +1128,7 @@
         <w:rPr>
           <w:rFonts w:ascii="DejaVu Sans" w:cs="DejaVu Sans" w:eastAsia="DejaVu Sans" w:hAnsi="DejaVu Sans"/>
         </w:rPr>
-        <w:t xml:space="preserve">Друге вікно «Документація поруч»</w:t>
+        <w:t xml:space="preserve">PDF, масштаб і друк</w:t>
       </w:r>
     </w:p>
     <w:p>
@@ -1134,7 +1141,7 @@
           <w:b w:val="false"/>
           <w:bCs w:val="false"/>
         </w:rPr>
-        <w:t xml:space="preserve">Кнопка ◫ у панелі PDF відкриває друге вікно знизу. Верхній документ лишається, а знизу можна відкрити будь-який інший документ цього тому — так зверху і знизу стоять два різні документи.</w:t>
+        <w:t xml:space="preserve">Схеми PDF відкриваються у вбудованому переглядачі. Панель кнопок угорі однакового розміру скрізь: на окремому екрані, у «Схема + піни» і в другому вікні.</w:t>
       </w:r>
     </w:p>
     <w:p>
@@ -1145,7 +1152,7 @@
       <w:r>
         <w:drawing>
           <wp:inline distT="0" distB="0" distL="0" distR="0">
-            <wp:extent cx="5715000" cy="3609975"/>
+            <wp:extent cx="5715000" cy="3067050"/>
             <wp:effectExtent t="0" r="0" b="0" l="0"/>
             <wp:docPr id="1" name="" descr="" title=""/>
             <wp:cNvGraphicFramePr>
@@ -1170,7 +1177,7 @@
                   <pic:spPr bwMode="auto">
                     <a:xfrm>
                       <a:off x="0" y="0"/>
-                      <a:ext cx="5715000" cy="3609975"/>
+                      <a:ext cx="5715000" cy="3067050"/>
                     </a:xfrm>
                     <a:prstGeom prst="rect">
                       <a:avLst/>
@@ -1198,79 +1205,77 @@
           <w:b w:val="false"/>
           <w:bCs w:val="false"/>
         </w:rPr>
-        <w:t xml:space="preserve">«←» у другому вікні — крок назад по ланцюжку: документ → розділ → том → закрити.</w:t>
-      </w:r>
-    </w:p>
-    <w:p>
-      <w:pPr>
-        <w:pStyle w:val="ListParagraph"/>
-        <w:numPr>
-          <w:ilvl w:val="0"/>
-          <w:numId w:val="3"/>
-        </w:numPr>
-        <w:spacing w:after="80"/>
-      </w:pPr>
-      <w:r>
-        <w:rPr>
-          <w:rFonts w:ascii="DejaVu Sans" w:cs="DejaVu Sans" w:eastAsia="DejaVu Sans" w:hAnsi="DejaVu Sans"/>
-          <w:b w:val="false"/>
-          <w:bCs w:val="false"/>
-        </w:rPr>
-        <w:t xml:space="preserve">Вкладки розділу міняють одна одну, тож «←» з розділу веде одразу в том.</w:t>
-      </w:r>
-    </w:p>
-    <w:p>
-      <w:pPr>
-        <w:pStyle w:val="ListParagraph"/>
-        <w:numPr>
-          <w:ilvl w:val="0"/>
-          <w:numId w:val="3"/>
-        </w:numPr>
-        <w:spacing w:after="80"/>
-      </w:pPr>
-      <w:r>
-        <w:rPr>
-          <w:rFonts w:ascii="DejaVu Sans" w:cs="DejaVu Sans" w:eastAsia="DejaVu Sans" w:hAnsi="DejaVu Sans"/>
-          <w:b w:val="false"/>
-          <w:bCs w:val="false"/>
-        </w:rPr>
-        <w:t xml:space="preserve">Таблиці («Опис контактів», «Критерії / скорочення») показуються прямо в другому вікні.</w:t>
-      </w:r>
-    </w:p>
-    <w:p>
-      <w:pPr>
-        <w:pStyle w:val="ListParagraph"/>
-        <w:numPr>
-          <w:ilvl w:val="0"/>
-          <w:numId w:val="3"/>
-        </w:numPr>
-        <w:spacing w:after="80"/>
-      </w:pPr>
-      <w:r>
-        <w:rPr>
-          <w:rFonts w:ascii="DejaVu Sans" w:cs="DejaVu Sans" w:eastAsia="DejaVu Sans" w:hAnsi="DejaVu Sans"/>
-          <w:b w:val="false"/>
-          <w:bCs w:val="false"/>
-        </w:rPr>
-        <w:t xml:space="preserve">Останнє відкрите на кожному кроці — у зеленій рамці.</w:t>
-      </w:r>
-    </w:p>
-    <w:p>
-      <w:pPr>
-        <w:pStyle w:val="ListParagraph"/>
-        <w:numPr>
-          <w:ilvl w:val="0"/>
-          <w:numId w:val="3"/>
-        </w:numPr>
-        <w:spacing w:after="80"/>
-      </w:pPr>
-      <w:r>
-        <w:rPr>
-          <w:rFonts w:ascii="DejaVu Sans" w:cs="DejaVu Sans" w:eastAsia="DejaVu Sans" w:hAnsi="DejaVu Sans"/>
-          <w:b w:val="false"/>
-          <w:bCs w:val="false"/>
-        </w:rPr>
-        <w:t xml:space="preserve">Межу між вікнами можна посунути.</w:t>
+        <w:t xml:space="preserve">Меню ▾ біля відсотків має кроки аж до 450% і 500%.</w:t>
+      </w:r>
+    </w:p>
+    <w:p>
+      <w:pPr>
+        <w:pStyle w:val="ListParagraph"/>
+        <w:numPr>
+          <w:ilvl w:val="0"/>
+          <w:numId w:val="3"/>
+        </w:numPr>
+        <w:spacing w:after="80"/>
+      </w:pPr>
+      <w:r>
+        <w:rPr>
+          <w:rFonts w:ascii="DejaVu Sans" w:cs="DejaVu Sans" w:eastAsia="DejaVu Sans" w:hAnsi="DejaVu Sans"/>
+          <w:b w:val="false"/>
+          <w:bCs w:val="false"/>
+        </w:rPr>
+        <w:t xml:space="preserve">На «Схема + піни» сама сторінка не масштабується — збільшується кожен документ окремо, нижній не зникає.</w:t>
+      </w:r>
+    </w:p>
+    <w:p>
+      <w:pPr>
+        <w:pStyle w:val="ListParagraph"/>
+        <w:numPr>
+          <w:ilvl w:val="0"/>
+          <w:numId w:val="3"/>
+        </w:numPr>
+        <w:spacing w:after="80"/>
+      </w:pPr>
+      <w:r>
+        <w:rPr>
+          <w:rFonts w:ascii="DejaVu Sans" w:cs="DejaVu Sans" w:eastAsia="DejaVu Sans" w:hAnsi="DejaVu Sans"/>
+          <w:b w:val="false"/>
+          <w:bCs w:val="false"/>
+        </w:rPr>
+        <w:t xml:space="preserve">Друк — лише через </w:t>
+      </w:r>
+      <w:r>
+        <w:rPr>
+          <w:rFonts w:ascii="DejaVu Sans" w:cs="DejaVu Sans" w:eastAsia="DejaVu Sans" w:hAnsi="DejaVu Sans"/>
+          <w:b/>
+          <w:bCs/>
+        </w:rPr>
+        <w:t xml:space="preserve">оригінальний значок принтера</w:t>
+      </w:r>
+      <w:r>
+        <w:rPr>
+          <w:rFonts w:ascii="DejaVu Sans" w:cs="DejaVu Sans" w:eastAsia="DejaVu Sans" w:hAnsi="DejaVu Sans"/>
+          <w:b w:val="false"/>
+          <w:bCs w:val="false"/>
+        </w:rPr>
+        <w:t xml:space="preserve"> Renault на документі. Окремих кнопок «Друк» застосунок не додає.</w:t>
+      </w:r>
+    </w:p>
+    <w:p>
+      <w:pPr>
+        <w:pStyle w:val="ListParagraph"/>
+        <w:numPr>
+          <w:ilvl w:val="0"/>
+          <w:numId w:val="3"/>
+        </w:numPr>
+        <w:spacing w:after="80"/>
+      </w:pPr>
+      <w:r>
+        <w:rPr>
+          <w:rFonts w:ascii="DejaVu Sans" w:cs="DejaVu Sans" w:eastAsia="DejaVu Sans" w:hAnsi="DejaVu Sans"/>
+          <w:b w:val="false"/>
+          <w:bCs w:val="false"/>
+        </w:rPr>
+        <w:t xml:space="preserve">Якщо в документа є друкований варіант (чорно-білий), друкується саме він.</w:t>
       </w:r>
     </w:p>
     <w:p>
@@ -1286,7 +1291,7 @@
         <w:rPr>
           <w:rFonts w:ascii="DejaVu Sans" w:cs="DejaVu Sans" w:eastAsia="DejaVu Sans" w:hAnsi="DejaVu Sans"/>
         </w:rPr>
-        <w:t xml:space="preserve">Як поділитися</w:t>
+        <w:t xml:space="preserve">Друге вікно «Документація поруч»</w:t>
       </w:r>
     </w:p>
     <w:p>
@@ -1299,7 +1304,7 @@
           <w:b w:val="false"/>
           <w:bCs w:val="false"/>
         </w:rPr>
-        <w:t xml:space="preserve">Є три способи — залежно від того, скільки томів потрібно передати.</w:t>
+        <w:t xml:space="preserve">Кнопка ◫ у панелі PDF відкриває друге вікно знизу. Верхній документ лишається, а знизу можна відкрити будь-який інший документ цього тому — так зверху і знизу стоять два різні документи.</w:t>
       </w:r>
     </w:p>
     <w:p>
@@ -1310,7 +1315,7 @@
       <w:r>
         <w:drawing>
           <wp:inline distT="0" distB="0" distL="0" distR="0">
-            <wp:extent cx="5715000" cy="2495550"/>
+            <wp:extent cx="5715000" cy="3609975"/>
             <wp:effectExtent t="0" r="0" b="0" l="0"/>
             <wp:docPr id="1" name="" descr="" title=""/>
             <wp:cNvGraphicFramePr>
@@ -1335,7 +1340,7 @@
                   <pic:spPr bwMode="auto">
                     <a:xfrm>
                       <a:off x="0" y="0"/>
-                      <a:ext cx="5715000" cy="2495550"/>
+                      <a:ext cx="5715000" cy="3609975"/>
                     </a:xfrm>
                     <a:prstGeom prst="rect">
                       <a:avLst/>
@@ -1360,72 +1365,82 @@
       <w:r>
         <w:rPr>
           <w:rFonts w:ascii="DejaVu Sans" w:cs="DejaVu Sans" w:eastAsia="DejaVu Sans" w:hAnsi="DejaVu Sans"/>
-          <w:b/>
-          <w:bCs/>
-        </w:rPr>
-        <w:t xml:space="preserve">Правило ⇧:</w:t>
-      </w:r>
-      <w:r>
-        <w:rPr>
-          <w:rFonts w:ascii="DejaVu Sans" w:cs="DejaVu Sans" w:eastAsia="DejaVu Sans" w:hAnsi="DejaVu Sans"/>
-          <w:b w:val="false"/>
-          <w:bCs w:val="false"/>
-        </w:rPr>
-        <w:t xml:space="preserve"> один підготовлений файл на том і на проєкт. Щоб зробити новий — спершу видали старий через ⋮.</w:t>
-      </w:r>
-    </w:p>
-    <w:p>
-      <w:pPr>
-        <w:pStyle w:val="ListParagraph"/>
-        <w:numPr>
-          <w:ilvl w:val="0"/>
-          <w:numId w:val="3"/>
-        </w:numPr>
-        <w:spacing w:after="80"/>
-      </w:pPr>
-      <w:r>
-        <w:rPr>
-          <w:rFonts w:ascii="DejaVu Sans" w:cs="DejaVu Sans" w:eastAsia="DejaVu Sans" w:hAnsi="DejaVu Sans"/>
-          <w:b w:val="false"/>
-          <w:bCs w:val="false"/>
-        </w:rPr>
-        <w:t xml:space="preserve">Ще один шлях для одного тому: ⋮ тому → «Експортувати .rdpkg» → вибрати, куди зберегти.</w:t>
-      </w:r>
-    </w:p>
-    <w:p>
-      <w:pPr>
-        <w:pStyle w:val="ListParagraph"/>
-        <w:numPr>
-          <w:ilvl w:val="0"/>
-          <w:numId w:val="3"/>
-        </w:numPr>
-        <w:spacing w:after="80"/>
-      </w:pPr>
-      <w:r>
-        <w:rPr>
-          <w:rFonts w:ascii="DejaVu Sans" w:cs="DejaVu Sans" w:eastAsia="DejaVu Sans" w:hAnsi="DejaVu Sans"/>
-          <w:b w:val="false"/>
-          <w:bCs w:val="false"/>
-        </w:rPr>
-        <w:t xml:space="preserve">Однойменні файли в папці не перезаписуються.</w:t>
-      </w:r>
-    </w:p>
-    <w:p>
-      <w:pPr>
-        <w:pBdr>
-          <w:left w:val="single" w:color="8A5A12" w:sz="18" w:space="8"/>
-        </w:pBdr>
-        <w:shd w:fill="FBF1DF" w:color="auto" w:val="clear"/>
-        <w:spacing w:after="160" w:before="120"/>
-      </w:pPr>
-      <w:r>
-        <w:rPr>
-          <w:rFonts w:ascii="DejaVu Sans" w:cs="DejaVu Sans" w:eastAsia="DejaVu Sans" w:hAnsi="DejaVu Sans"/>
-          <w:b/>
-          <w:bCs/>
-          <w:color w:val="8A5A12"/>
-        </w:rPr>
-        <w:t xml:space="preserve">Файл .rdproject поки можна лише відправити. Відкрити його в застосунку на іншому телефоні ще не можна — це в плані. Для передачі краще томи .rdpkg: їх застосунок відкриває через «Авто».</w:t>
+          <w:b w:val="false"/>
+          <w:bCs w:val="false"/>
+        </w:rPr>
+        <w:t xml:space="preserve">«←» у другому вікні — крок назад по ланцюжку: документ → розділ → том → закрити.</w:t>
+      </w:r>
+    </w:p>
+    <w:p>
+      <w:pPr>
+        <w:pStyle w:val="ListParagraph"/>
+        <w:numPr>
+          <w:ilvl w:val="0"/>
+          <w:numId w:val="3"/>
+        </w:numPr>
+        <w:spacing w:after="80"/>
+      </w:pPr>
+      <w:r>
+        <w:rPr>
+          <w:rFonts w:ascii="DejaVu Sans" w:cs="DejaVu Sans" w:eastAsia="DejaVu Sans" w:hAnsi="DejaVu Sans"/>
+          <w:b w:val="false"/>
+          <w:bCs w:val="false"/>
+        </w:rPr>
+        <w:t xml:space="preserve">Вкладки розділу міняють одна одну, тож «←» з розділу веде одразу в том.</w:t>
+      </w:r>
+    </w:p>
+    <w:p>
+      <w:pPr>
+        <w:pStyle w:val="ListParagraph"/>
+        <w:numPr>
+          <w:ilvl w:val="0"/>
+          <w:numId w:val="3"/>
+        </w:numPr>
+        <w:spacing w:after="80"/>
+      </w:pPr>
+      <w:r>
+        <w:rPr>
+          <w:rFonts w:ascii="DejaVu Sans" w:cs="DejaVu Sans" w:eastAsia="DejaVu Sans" w:hAnsi="DejaVu Sans"/>
+          <w:b w:val="false"/>
+          <w:bCs w:val="false"/>
+        </w:rPr>
+        <w:t xml:space="preserve">Таблиці («Опис контактів», «Критерії / скорочення») показуються прямо в другому вікні.</w:t>
+      </w:r>
+    </w:p>
+    <w:p>
+      <w:pPr>
+        <w:pStyle w:val="ListParagraph"/>
+        <w:numPr>
+          <w:ilvl w:val="0"/>
+          <w:numId w:val="3"/>
+        </w:numPr>
+        <w:spacing w:after="80"/>
+      </w:pPr>
+      <w:r>
+        <w:rPr>
+          <w:rFonts w:ascii="DejaVu Sans" w:cs="DejaVu Sans" w:eastAsia="DejaVu Sans" w:hAnsi="DejaVu Sans"/>
+          <w:b w:val="false"/>
+          <w:bCs w:val="false"/>
+        </w:rPr>
+        <w:t xml:space="preserve">Останнє відкрите на кожному кроці — у зеленій рамці.</w:t>
+      </w:r>
+    </w:p>
+    <w:p>
+      <w:pPr>
+        <w:pStyle w:val="ListParagraph"/>
+        <w:numPr>
+          <w:ilvl w:val="0"/>
+          <w:numId w:val="3"/>
+        </w:numPr>
+        <w:spacing w:after="80"/>
+      </w:pPr>
+      <w:r>
+        <w:rPr>
+          <w:rFonts w:ascii="DejaVu Sans" w:cs="DejaVu Sans" w:eastAsia="DejaVu Sans" w:hAnsi="DejaVu Sans"/>
+          <w:b w:val="false"/>
+          <w:bCs w:val="false"/>
+        </w:rPr>
+        <w:t xml:space="preserve">Межу між вікнами можна посунути.</w:t>
       </w:r>
     </w:p>
     <w:p>
@@ -1441,7 +1456,7 @@
         <w:rPr>
           <w:rFonts w:ascii="DejaVu Sans" w:cs="DejaVu Sans" w:eastAsia="DejaVu Sans" w:hAnsi="DejaVu Sans"/>
         </w:rPr>
-        <w:t xml:space="preserve">Довгі операції і «Скасувати»</w:t>
+        <w:t xml:space="preserve">Як поділитися</w:t>
       </w:r>
     </w:p>
     <w:p>
@@ -1454,7 +1469,7 @@
           <w:b w:val="false"/>
           <w:bCs w:val="false"/>
         </w:rPr>
-        <w:t xml:space="preserve">Підготовка, експорт, імпорт і створення тому йдуть у фоні. Застосунок можна згорнути, прогрес видно у шторці. На екрані — картка з зеленою смугою.</w:t>
+        <w:t xml:space="preserve">Є три способи — залежно від того, скільки томів потрібно передати.</w:t>
       </w:r>
     </w:p>
     <w:p>
@@ -1465,7 +1480,7 @@
       <w:r>
         <w:drawing>
           <wp:inline distT="0" distB="0" distL="0" distR="0">
-            <wp:extent cx="5715000" cy="2800350"/>
+            <wp:extent cx="5715000" cy="2495550"/>
             <wp:effectExtent t="0" r="0" b="0" l="0"/>
             <wp:docPr id="1" name="" descr="" title=""/>
             <wp:cNvGraphicFramePr>
@@ -1490,6 +1505,223 @@
                   <pic:spPr bwMode="auto">
                     <a:xfrm>
                       <a:off x="0" y="0"/>
+                      <a:ext cx="5715000" cy="2495550"/>
+                    </a:xfrm>
+                    <a:prstGeom prst="rect">
+                      <a:avLst/>
+                    </a:prstGeom>
+                  </pic:spPr>
+                </pic:pic>
+              </a:graphicData>
+            </a:graphic>
+          </wp:inline>
+        </w:drawing>
+      </w:r>
+    </w:p>
+    <w:p>
+      <w:pPr>
+        <w:pStyle w:val="ListParagraph"/>
+        <w:numPr>
+          <w:ilvl w:val="0"/>
+          <w:numId w:val="3"/>
+        </w:numPr>
+        <w:spacing w:after="80"/>
+      </w:pPr>
+      <w:r>
+        <w:rPr>
+          <w:rFonts w:ascii="DejaVu Sans" w:cs="DejaVu Sans" w:eastAsia="DejaVu Sans" w:hAnsi="DejaVu Sans"/>
+          <w:b/>
+          <w:bCs/>
+        </w:rPr>
+        <w:t xml:space="preserve">Правило ⇧:</w:t>
+      </w:r>
+      <w:r>
+        <w:rPr>
+          <w:rFonts w:ascii="DejaVu Sans" w:cs="DejaVu Sans" w:eastAsia="DejaVu Sans" w:hAnsi="DejaVu Sans"/>
+          <w:b w:val="false"/>
+          <w:bCs w:val="false"/>
+        </w:rPr>
+        <w:t xml:space="preserve"> один підготовлений файл на том і на проєкт. Щоб зробити новий — спершу видали старий через ⋮.</w:t>
+      </w:r>
+    </w:p>
+    <w:p>
+      <w:pPr>
+        <w:pStyle w:val="ListParagraph"/>
+        <w:numPr>
+          <w:ilvl w:val="0"/>
+          <w:numId w:val="3"/>
+        </w:numPr>
+        <w:spacing w:after="80"/>
+      </w:pPr>
+      <w:r>
+        <w:rPr>
+          <w:rFonts w:ascii="DejaVu Sans" w:cs="DejaVu Sans" w:eastAsia="DejaVu Sans" w:hAnsi="DejaVu Sans"/>
+          <w:b w:val="false"/>
+          <w:bCs w:val="false"/>
+        </w:rPr>
+        <w:t xml:space="preserve">Ще один шлях для одного тому: ⋮ тому → «Експортувати .rdpkg» → вибрати, куди зберегти.</w:t>
+      </w:r>
+    </w:p>
+    <w:p>
+      <w:pPr>
+        <w:pStyle w:val="ListParagraph"/>
+        <w:numPr>
+          <w:ilvl w:val="0"/>
+          <w:numId w:val="3"/>
+        </w:numPr>
+        <w:spacing w:after="80"/>
+      </w:pPr>
+      <w:r>
+        <w:rPr>
+          <w:rFonts w:ascii="DejaVu Sans" w:cs="DejaVu Sans" w:eastAsia="DejaVu Sans" w:hAnsi="DejaVu Sans"/>
+          <w:b w:val="false"/>
+          <w:bCs w:val="false"/>
+        </w:rPr>
+        <w:t xml:space="preserve">Однойменні файли в папці не перезаписуються. Файл, який уже лежить у папці, застосунок звіряє за SHA-256: якщо збігся — пише «уже був», не копіює вдруге.</w:t>
+      </w:r>
+    </w:p>
+    <w:p>
+      <w:pPr>
+        <w:pStyle w:val="ListParagraph"/>
+        <w:numPr>
+          <w:ilvl w:val="0"/>
+          <w:numId w:val="3"/>
+        </w:numPr>
+        <w:spacing w:after="80"/>
+      </w:pPr>
+      <w:r>
+        <w:rPr>
+          <w:rFonts w:ascii="DejaVu Sans" w:cs="DejaVu Sans" w:eastAsia="DejaVu Sans" w:hAnsi="DejaVu Sans"/>
+          <w:b/>
+          <w:bCs/>
+        </w:rPr>
+        <w:t xml:space="preserve">«Вибрати лише нові для каталогу»</w:t>
+      </w:r>
+      <w:r>
+        <w:rPr>
+          <w:rFonts w:ascii="DejaVu Sans" w:cs="DejaVu Sans" w:eastAsia="DejaVu Sans" w:hAnsi="DejaVu Sans"/>
+          <w:b w:val="false"/>
+          <w:bCs w:val="false"/>
+        </w:rPr>
+        <w:t xml:space="preserve"> у кроці 1 сам ставить галочки на томи, яких ще нема в «Готові проєкти».</w:t>
+      </w:r>
+    </w:p>
+    <w:p>
+      <w:pPr>
+        <w:pStyle w:val="ListParagraph"/>
+        <w:numPr>
+          <w:ilvl w:val="0"/>
+          <w:numId w:val="3"/>
+        </w:numPr>
+        <w:spacing w:after="80"/>
+      </w:pPr>
+      <w:r>
+        <w:rPr>
+          <w:rFonts w:ascii="DejaVu Sans" w:cs="DejaVu Sans" w:eastAsia="DejaVu Sans" w:hAnsi="DejaVu Sans"/>
+          <w:b w:val="false"/>
+          <w:bCs w:val="false"/>
+        </w:rPr>
+        <w:t xml:space="preserve">На кроках 2 і 3 видно назву вибраної папки. У кінці в папку пишеться короткий JSON-звіт — навіть якщо щось не вдалося.</w:t>
+      </w:r>
+    </w:p>
+    <w:p>
+      <w:pPr>
+        <w:pBdr>
+          <w:left w:val="single" w:color="8A5A12" w:sz="18" w:space="8"/>
+        </w:pBdr>
+        <w:shd w:fill="FBF1DF" w:color="auto" w:val="clear"/>
+        <w:spacing w:after="160" w:before="120"/>
+      </w:pPr>
+      <w:r>
+        <w:rPr>
+          <w:rFonts w:ascii="DejaVu Sans" w:cs="DejaVu Sans" w:eastAsia="DejaVu Sans" w:hAnsi="DejaVu Sans"/>
+          <w:b/>
+          <w:bCs/>
+          <w:color w:val="8A5A12"/>
+        </w:rPr>
+        <w:t xml:space="preserve">Порада: експортуй томи в папку на телефоні, а на Google Диск вивантаж їх кнопкою «+» у застосунку Диск. Якщо одразу вибрати папку Диска, файли бере застосунок Диск і вивантажує сам — великі томи можуть годинами висіти в його черзі.</w:t>
+      </w:r>
+    </w:p>
+    <w:p>
+      <w:pPr>
+        <w:pBdr>
+          <w:left w:val="single" w:color="8A5A12" w:sz="18" w:space="8"/>
+        </w:pBdr>
+        <w:shd w:fill="FBF1DF" w:color="auto" w:val="clear"/>
+        <w:spacing w:after="160" w:before="120"/>
+      </w:pPr>
+      <w:r>
+        <w:rPr>
+          <w:rFonts w:ascii="DejaVu Sans" w:cs="DejaVu Sans" w:eastAsia="DejaVu Sans" w:hAnsi="DejaVu Sans"/>
+          <w:b/>
+          <w:bCs/>
+          <w:color w:val="8A5A12"/>
+        </w:rPr>
+        <w:t xml:space="preserve">Файл .rdproject поки можна лише відправити. Відкрити його в застосунку на іншому телефоні ще не можна — це в плані. Для передачі краще томи .rdpkg: їх застосунок відкриває через «Авто».</w:t>
+      </w:r>
+    </w:p>
+    <w:p>
+      <w:r>
+        <w:br w:type="page"/>
+      </w:r>
+    </w:p>
+    <w:p>
+      <w:pPr>
+        <w:pStyle w:val="Heading1"/>
+      </w:pPr>
+      <w:r>
+        <w:rPr>
+          <w:rFonts w:ascii="DejaVu Sans" w:cs="DejaVu Sans" w:eastAsia="DejaVu Sans" w:hAnsi="DejaVu Sans"/>
+        </w:rPr>
+        <w:t xml:space="preserve">Довгі операції і «Скасувати»</w:t>
+      </w:r>
+    </w:p>
+    <w:p>
+      <w:pPr>
+        <w:spacing w:after="140"/>
+      </w:pPr>
+      <w:r>
+        <w:rPr>
+          <w:rFonts w:ascii="DejaVu Sans" w:cs="DejaVu Sans" w:eastAsia="DejaVu Sans" w:hAnsi="DejaVu Sans"/>
+          <w:b w:val="false"/>
+          <w:bCs w:val="false"/>
+        </w:rPr>
+        <w:t xml:space="preserve">Підготовка, експорт, імпорт і створення тому йдуть у фоні. Застосунок можна згорнути, прогрес видно у шторці. На екрані — картка з зеленою смугою.</w:t>
+      </w:r>
+    </w:p>
+    <w:p>
+      <w:pPr>
+        <w:spacing w:after="160" w:before="120" w:line="240" w:lineRule="auto"/>
+        <w:jc w:val="center"/>
+      </w:pPr>
+      <w:r>
+        <w:drawing>
+          <wp:inline distT="0" distB="0" distL="0" distR="0">
+            <wp:extent cx="5715000" cy="2800350"/>
+            <wp:effectExtent t="0" r="0" b="0" l="0"/>
+            <wp:docPr id="1" name="" descr="" title=""/>
+            <wp:cNvGraphicFramePr>
+              <a:graphicFrameLocks xmlns:a="http://schemas.openxmlformats.org/drawingml/2006/main" noChangeAspect="1"/>
+            </wp:cNvGraphicFramePr>
+            <a:graphic xmlns:a="http://schemas.openxmlformats.org/drawingml/2006/main">
+              <a:graphicData uri="http://schemas.openxmlformats.org/drawingml/2006/picture">
+                <pic:pic xmlns:pic="http://schemas.openxmlformats.org/drawingml/2006/picture">
+                  <pic:nvPicPr>
+                    <pic:cNvPr id="0" name="" descr=""/>
+                    <pic:cNvPicPr>
+                      <a:picLocks noChangeAspect="1" noChangeArrowheads="1"/>
+                    </pic:cNvPicPr>
+                  </pic:nvPicPr>
+                  <pic:blipFill>
+                    <a:blip r:embed="rId16" cstate="none"/>
+                    <a:srcRect/>
+                    <a:stretch>
+                      <a:fillRect/>
+                    </a:stretch>
+                  </pic:blipFill>
+                  <pic:spPr bwMode="auto">
+                    <a:xfrm>
+                      <a:off x="0" y="0"/>
                       <a:ext cx="5715000" cy="2800350"/>
                     </a:xfrm>
                     <a:prstGeom prst="rect">
@@ -1576,6 +1808,24 @@
       </w:r>
     </w:p>
     <w:p>
+      <w:pPr>
+        <w:pStyle w:val="ListParagraph"/>
+        <w:numPr>
+          <w:ilvl w:val="0"/>
+          <w:numId w:val="3"/>
+        </w:numPr>
+        <w:spacing w:after="80"/>
+      </w:pPr>
+      <w:r>
+        <w:rPr>
+          <w:rFonts w:ascii="DejaVu Sans" w:cs="DejaVu Sans" w:eastAsia="DejaVu Sans" w:hAnsi="DejaVu Sans"/>
+          <w:b w:val="false"/>
+          <w:bCs w:val="false"/>
+        </w:rPr>
+        <w:t xml:space="preserve">Коли операція завершилась або сталася помилка — шторка подає звук. Прогрес і «скасовано» — тихо.</w:t>
+      </w:r>
+    </w:p>
+    <w:p>
       <w:r>
         <w:br w:type="page"/>
       </w:r>
@@ -1679,6 +1929,24 @@
           <w:bCs w:val="false"/>
         </w:rPr>
         <w:t xml:space="preserve">Зміни зберігаються автоматично.</w:t>
+      </w:r>
+    </w:p>
+    <w:p>
+      <w:pPr>
+        <w:pStyle w:val="ListParagraph"/>
+        <w:numPr>
+          <w:ilvl w:val="0"/>
+          <w:numId w:val="3"/>
+        </w:numPr>
+        <w:spacing w:after="80"/>
+      </w:pPr>
+      <w:r>
+        <w:rPr>
+          <w:rFonts w:ascii="DejaVu Sans" w:cs="DejaVu Sans" w:eastAsia="DejaVu Sans" w:hAnsi="DejaVu Sans"/>
+          <w:b w:val="false"/>
+          <w:bCs w:val="false"/>
+        </w:rPr>
+        <w:t xml:space="preserve">«Про програму» → «Інструкція користувача» — ця інструкція всередині застосунку, працює без інтернету.</w:t>
       </w:r>
     </w:p>
     <w:p>
@@ -1782,7 +2050,7 @@
           <w:sz w:val="18"/>
           <w:szCs w:val="18"/>
         </w:rPr>
-        <w:t xml:space="preserve">Посібник зібрано з коду застосунку v0.5.121. Якщо кнопка на телефоні називається інакше — правда за телефоном.</w:t>
+        <w:t xml:space="preserve">Посібник зібрано з коду застосунку v0.5.130. Якщо кнопка на телефоні називається інакше — правда за телефоном.</w:t>
       </w:r>
     </w:p>
     <w:sectPr>

</xml_diff>

<commit_message>
v0.5.131: system back on Android 16 (guide + 3 screens); settings tile gaps; nbsp after ✓
Co-Authored-By: Claude Opus 5.5 <noreply@anthropic.com>
Claude-Session: https://claude.ai/code/session_01VPquYZFFEbKUhD3JuP77cq
</commit_message>
<xml_diff>
--- a/docs/ua/Posibnyk-Renault-Docs.docx
+++ b/docs/ua/Posibnyk-Renault-Docs.docx
@@ -756,7 +756,7 @@
       <w:r>
         <w:drawing>
           <wp:inline distT="0" distB="0" distL="0" distR="0">
-            <wp:extent cx="4838700" cy="6858000"/>
+            <wp:extent cx="4781550" cy="6858000"/>
             <wp:effectExtent t="0" r="0" b="0" l="0"/>
             <wp:docPr id="1" name="" descr="" title=""/>
             <wp:cNvGraphicFramePr>
@@ -781,7 +781,7 @@
                   <pic:spPr bwMode="auto">
                     <a:xfrm>
                       <a:off x="0" y="0"/>
-                      <a:ext cx="4838700" cy="6858000"/>
+                      <a:ext cx="4781550" cy="6858000"/>
                     </a:xfrm>
                     <a:prstGeom prst="rect">
                       <a:avLst/>
@@ -827,7 +827,7 @@
           <w:b/>
           <w:bCs/>
         </w:rPr>
-        <w:t xml:space="preserve">«✓ Встановлено»</w:t>
+        <w:t xml:space="preserve">«✓ Встановлено»</w:t>
       </w:r>
       <w:r>
         <w:rPr>

</xml_diff>

<commit_message>
v0.5.131: system back on Android 16 (guide + 3 screens); settings tile gaps; nbsp after ✓ (#281)
Claude-Session: https://claude.ai/code/session_01VPquYZFFEbKUhD3JuP77cq

Co-authored-by: Claude <noreply@anthropic.com>
</commit_message>
<xml_diff>
--- a/docs/ua/Posibnyk-Renault-Docs.docx
+++ b/docs/ua/Posibnyk-Renault-Docs.docx
@@ -756,7 +756,7 @@
       <w:r>
         <w:drawing>
           <wp:inline distT="0" distB="0" distL="0" distR="0">
-            <wp:extent cx="4838700" cy="6858000"/>
+            <wp:extent cx="4781550" cy="6858000"/>
             <wp:effectExtent t="0" r="0" b="0" l="0"/>
             <wp:docPr id="1" name="" descr="" title=""/>
             <wp:cNvGraphicFramePr>
@@ -781,7 +781,7 @@
                   <pic:spPr bwMode="auto">
                     <a:xfrm>
                       <a:off x="0" y="0"/>
-                      <a:ext cx="4838700" cy="6858000"/>
+                      <a:ext cx="4781550" cy="6858000"/>
                     </a:xfrm>
                     <a:prstGeom prst="rect">
                       <a:avLst/>
@@ -827,7 +827,7 @@
           <w:b/>
           <w:bCs/>
         </w:rPr>
-        <w:t xml:space="preserve">«✓ Встановлено»</w:t>
+        <w:t xml:space="preserve">«✓ Встановлено»</w:t>
       </w:r>
       <w:r>
         <w:rPr>

</xml_diff>

<commit_message>
v0.5.132: import a whole project from one .rdproject file
Open the file from Telegram / Drive / file manager (VIEW, SEND) or
Home → «Додати» → «Проєкт із файлу». The screen reads only rdproject.json
(first ZIP entry), shows the project and marks volumes already on the
phone; «Імпортувати N томів» starts RdprojectImportService: one pass
through the file, each missing volume is copied to the app cache,
installed like a single .rdpkg (refuseExistingPackage — nothing is
replaced) and added to the project; the project is created only after
the first volume is installed. Cancel, low-space stop, dataSync timeout
and re-runs keep already added volumes.

Guide: new section «Проєкт із файлу (.rdproject)»; header names the
guide version («Інструкція користувача для Renault Docs vX»).

Co-Authored-By: Claude Opus 5.5 <noreply@anthropic.com>
Claude-Session: https://claude.ai/code/session_01PiZUSQLfX7wkAjucLrRTbR
</commit_message>
<xml_diff>
--- a/docs/ua/Posibnyk-Renault-Docs.docx
+++ b/docs/ua/Posibnyk-Renault-Docs.docx
@@ -13,7 +13,7 @@
           <w:sz w:val="18"/>
           <w:szCs w:val="18"/>
         </w:rPr>
-        <w:t xml:space="preserve">RENAULT DOCS · v0.5.130 · 14.10.2026</w:t>
+        <w:t xml:space="preserve">RENAULT DOCS · v0.5.132 · 14.10.2026</w:t>
       </w:r>
     </w:p>
     <w:p>
@@ -110,6 +110,21 @@
           <w:rFonts w:ascii="DejaVu Sans" w:cs="DejaVu Sans" w:eastAsia="DejaVu Sans" w:hAnsi="DejaVu Sans"/>
         </w:rPr>
         <w:t xml:space="preserve">Готові проєкти з Google Диска</w:t>
+      </w:r>
+    </w:p>
+    <w:p>
+      <w:pPr>
+        <w:pStyle w:val="ListParagraph"/>
+        <w:numPr>
+          <w:ilvl w:val="0"/>
+          <w:numId w:val="2"/>
+        </w:numPr>
+      </w:pPr>
+      <w:r>
+        <w:rPr>
+          <w:rFonts w:ascii="DejaVu Sans" w:cs="DejaVu Sans" w:eastAsia="DejaVu Sans" w:hAnsi="DejaVu Sans"/>
+        </w:rPr>
+        <w:t xml:space="preserve">Проєкт із файлу (.rdproject)</w:t>
       </w:r>
     </w:p>
     <w:p>
@@ -322,6 +337,32 @@
           <w:bCs w:val="false"/>
         </w:rPr>
         <w:t xml:space="preserve"> — файл одного тому. Його можна створити, отримати від когось або передати іншому.</w:t>
+      </w:r>
+    </w:p>
+    <w:p>
+      <w:pPr>
+        <w:pStyle w:val="ListParagraph"/>
+        <w:numPr>
+          <w:ilvl w:val="0"/>
+          <w:numId w:val="3"/>
+        </w:numPr>
+        <w:spacing w:after="80"/>
+      </w:pPr>
+      <w:r>
+        <w:rPr>
+          <w:rFonts w:ascii="DejaVu Sans" w:cs="DejaVu Sans" w:eastAsia="DejaVu Sans" w:hAnsi="DejaVu Sans"/>
+          <w:b/>
+          <w:bCs/>
+        </w:rPr>
+        <w:t xml:space="preserve">.rdproject</w:t>
+      </w:r>
+      <w:r>
+        <w:rPr>
+          <w:rFonts w:ascii="DejaVu Sans" w:cs="DejaVu Sans" w:eastAsia="DejaVu Sans" w:hAnsi="DejaVu Sans"/>
+          <w:b w:val="false"/>
+          <w:bCs w:val="false"/>
+        </w:rPr>
+        <w:t xml:space="preserve"> — весь проєкт одним файлом: усі томи разом. Його можна передати на інший телефон і там відкрити.</w:t>
       </w:r>
     </w:p>
     <w:p>
@@ -433,7 +474,7 @@
       <w:r>
         <w:drawing>
           <wp:inline distT="0" distB="0" distL="0" distR="0">
-            <wp:extent cx="5715000" cy="3009900"/>
+            <wp:extent cx="5715000" cy="3609975"/>
             <wp:effectExtent t="0" r="0" b="0" l="0"/>
             <wp:docPr id="1" name="" descr="" title=""/>
             <wp:cNvGraphicFramePr>
@@ -458,7 +499,7 @@
                   <pic:spPr bwMode="auto">
                     <a:xfrm>
                       <a:off x="0" y="0"/>
-                      <a:ext cx="5715000" cy="3009900"/>
+                      <a:ext cx="5715000" cy="3609975"/>
                     </a:xfrm>
                     <a:prstGeom prst="rect">
                       <a:avLst/>
@@ -887,7 +928,7 @@
         <w:rPr>
           <w:rFonts w:ascii="DejaVu Sans" w:cs="DejaVu Sans" w:eastAsia="DejaVu Sans" w:hAnsi="DejaVu Sans"/>
         </w:rPr>
-        <w:t xml:space="preserve">Як читати том</w:t>
+        <w:t xml:space="preserve">Проєкт із файлу (.rdproject)</w:t>
       </w:r>
     </w:p>
     <w:p>
@@ -900,7 +941,7 @@
           <w:b w:val="false"/>
           <w:bCs w:val="false"/>
         </w:rPr>
-        <w:t xml:space="preserve">Дотик по тому відкриває його в режимі, вибраному в налаштуваннях: Modern (стоїть спочатку) або Classic. Перемкнутися можна кнопками Modern / Classic вгорі.</w:t>
+        <w:t xml:space="preserve">Файл .rdproject робить ⋮ проєкту → «Поділитися проєктом одним файлом». На іншому телефоні його можна відкрити — застосунок додасть лише ті томи, яких там ще немає.</w:t>
       </w:r>
     </w:p>
     <w:p>
@@ -911,7 +952,7 @@
       <w:r>
         <w:drawing>
           <wp:inline distT="0" distB="0" distL="0" distR="0">
-            <wp:extent cx="5715000" cy="3238500"/>
+            <wp:extent cx="5553075" cy="6705600"/>
             <wp:effectExtent t="0" r="0" b="0" l="0"/>
             <wp:docPr id="1" name="" descr="" title=""/>
             <wp:cNvGraphicFramePr>
@@ -936,7 +977,7 @@
                   <pic:spPr bwMode="auto">
                     <a:xfrm>
                       <a:off x="0" y="0"/>
-                      <a:ext cx="5715000" cy="3238500"/>
+                      <a:ext cx="5553075" cy="6705600"/>
                     </a:xfrm>
                     <a:prstGeom prst="rect">
                       <a:avLst/>
@@ -961,158 +1002,108 @@
       <w:r>
         <w:rPr>
           <w:rFonts w:ascii="DejaVu Sans" w:cs="DejaVu Sans" w:eastAsia="DejaVu Sans" w:hAnsi="DejaVu Sans"/>
+          <w:b w:val="false"/>
+          <w:bCs w:val="false"/>
+        </w:rPr>
+        <w:t xml:space="preserve">Спершу застосунок лише читає початок файлу і показує, що в ньому є. Нічого не пише, доки не натиснеш «Імпортувати».</w:t>
+      </w:r>
+    </w:p>
+    <w:p>
+      <w:pPr>
+        <w:pStyle w:val="ListParagraph"/>
+        <w:numPr>
+          <w:ilvl w:val="0"/>
+          <w:numId w:val="3"/>
+        </w:numPr>
+        <w:spacing w:after="80"/>
+      </w:pPr>
+      <w:r>
+        <w:rPr>
+          <w:rFonts w:ascii="DejaVu Sans" w:cs="DejaVu Sans" w:eastAsia="DejaVu Sans" w:hAnsi="DejaVu Sans"/>
           <w:b/>
           <w:bCs/>
         </w:rPr>
-        <w:t xml:space="preserve">Modern</w:t>
-      </w:r>
-      <w:r>
-        <w:rPr>
-          <w:rFonts w:ascii="DejaVu Sans" w:cs="DejaVu Sans" w:eastAsia="DejaVu Sans" w:hAnsi="DejaVu Sans"/>
-          <w:b w:val="false"/>
-          <w:bCs w:val="false"/>
-        </w:rPr>
-        <w:t xml:space="preserve"> — зручні списки, пошук і таблиці. Таблицю можна зберегти як PDF.</w:t>
-      </w:r>
-    </w:p>
-    <w:p>
-      <w:pPr>
-        <w:pStyle w:val="ListParagraph"/>
-        <w:numPr>
-          <w:ilvl w:val="0"/>
-          <w:numId w:val="3"/>
-        </w:numPr>
-        <w:spacing w:after="80"/>
-      </w:pPr>
-      <w:r>
-        <w:rPr>
-          <w:rFonts w:ascii="DejaVu Sans" w:cs="DejaVu Sans" w:eastAsia="DejaVu Sans" w:hAnsi="DejaVu Sans"/>
-          <w:b/>
-          <w:bCs/>
-        </w:rPr>
-        <w:t xml:space="preserve">Classic</w:t>
-      </w:r>
-      <w:r>
-        <w:rPr>
-          <w:rFonts w:ascii="DejaVu Sans" w:cs="DejaVu Sans" w:eastAsia="DejaVu Sans" w:hAnsi="DejaVu Sans"/>
-          <w:b w:val="false"/>
-          <w:bCs w:val="false"/>
-        </w:rPr>
-        <w:t xml:space="preserve"> — все як у оригіналі на Windows: ті самі меню, сторінки й переходи.</w:t>
-      </w:r>
-    </w:p>
-    <w:p>
-      <w:pPr>
-        <w:pStyle w:val="ListParagraph"/>
-        <w:numPr>
-          <w:ilvl w:val="0"/>
-          <w:numId w:val="3"/>
-        </w:numPr>
-        <w:spacing w:after="80"/>
-      </w:pPr>
-      <w:r>
-        <w:rPr>
-          <w:rFonts w:ascii="DejaVu Sans" w:cs="DejaVu Sans" w:eastAsia="DejaVu Sans" w:hAnsi="DejaVu Sans"/>
-          <w:b w:val="false"/>
-          <w:bCs w:val="false"/>
-        </w:rPr>
-        <w:t xml:space="preserve">Якщо пункт ще не перенесено в Modern, застосунок відкриє його через Classic.</w:t>
-      </w:r>
-    </w:p>
-    <w:p>
-      <w:pPr>
-        <w:pStyle w:val="ListParagraph"/>
-        <w:numPr>
-          <w:ilvl w:val="0"/>
-          <w:numId w:val="3"/>
-        </w:numPr>
-        <w:spacing w:after="80"/>
-      </w:pPr>
-      <w:r>
-        <w:rPr>
-          <w:rFonts w:ascii="DejaVu Sans" w:cs="DejaVu Sans" w:eastAsia="DejaVu Sans" w:hAnsi="DejaVu Sans"/>
-          <w:b/>
-          <w:bCs/>
-        </w:rPr>
-        <w:t xml:space="preserve">Зелена рамка</w:t>
-      </w:r>
-      <w:r>
-        <w:rPr>
-          <w:rFonts w:ascii="DejaVu Sans" w:cs="DejaVu Sans" w:eastAsia="DejaVu Sans" w:hAnsi="DejaVu Sans"/>
-          <w:b w:val="false"/>
-          <w:bCs w:val="false"/>
-        </w:rPr>
-        <w:t xml:space="preserve"> — де вибираєш зі списку, вибране обведене зеленим: відкрита вкладка, схема, розʼєм, останній розділ. Рамка лишається після «Назад» і повороту екрана, поки працює застосунок.</w:t>
-      </w:r>
-    </w:p>
-    <w:p>
-      <w:pPr>
-        <w:pStyle w:val="ListParagraph"/>
-        <w:numPr>
-          <w:ilvl w:val="0"/>
-          <w:numId w:val="3"/>
-        </w:numPr>
-        <w:spacing w:after="80"/>
-      </w:pPr>
-      <w:r>
-        <w:rPr>
-          <w:rFonts w:ascii="DejaVu Sans" w:cs="DejaVu Sans" w:eastAsia="DejaVu Sans" w:hAnsi="DejaVu Sans"/>
-          <w:b/>
-          <w:bCs/>
-        </w:rPr>
-        <w:t xml:space="preserve">«Критерії / скорочення»</w:t>
-      </w:r>
-      <w:r>
-        <w:rPr>
-          <w:rFonts w:ascii="DejaVu Sans" w:cs="DejaVu Sans" w:eastAsia="DejaVu Sans" w:hAnsi="DejaVu Sans"/>
-          <w:b w:val="false"/>
-          <w:bCs w:val="false"/>
-        </w:rPr>
-        <w:t xml:space="preserve"> закріплені під меню розділу. Дотик відкриває таблицю скорочень поверх списку; ✕ або «Назад» закривають її, список не зрушує.</w:t>
-      </w:r>
-    </w:p>
-    <w:p>
-      <w:pPr>
-        <w:pStyle w:val="ListParagraph"/>
-        <w:numPr>
-          <w:ilvl w:val="0"/>
-          <w:numId w:val="3"/>
-        </w:numPr>
-        <w:spacing w:after="80"/>
-      </w:pPr>
-      <w:r>
-        <w:rPr>
-          <w:rFonts w:ascii="DejaVu Sans" w:cs="DejaVu Sans" w:eastAsia="DejaVu Sans" w:hAnsi="DejaVu Sans"/>
-          <w:b/>
-          <w:bCs/>
-        </w:rPr>
-        <w:t xml:space="preserve">Картка «ВИБРАНО»</w:t>
-      </w:r>
-      <w:r>
-        <w:rPr>
-          <w:rFonts w:ascii="DejaVu Sans" w:cs="DejaVu Sans" w:eastAsia="DejaVu Sans" w:hAnsi="DejaVu Sans"/>
-          <w:b w:val="false"/>
-          <w:bCs w:val="false"/>
-        </w:rPr>
-        <w:t xml:space="preserve"> — вибраний розʼєм і його документи («Схема + піни», «Схема розʼєму», «Опис контактів») стоять над списком. «Опис контактів» сам прокручує до таблиці.</w:t>
-      </w:r>
-    </w:p>
-    <w:p>
-      <w:pPr>
-        <w:pStyle w:val="ListParagraph"/>
-        <w:numPr>
-          <w:ilvl w:val="0"/>
-          <w:numId w:val="3"/>
-        </w:numPr>
-        <w:spacing w:after="80"/>
-      </w:pPr>
-      <w:r>
-        <w:rPr>
-          <w:rFonts w:ascii="DejaVu Sans" w:cs="DejaVu Sans" w:eastAsia="DejaVu Sans" w:hAnsi="DejaVu Sans"/>
-          <w:b w:val="false"/>
-          <w:bCs w:val="false"/>
-        </w:rPr>
-        <w:t xml:space="preserve">Кнопка «⇩ PDF» зберігає оригінальний PDF у вибрану папку.</w:t>
+        <w:t xml:space="preserve">✓ Уже є</w:t>
+      </w:r>
+      <w:r>
+        <w:rPr>
+          <w:rFonts w:ascii="DejaVu Sans" w:cs="DejaVu Sans" w:eastAsia="DejaVu Sans" w:hAnsi="DejaVu Sans"/>
+          <w:b w:val="false"/>
+          <w:bCs w:val="false"/>
+        </w:rPr>
+        <w:t xml:space="preserve"> — такий том уже на телефоні. Його пропускають і не замінюють. Однакові лише за схожою назвою коди (NT8340A і NT8342A) — різні томи.</w:t>
+      </w:r>
+    </w:p>
+    <w:p>
+      <w:pPr>
+        <w:pStyle w:val="ListParagraph"/>
+        <w:numPr>
+          <w:ilvl w:val="0"/>
+          <w:numId w:val="3"/>
+        </w:numPr>
+        <w:spacing w:after="80"/>
+      </w:pPr>
+      <w:r>
+        <w:rPr>
+          <w:rFonts w:ascii="DejaVu Sans" w:cs="DejaVu Sans" w:eastAsia="DejaVu Sans" w:hAnsi="DejaVu Sans"/>
+          <w:b w:val="false"/>
+          <w:bCs w:val="false"/>
+        </w:rPr>
+        <w:t xml:space="preserve">Якщо проєкту з такою моделлю ще немає — він створюється, коли встановиться перший том.</w:t>
+      </w:r>
+    </w:p>
+    <w:p>
+      <w:pPr>
+        <w:pStyle w:val="ListParagraph"/>
+        <w:numPr>
+          <w:ilvl w:val="0"/>
+          <w:numId w:val="3"/>
+        </w:numPr>
+        <w:spacing w:after="80"/>
+      </w:pPr>
+      <w:r>
+        <w:rPr>
+          <w:rFonts w:ascii="DejaVu Sans" w:cs="DejaVu Sans" w:eastAsia="DejaVu Sans" w:hAnsi="DejaVu Sans"/>
+          <w:b w:val="false"/>
+          <w:bCs w:val="false"/>
+        </w:rPr>
+        <w:t xml:space="preserve">Видно, скільки вільного місця і скільки приблизно треба. Якщо місце закінчується, імпорт сам зупиняється; уже додані томи лишаються.</w:t>
+      </w:r>
+    </w:p>
+    <w:p>
+      <w:pPr>
+        <w:pStyle w:val="ListParagraph"/>
+        <w:numPr>
+          <w:ilvl w:val="0"/>
+          <w:numId w:val="3"/>
+        </w:numPr>
+        <w:spacing w:after="80"/>
+      </w:pPr>
+      <w:r>
+        <w:rPr>
+          <w:rFonts w:ascii="DejaVu Sans" w:cs="DejaVu Sans" w:eastAsia="DejaVu Sans" w:hAnsi="DejaVu Sans"/>
+          <w:b w:val="false"/>
+          <w:bCs w:val="false"/>
+        </w:rPr>
+        <w:t xml:space="preserve">Можна натиснути «Скасувати» — поточний том не додасться, попередні лишаться. Наступний імпорт того самого файлу продовжить з того, чого бракує.</w:t>
+      </w:r>
+    </w:p>
+    <w:p>
+      <w:pPr>
+        <w:pStyle w:val="ListParagraph"/>
+        <w:numPr>
+          <w:ilvl w:val="0"/>
+          <w:numId w:val="3"/>
+        </w:numPr>
+        <w:spacing w:after="80"/>
+      </w:pPr>
+      <w:r>
+        <w:rPr>
+          <w:rFonts w:ascii="DejaVu Sans" w:cs="DejaVu Sans" w:eastAsia="DejaVu Sans" w:hAnsi="DejaVu Sans"/>
+          <w:b w:val="false"/>
+          <w:bCs w:val="false"/>
+        </w:rPr>
+        <w:t xml:space="preserve">Сам файл .rdproject не змінюється і не видаляється.</w:t>
       </w:r>
     </w:p>
     <w:p>
@@ -1128,7 +1119,7 @@
         <w:rPr>
           <w:rFonts w:ascii="DejaVu Sans" w:cs="DejaVu Sans" w:eastAsia="DejaVu Sans" w:hAnsi="DejaVu Sans"/>
         </w:rPr>
-        <w:t xml:space="preserve">PDF, масштаб і друк</w:t>
+        <w:t xml:space="preserve">Як читати том</w:t>
       </w:r>
     </w:p>
     <w:p>
@@ -1141,7 +1132,7 @@
           <w:b w:val="false"/>
           <w:bCs w:val="false"/>
         </w:rPr>
-        <w:t xml:space="preserve">Схеми PDF відкриваються у вбудованому переглядачі. Панель кнопок угорі однакового розміру скрізь: на окремому екрані, у «Схема + піни» і в другому вікні.</w:t>
+        <w:t xml:space="preserve">Дотик по тому відкриває його в режимі, вибраному в налаштуваннях: Modern (стоїть спочатку) або Classic. Перемкнутися можна кнопками Modern / Classic вгорі.</w:t>
       </w:r>
     </w:p>
     <w:p>
@@ -1152,7 +1143,7 @@
       <w:r>
         <w:drawing>
           <wp:inline distT="0" distB="0" distL="0" distR="0">
-            <wp:extent cx="5715000" cy="3067050"/>
+            <wp:extent cx="5715000" cy="3238500"/>
             <wp:effectExtent t="0" r="0" b="0" l="0"/>
             <wp:docPr id="1" name="" descr="" title=""/>
             <wp:cNvGraphicFramePr>
@@ -1177,7 +1168,7 @@
                   <pic:spPr bwMode="auto">
                     <a:xfrm>
                       <a:off x="0" y="0"/>
-                      <a:ext cx="5715000" cy="3067050"/>
+                      <a:ext cx="5715000" cy="3238500"/>
                     </a:xfrm>
                     <a:prstGeom prst="rect">
                       <a:avLst/>
@@ -1202,80 +1193,158 @@
       <w:r>
         <w:rPr>
           <w:rFonts w:ascii="DejaVu Sans" w:cs="DejaVu Sans" w:eastAsia="DejaVu Sans" w:hAnsi="DejaVu Sans"/>
-          <w:b w:val="false"/>
-          <w:bCs w:val="false"/>
-        </w:rPr>
-        <w:t xml:space="preserve">Меню ▾ біля відсотків має кроки аж до 450% і 500%.</w:t>
-      </w:r>
-    </w:p>
-    <w:p>
-      <w:pPr>
-        <w:pStyle w:val="ListParagraph"/>
-        <w:numPr>
-          <w:ilvl w:val="0"/>
-          <w:numId w:val="3"/>
-        </w:numPr>
-        <w:spacing w:after="80"/>
-      </w:pPr>
-      <w:r>
-        <w:rPr>
-          <w:rFonts w:ascii="DejaVu Sans" w:cs="DejaVu Sans" w:eastAsia="DejaVu Sans" w:hAnsi="DejaVu Sans"/>
-          <w:b w:val="false"/>
-          <w:bCs w:val="false"/>
-        </w:rPr>
-        <w:t xml:space="preserve">На «Схема + піни» сама сторінка не масштабується — збільшується кожен документ окремо, нижній не зникає.</w:t>
-      </w:r>
-    </w:p>
-    <w:p>
-      <w:pPr>
-        <w:pStyle w:val="ListParagraph"/>
-        <w:numPr>
-          <w:ilvl w:val="0"/>
-          <w:numId w:val="3"/>
-        </w:numPr>
-        <w:spacing w:after="80"/>
-      </w:pPr>
-      <w:r>
-        <w:rPr>
-          <w:rFonts w:ascii="DejaVu Sans" w:cs="DejaVu Sans" w:eastAsia="DejaVu Sans" w:hAnsi="DejaVu Sans"/>
-          <w:b w:val="false"/>
-          <w:bCs w:val="false"/>
-        </w:rPr>
-        <w:t xml:space="preserve">Друк — лише через </w:t>
-      </w:r>
-      <w:r>
-        <w:rPr>
-          <w:rFonts w:ascii="DejaVu Sans" w:cs="DejaVu Sans" w:eastAsia="DejaVu Sans" w:hAnsi="DejaVu Sans"/>
           <w:b/>
           <w:bCs/>
         </w:rPr>
-        <w:t xml:space="preserve">оригінальний значок принтера</w:t>
-      </w:r>
-      <w:r>
-        <w:rPr>
-          <w:rFonts w:ascii="DejaVu Sans" w:cs="DejaVu Sans" w:eastAsia="DejaVu Sans" w:hAnsi="DejaVu Sans"/>
-          <w:b w:val="false"/>
-          <w:bCs w:val="false"/>
-        </w:rPr>
-        <w:t xml:space="preserve"> Renault на документі. Окремих кнопок «Друк» застосунок не додає.</w:t>
-      </w:r>
-    </w:p>
-    <w:p>
-      <w:pPr>
-        <w:pStyle w:val="ListParagraph"/>
-        <w:numPr>
-          <w:ilvl w:val="0"/>
-          <w:numId w:val="3"/>
-        </w:numPr>
-        <w:spacing w:after="80"/>
-      </w:pPr>
-      <w:r>
-        <w:rPr>
-          <w:rFonts w:ascii="DejaVu Sans" w:cs="DejaVu Sans" w:eastAsia="DejaVu Sans" w:hAnsi="DejaVu Sans"/>
-          <w:b w:val="false"/>
-          <w:bCs w:val="false"/>
-        </w:rPr>
-        <w:t xml:space="preserve">Якщо в документа є друкований варіант (чорно-білий), друкується саме він.</w:t>
+        <w:t xml:space="preserve">Modern</w:t>
+      </w:r>
+      <w:r>
+        <w:rPr>
+          <w:rFonts w:ascii="DejaVu Sans" w:cs="DejaVu Sans" w:eastAsia="DejaVu Sans" w:hAnsi="DejaVu Sans"/>
+          <w:b w:val="false"/>
+          <w:bCs w:val="false"/>
+        </w:rPr>
+        <w:t xml:space="preserve"> — зручні списки, пошук і таблиці. Таблицю можна зберегти як PDF.</w:t>
+      </w:r>
+    </w:p>
+    <w:p>
+      <w:pPr>
+        <w:pStyle w:val="ListParagraph"/>
+        <w:numPr>
+          <w:ilvl w:val="0"/>
+          <w:numId w:val="3"/>
+        </w:numPr>
+        <w:spacing w:after="80"/>
+      </w:pPr>
+      <w:r>
+        <w:rPr>
+          <w:rFonts w:ascii="DejaVu Sans" w:cs="DejaVu Sans" w:eastAsia="DejaVu Sans" w:hAnsi="DejaVu Sans"/>
+          <w:b/>
+          <w:bCs/>
+        </w:rPr>
+        <w:t xml:space="preserve">Classic</w:t>
+      </w:r>
+      <w:r>
+        <w:rPr>
+          <w:rFonts w:ascii="DejaVu Sans" w:cs="DejaVu Sans" w:eastAsia="DejaVu Sans" w:hAnsi="DejaVu Sans"/>
+          <w:b w:val="false"/>
+          <w:bCs w:val="false"/>
+        </w:rPr>
+        <w:t xml:space="preserve"> — все як у оригіналі на Windows: ті самі меню, сторінки й переходи.</w:t>
+      </w:r>
+    </w:p>
+    <w:p>
+      <w:pPr>
+        <w:pStyle w:val="ListParagraph"/>
+        <w:numPr>
+          <w:ilvl w:val="0"/>
+          <w:numId w:val="3"/>
+        </w:numPr>
+        <w:spacing w:after="80"/>
+      </w:pPr>
+      <w:r>
+        <w:rPr>
+          <w:rFonts w:ascii="DejaVu Sans" w:cs="DejaVu Sans" w:eastAsia="DejaVu Sans" w:hAnsi="DejaVu Sans"/>
+          <w:b w:val="false"/>
+          <w:bCs w:val="false"/>
+        </w:rPr>
+        <w:t xml:space="preserve">Якщо пункт ще не перенесено в Modern, застосунок відкриє його через Classic.</w:t>
+      </w:r>
+    </w:p>
+    <w:p>
+      <w:pPr>
+        <w:pStyle w:val="ListParagraph"/>
+        <w:numPr>
+          <w:ilvl w:val="0"/>
+          <w:numId w:val="3"/>
+        </w:numPr>
+        <w:spacing w:after="80"/>
+      </w:pPr>
+      <w:r>
+        <w:rPr>
+          <w:rFonts w:ascii="DejaVu Sans" w:cs="DejaVu Sans" w:eastAsia="DejaVu Sans" w:hAnsi="DejaVu Sans"/>
+          <w:b/>
+          <w:bCs/>
+        </w:rPr>
+        <w:t xml:space="preserve">Зелена рамка</w:t>
+      </w:r>
+      <w:r>
+        <w:rPr>
+          <w:rFonts w:ascii="DejaVu Sans" w:cs="DejaVu Sans" w:eastAsia="DejaVu Sans" w:hAnsi="DejaVu Sans"/>
+          <w:b w:val="false"/>
+          <w:bCs w:val="false"/>
+        </w:rPr>
+        <w:t xml:space="preserve"> — де вибираєш зі списку, вибране обведене зеленим: відкрита вкладка, схема, розʼєм, останній розділ. Рамка лишається після «Назад» і повороту екрана, поки працює застосунок.</w:t>
+      </w:r>
+    </w:p>
+    <w:p>
+      <w:pPr>
+        <w:pStyle w:val="ListParagraph"/>
+        <w:numPr>
+          <w:ilvl w:val="0"/>
+          <w:numId w:val="3"/>
+        </w:numPr>
+        <w:spacing w:after="80"/>
+      </w:pPr>
+      <w:r>
+        <w:rPr>
+          <w:rFonts w:ascii="DejaVu Sans" w:cs="DejaVu Sans" w:eastAsia="DejaVu Sans" w:hAnsi="DejaVu Sans"/>
+          <w:b/>
+          <w:bCs/>
+        </w:rPr>
+        <w:t xml:space="preserve">«Критерії / скорочення»</w:t>
+      </w:r>
+      <w:r>
+        <w:rPr>
+          <w:rFonts w:ascii="DejaVu Sans" w:cs="DejaVu Sans" w:eastAsia="DejaVu Sans" w:hAnsi="DejaVu Sans"/>
+          <w:b w:val="false"/>
+          <w:bCs w:val="false"/>
+        </w:rPr>
+        <w:t xml:space="preserve"> закріплені під меню розділу. Дотик відкриває таблицю скорочень поверх списку; ✕ або «Назад» закривають її, список не зрушує.</w:t>
+      </w:r>
+    </w:p>
+    <w:p>
+      <w:pPr>
+        <w:pStyle w:val="ListParagraph"/>
+        <w:numPr>
+          <w:ilvl w:val="0"/>
+          <w:numId w:val="3"/>
+        </w:numPr>
+        <w:spacing w:after="80"/>
+      </w:pPr>
+      <w:r>
+        <w:rPr>
+          <w:rFonts w:ascii="DejaVu Sans" w:cs="DejaVu Sans" w:eastAsia="DejaVu Sans" w:hAnsi="DejaVu Sans"/>
+          <w:b/>
+          <w:bCs/>
+        </w:rPr>
+        <w:t xml:space="preserve">Картка «ВИБРАНО»</w:t>
+      </w:r>
+      <w:r>
+        <w:rPr>
+          <w:rFonts w:ascii="DejaVu Sans" w:cs="DejaVu Sans" w:eastAsia="DejaVu Sans" w:hAnsi="DejaVu Sans"/>
+          <w:b w:val="false"/>
+          <w:bCs w:val="false"/>
+        </w:rPr>
+        <w:t xml:space="preserve"> — вибраний розʼєм і його документи («Схема + піни», «Схема розʼєму», «Опис контактів») стоять над списком. «Опис контактів» сам прокручує до таблиці.</w:t>
+      </w:r>
+    </w:p>
+    <w:p>
+      <w:pPr>
+        <w:pStyle w:val="ListParagraph"/>
+        <w:numPr>
+          <w:ilvl w:val="0"/>
+          <w:numId w:val="3"/>
+        </w:numPr>
+        <w:spacing w:after="80"/>
+      </w:pPr>
+      <w:r>
+        <w:rPr>
+          <w:rFonts w:ascii="DejaVu Sans" w:cs="DejaVu Sans" w:eastAsia="DejaVu Sans" w:hAnsi="DejaVu Sans"/>
+          <w:b w:val="false"/>
+          <w:bCs w:val="false"/>
+        </w:rPr>
+        <w:t xml:space="preserve">Кнопка «⇩ PDF» зберігає оригінальний PDF у вибрану папку.</w:t>
       </w:r>
     </w:p>
     <w:p>
@@ -1291,7 +1360,7 @@
         <w:rPr>
           <w:rFonts w:ascii="DejaVu Sans" w:cs="DejaVu Sans" w:eastAsia="DejaVu Sans" w:hAnsi="DejaVu Sans"/>
         </w:rPr>
-        <w:t xml:space="preserve">Друге вікно «Документація поруч»</w:t>
+        <w:t xml:space="preserve">PDF, масштаб і друк</w:t>
       </w:r>
     </w:p>
     <w:p>
@@ -1304,7 +1373,7 @@
           <w:b w:val="false"/>
           <w:bCs w:val="false"/>
         </w:rPr>
-        <w:t xml:space="preserve">Кнопка ◫ у панелі PDF відкриває друге вікно знизу. Верхній документ лишається, а знизу можна відкрити будь-який інший документ цього тому — так зверху і знизу стоять два різні документи.</w:t>
+        <w:t xml:space="preserve">Схеми PDF відкриваються у вбудованому переглядачі. Панель кнопок угорі однакового розміру скрізь: на окремому екрані, у «Схема + піни» і в другому вікні.</w:t>
       </w:r>
     </w:p>
     <w:p>
@@ -1315,7 +1384,7 @@
       <w:r>
         <w:drawing>
           <wp:inline distT="0" distB="0" distL="0" distR="0">
-            <wp:extent cx="5715000" cy="3609975"/>
+            <wp:extent cx="5715000" cy="3067050"/>
             <wp:effectExtent t="0" r="0" b="0" l="0"/>
             <wp:docPr id="1" name="" descr="" title=""/>
             <wp:cNvGraphicFramePr>
@@ -1340,7 +1409,7 @@
                   <pic:spPr bwMode="auto">
                     <a:xfrm>
                       <a:off x="0" y="0"/>
-                      <a:ext cx="5715000" cy="3609975"/>
+                      <a:ext cx="5715000" cy="3067050"/>
                     </a:xfrm>
                     <a:prstGeom prst="rect">
                       <a:avLst/>
@@ -1368,79 +1437,77 @@
           <w:b w:val="false"/>
           <w:bCs w:val="false"/>
         </w:rPr>
-        <w:t xml:space="preserve">«←» у другому вікні — крок назад по ланцюжку: документ → розділ → том → закрити.</w:t>
-      </w:r>
-    </w:p>
-    <w:p>
-      <w:pPr>
-        <w:pStyle w:val="ListParagraph"/>
-        <w:numPr>
-          <w:ilvl w:val="0"/>
-          <w:numId w:val="3"/>
-        </w:numPr>
-        <w:spacing w:after="80"/>
-      </w:pPr>
-      <w:r>
-        <w:rPr>
-          <w:rFonts w:ascii="DejaVu Sans" w:cs="DejaVu Sans" w:eastAsia="DejaVu Sans" w:hAnsi="DejaVu Sans"/>
-          <w:b w:val="false"/>
-          <w:bCs w:val="false"/>
-        </w:rPr>
-        <w:t xml:space="preserve">Вкладки розділу міняють одна одну, тож «←» з розділу веде одразу в том.</w:t>
-      </w:r>
-    </w:p>
-    <w:p>
-      <w:pPr>
-        <w:pStyle w:val="ListParagraph"/>
-        <w:numPr>
-          <w:ilvl w:val="0"/>
-          <w:numId w:val="3"/>
-        </w:numPr>
-        <w:spacing w:after="80"/>
-      </w:pPr>
-      <w:r>
-        <w:rPr>
-          <w:rFonts w:ascii="DejaVu Sans" w:cs="DejaVu Sans" w:eastAsia="DejaVu Sans" w:hAnsi="DejaVu Sans"/>
-          <w:b w:val="false"/>
-          <w:bCs w:val="false"/>
-        </w:rPr>
-        <w:t xml:space="preserve">Таблиці («Опис контактів», «Критерії / скорочення») показуються прямо в другому вікні.</w:t>
-      </w:r>
-    </w:p>
-    <w:p>
-      <w:pPr>
-        <w:pStyle w:val="ListParagraph"/>
-        <w:numPr>
-          <w:ilvl w:val="0"/>
-          <w:numId w:val="3"/>
-        </w:numPr>
-        <w:spacing w:after="80"/>
-      </w:pPr>
-      <w:r>
-        <w:rPr>
-          <w:rFonts w:ascii="DejaVu Sans" w:cs="DejaVu Sans" w:eastAsia="DejaVu Sans" w:hAnsi="DejaVu Sans"/>
-          <w:b w:val="false"/>
-          <w:bCs w:val="false"/>
-        </w:rPr>
-        <w:t xml:space="preserve">Останнє відкрите на кожному кроці — у зеленій рамці.</w:t>
-      </w:r>
-    </w:p>
-    <w:p>
-      <w:pPr>
-        <w:pStyle w:val="ListParagraph"/>
-        <w:numPr>
-          <w:ilvl w:val="0"/>
-          <w:numId w:val="3"/>
-        </w:numPr>
-        <w:spacing w:after="80"/>
-      </w:pPr>
-      <w:r>
-        <w:rPr>
-          <w:rFonts w:ascii="DejaVu Sans" w:cs="DejaVu Sans" w:eastAsia="DejaVu Sans" w:hAnsi="DejaVu Sans"/>
-          <w:b w:val="false"/>
-          <w:bCs w:val="false"/>
-        </w:rPr>
-        <w:t xml:space="preserve">Межу між вікнами можна посунути.</w:t>
+        <w:t xml:space="preserve">Меню ▾ біля відсотків має кроки аж до 450% і 500%.</w:t>
+      </w:r>
+    </w:p>
+    <w:p>
+      <w:pPr>
+        <w:pStyle w:val="ListParagraph"/>
+        <w:numPr>
+          <w:ilvl w:val="0"/>
+          <w:numId w:val="3"/>
+        </w:numPr>
+        <w:spacing w:after="80"/>
+      </w:pPr>
+      <w:r>
+        <w:rPr>
+          <w:rFonts w:ascii="DejaVu Sans" w:cs="DejaVu Sans" w:eastAsia="DejaVu Sans" w:hAnsi="DejaVu Sans"/>
+          <w:b w:val="false"/>
+          <w:bCs w:val="false"/>
+        </w:rPr>
+        <w:t xml:space="preserve">На «Схема + піни» сама сторінка не масштабується — збільшується кожен документ окремо, нижній не зникає.</w:t>
+      </w:r>
+    </w:p>
+    <w:p>
+      <w:pPr>
+        <w:pStyle w:val="ListParagraph"/>
+        <w:numPr>
+          <w:ilvl w:val="0"/>
+          <w:numId w:val="3"/>
+        </w:numPr>
+        <w:spacing w:after="80"/>
+      </w:pPr>
+      <w:r>
+        <w:rPr>
+          <w:rFonts w:ascii="DejaVu Sans" w:cs="DejaVu Sans" w:eastAsia="DejaVu Sans" w:hAnsi="DejaVu Sans"/>
+          <w:b w:val="false"/>
+          <w:bCs w:val="false"/>
+        </w:rPr>
+        <w:t xml:space="preserve">Друк — лише через </w:t>
+      </w:r>
+      <w:r>
+        <w:rPr>
+          <w:rFonts w:ascii="DejaVu Sans" w:cs="DejaVu Sans" w:eastAsia="DejaVu Sans" w:hAnsi="DejaVu Sans"/>
+          <w:b/>
+          <w:bCs/>
+        </w:rPr>
+        <w:t xml:space="preserve">оригінальний значок принтера</w:t>
+      </w:r>
+      <w:r>
+        <w:rPr>
+          <w:rFonts w:ascii="DejaVu Sans" w:cs="DejaVu Sans" w:eastAsia="DejaVu Sans" w:hAnsi="DejaVu Sans"/>
+          <w:b w:val="false"/>
+          <w:bCs w:val="false"/>
+        </w:rPr>
+        <w:t xml:space="preserve"> Renault на документі. Окремих кнопок «Друк» застосунок не додає.</w:t>
+      </w:r>
+    </w:p>
+    <w:p>
+      <w:pPr>
+        <w:pStyle w:val="ListParagraph"/>
+        <w:numPr>
+          <w:ilvl w:val="0"/>
+          <w:numId w:val="3"/>
+        </w:numPr>
+        <w:spacing w:after="80"/>
+      </w:pPr>
+      <w:r>
+        <w:rPr>
+          <w:rFonts w:ascii="DejaVu Sans" w:cs="DejaVu Sans" w:eastAsia="DejaVu Sans" w:hAnsi="DejaVu Sans"/>
+          <w:b w:val="false"/>
+          <w:bCs w:val="false"/>
+        </w:rPr>
+        <w:t xml:space="preserve">Якщо в документа є друкований варіант (чорно-білий), друкується саме він.</w:t>
       </w:r>
     </w:p>
     <w:p>
@@ -1456,7 +1523,7 @@
         <w:rPr>
           <w:rFonts w:ascii="DejaVu Sans" w:cs="DejaVu Sans" w:eastAsia="DejaVu Sans" w:hAnsi="DejaVu Sans"/>
         </w:rPr>
-        <w:t xml:space="preserve">Як поділитися</w:t>
+        <w:t xml:space="preserve">Друге вікно «Документація поруч»</w:t>
       </w:r>
     </w:p>
     <w:p>
@@ -1469,7 +1536,7 @@
           <w:b w:val="false"/>
           <w:bCs w:val="false"/>
         </w:rPr>
-        <w:t xml:space="preserve">Є три способи — залежно від того, скільки томів потрібно передати.</w:t>
+        <w:t xml:space="preserve">Кнопка ◫ у панелі PDF відкриває друге вікно знизу. Верхній документ лишається, а знизу можна відкрити будь-який інший документ цього тому — так зверху і знизу стоять два різні документи.</w:t>
       </w:r>
     </w:p>
     <w:p>
@@ -1480,7 +1547,7 @@
       <w:r>
         <w:drawing>
           <wp:inline distT="0" distB="0" distL="0" distR="0">
-            <wp:extent cx="5715000" cy="2495550"/>
+            <wp:extent cx="5715000" cy="3609975"/>
             <wp:effectExtent t="0" r="0" b="0" l="0"/>
             <wp:docPr id="1" name="" descr="" title=""/>
             <wp:cNvGraphicFramePr>
@@ -1505,7 +1572,7 @@
                   <pic:spPr bwMode="auto">
                     <a:xfrm>
                       <a:off x="0" y="0"/>
-                      <a:ext cx="5715000" cy="2495550"/>
+                      <a:ext cx="5715000" cy="3609975"/>
                     </a:xfrm>
                     <a:prstGeom prst="rect">
                       <a:avLst/>
@@ -1530,134 +1597,82 @@
       <w:r>
         <w:rPr>
           <w:rFonts w:ascii="DejaVu Sans" w:cs="DejaVu Sans" w:eastAsia="DejaVu Sans" w:hAnsi="DejaVu Sans"/>
-          <w:b/>
-          <w:bCs/>
-        </w:rPr>
-        <w:t xml:space="preserve">Правило ⇧:</w:t>
-      </w:r>
-      <w:r>
-        <w:rPr>
-          <w:rFonts w:ascii="DejaVu Sans" w:cs="DejaVu Sans" w:eastAsia="DejaVu Sans" w:hAnsi="DejaVu Sans"/>
-          <w:b w:val="false"/>
-          <w:bCs w:val="false"/>
-        </w:rPr>
-        <w:t xml:space="preserve"> один підготовлений файл на том і на проєкт. Щоб зробити новий — спершу видали старий через ⋮.</w:t>
-      </w:r>
-    </w:p>
-    <w:p>
-      <w:pPr>
-        <w:pStyle w:val="ListParagraph"/>
-        <w:numPr>
-          <w:ilvl w:val="0"/>
-          <w:numId w:val="3"/>
-        </w:numPr>
-        <w:spacing w:after="80"/>
-      </w:pPr>
-      <w:r>
-        <w:rPr>
-          <w:rFonts w:ascii="DejaVu Sans" w:cs="DejaVu Sans" w:eastAsia="DejaVu Sans" w:hAnsi="DejaVu Sans"/>
-          <w:b w:val="false"/>
-          <w:bCs w:val="false"/>
-        </w:rPr>
-        <w:t xml:space="preserve">Ще один шлях для одного тому: ⋮ тому → «Експортувати .rdpkg» → вибрати, куди зберегти.</w:t>
-      </w:r>
-    </w:p>
-    <w:p>
-      <w:pPr>
-        <w:pStyle w:val="ListParagraph"/>
-        <w:numPr>
-          <w:ilvl w:val="0"/>
-          <w:numId w:val="3"/>
-        </w:numPr>
-        <w:spacing w:after="80"/>
-      </w:pPr>
-      <w:r>
-        <w:rPr>
-          <w:rFonts w:ascii="DejaVu Sans" w:cs="DejaVu Sans" w:eastAsia="DejaVu Sans" w:hAnsi="DejaVu Sans"/>
-          <w:b w:val="false"/>
-          <w:bCs w:val="false"/>
-        </w:rPr>
-        <w:t xml:space="preserve">Однойменні файли в папці не перезаписуються. Файл, який уже лежить у папці, застосунок звіряє за SHA-256: якщо збігся — пише «уже був», не копіює вдруге.</w:t>
-      </w:r>
-    </w:p>
-    <w:p>
-      <w:pPr>
-        <w:pStyle w:val="ListParagraph"/>
-        <w:numPr>
-          <w:ilvl w:val="0"/>
-          <w:numId w:val="3"/>
-        </w:numPr>
-        <w:spacing w:after="80"/>
-      </w:pPr>
-      <w:r>
-        <w:rPr>
-          <w:rFonts w:ascii="DejaVu Sans" w:cs="DejaVu Sans" w:eastAsia="DejaVu Sans" w:hAnsi="DejaVu Sans"/>
-          <w:b/>
-          <w:bCs/>
-        </w:rPr>
-        <w:t xml:space="preserve">«Вибрати лише нові для каталогу»</w:t>
-      </w:r>
-      <w:r>
-        <w:rPr>
-          <w:rFonts w:ascii="DejaVu Sans" w:cs="DejaVu Sans" w:eastAsia="DejaVu Sans" w:hAnsi="DejaVu Sans"/>
-          <w:b w:val="false"/>
-          <w:bCs w:val="false"/>
-        </w:rPr>
-        <w:t xml:space="preserve"> у кроці 1 сам ставить галочки на томи, яких ще нема в «Готові проєкти».</w:t>
-      </w:r>
-    </w:p>
-    <w:p>
-      <w:pPr>
-        <w:pStyle w:val="ListParagraph"/>
-        <w:numPr>
-          <w:ilvl w:val="0"/>
-          <w:numId w:val="3"/>
-        </w:numPr>
-        <w:spacing w:after="80"/>
-      </w:pPr>
-      <w:r>
-        <w:rPr>
-          <w:rFonts w:ascii="DejaVu Sans" w:cs="DejaVu Sans" w:eastAsia="DejaVu Sans" w:hAnsi="DejaVu Sans"/>
-          <w:b w:val="false"/>
-          <w:bCs w:val="false"/>
-        </w:rPr>
-        <w:t xml:space="preserve">На кроках 2 і 3 видно назву вибраної папки. У кінці в папку пишеться короткий JSON-звіт — навіть якщо щось не вдалося.</w:t>
-      </w:r>
-    </w:p>
-    <w:p>
-      <w:pPr>
-        <w:pBdr>
-          <w:left w:val="single" w:color="8A5A12" w:sz="18" w:space="8"/>
-        </w:pBdr>
-        <w:shd w:fill="FBF1DF" w:color="auto" w:val="clear"/>
-        <w:spacing w:after="160" w:before="120"/>
-      </w:pPr>
-      <w:r>
-        <w:rPr>
-          <w:rFonts w:ascii="DejaVu Sans" w:cs="DejaVu Sans" w:eastAsia="DejaVu Sans" w:hAnsi="DejaVu Sans"/>
-          <w:b/>
-          <w:bCs/>
-          <w:color w:val="8A5A12"/>
-        </w:rPr>
-        <w:t xml:space="preserve">Порада: експортуй томи в папку на телефоні, а на Google Диск вивантаж їх кнопкою «+» у застосунку Диск. Якщо одразу вибрати папку Диска, файли бере застосунок Диск і вивантажує сам — великі томи можуть годинами висіти в його черзі.</w:t>
-      </w:r>
-    </w:p>
-    <w:p>
-      <w:pPr>
-        <w:pBdr>
-          <w:left w:val="single" w:color="8A5A12" w:sz="18" w:space="8"/>
-        </w:pBdr>
-        <w:shd w:fill="FBF1DF" w:color="auto" w:val="clear"/>
-        <w:spacing w:after="160" w:before="120"/>
-      </w:pPr>
-      <w:r>
-        <w:rPr>
-          <w:rFonts w:ascii="DejaVu Sans" w:cs="DejaVu Sans" w:eastAsia="DejaVu Sans" w:hAnsi="DejaVu Sans"/>
-          <w:b/>
-          <w:bCs/>
-          <w:color w:val="8A5A12"/>
-        </w:rPr>
-        <w:t xml:space="preserve">Файл .rdproject поки можна лише відправити. Відкрити його в застосунку на іншому телефоні ще не можна — це в плані. Для передачі краще томи .rdpkg: їх застосунок відкриває через «Авто».</w:t>
+          <w:b w:val="false"/>
+          <w:bCs w:val="false"/>
+        </w:rPr>
+        <w:t xml:space="preserve">«←» у другому вікні — крок назад по ланцюжку: документ → розділ → том → закрити.</w:t>
+      </w:r>
+    </w:p>
+    <w:p>
+      <w:pPr>
+        <w:pStyle w:val="ListParagraph"/>
+        <w:numPr>
+          <w:ilvl w:val="0"/>
+          <w:numId w:val="3"/>
+        </w:numPr>
+        <w:spacing w:after="80"/>
+      </w:pPr>
+      <w:r>
+        <w:rPr>
+          <w:rFonts w:ascii="DejaVu Sans" w:cs="DejaVu Sans" w:eastAsia="DejaVu Sans" w:hAnsi="DejaVu Sans"/>
+          <w:b w:val="false"/>
+          <w:bCs w:val="false"/>
+        </w:rPr>
+        <w:t xml:space="preserve">Вкладки розділу міняють одна одну, тож «←» з розділу веде одразу в том.</w:t>
+      </w:r>
+    </w:p>
+    <w:p>
+      <w:pPr>
+        <w:pStyle w:val="ListParagraph"/>
+        <w:numPr>
+          <w:ilvl w:val="0"/>
+          <w:numId w:val="3"/>
+        </w:numPr>
+        <w:spacing w:after="80"/>
+      </w:pPr>
+      <w:r>
+        <w:rPr>
+          <w:rFonts w:ascii="DejaVu Sans" w:cs="DejaVu Sans" w:eastAsia="DejaVu Sans" w:hAnsi="DejaVu Sans"/>
+          <w:b w:val="false"/>
+          <w:bCs w:val="false"/>
+        </w:rPr>
+        <w:t xml:space="preserve">Таблиці («Опис контактів», «Критерії / скорочення») показуються прямо в другому вікні.</w:t>
+      </w:r>
+    </w:p>
+    <w:p>
+      <w:pPr>
+        <w:pStyle w:val="ListParagraph"/>
+        <w:numPr>
+          <w:ilvl w:val="0"/>
+          <w:numId w:val="3"/>
+        </w:numPr>
+        <w:spacing w:after="80"/>
+      </w:pPr>
+      <w:r>
+        <w:rPr>
+          <w:rFonts w:ascii="DejaVu Sans" w:cs="DejaVu Sans" w:eastAsia="DejaVu Sans" w:hAnsi="DejaVu Sans"/>
+          <w:b w:val="false"/>
+          <w:bCs w:val="false"/>
+        </w:rPr>
+        <w:t xml:space="preserve">Останнє відкрите на кожному кроці — у зеленій рамці.</w:t>
+      </w:r>
+    </w:p>
+    <w:p>
+      <w:pPr>
+        <w:pStyle w:val="ListParagraph"/>
+        <w:numPr>
+          <w:ilvl w:val="0"/>
+          <w:numId w:val="3"/>
+        </w:numPr>
+        <w:spacing w:after="80"/>
+      </w:pPr>
+      <w:r>
+        <w:rPr>
+          <w:rFonts w:ascii="DejaVu Sans" w:cs="DejaVu Sans" w:eastAsia="DejaVu Sans" w:hAnsi="DejaVu Sans"/>
+          <w:b w:val="false"/>
+          <w:bCs w:val="false"/>
+        </w:rPr>
+        <w:t xml:space="preserve">Межу між вікнами можна посунути.</w:t>
       </w:r>
     </w:p>
     <w:p>
@@ -1673,7 +1688,7 @@
         <w:rPr>
           <w:rFonts w:ascii="DejaVu Sans" w:cs="DejaVu Sans" w:eastAsia="DejaVu Sans" w:hAnsi="DejaVu Sans"/>
         </w:rPr>
-        <w:t xml:space="preserve">Довгі операції і «Скасувати»</w:t>
+        <w:t xml:space="preserve">Як поділитися</w:t>
       </w:r>
     </w:p>
     <w:p>
@@ -1686,7 +1701,7 @@
           <w:b w:val="false"/>
           <w:bCs w:val="false"/>
         </w:rPr>
-        <w:t xml:space="preserve">Підготовка, експорт, імпорт і створення тому йдуть у фоні. Застосунок можна згорнути, прогрес видно у шторці. На екрані — картка з зеленою смугою.</w:t>
+        <w:t xml:space="preserve">Є три способи — залежно від того, скільки томів потрібно передати.</w:t>
       </w:r>
     </w:p>
     <w:p>
@@ -1697,7 +1712,7 @@
       <w:r>
         <w:drawing>
           <wp:inline distT="0" distB="0" distL="0" distR="0">
-            <wp:extent cx="5715000" cy="2800350"/>
+            <wp:extent cx="5715000" cy="2495550"/>
             <wp:effectExtent t="0" r="0" b="0" l="0"/>
             <wp:docPr id="1" name="" descr="" title=""/>
             <wp:cNvGraphicFramePr>
@@ -1722,6 +1737,223 @@
                   <pic:spPr bwMode="auto">
                     <a:xfrm>
                       <a:off x="0" y="0"/>
+                      <a:ext cx="5715000" cy="2495550"/>
+                    </a:xfrm>
+                    <a:prstGeom prst="rect">
+                      <a:avLst/>
+                    </a:prstGeom>
+                  </pic:spPr>
+                </pic:pic>
+              </a:graphicData>
+            </a:graphic>
+          </wp:inline>
+        </w:drawing>
+      </w:r>
+    </w:p>
+    <w:p>
+      <w:pPr>
+        <w:pStyle w:val="ListParagraph"/>
+        <w:numPr>
+          <w:ilvl w:val="0"/>
+          <w:numId w:val="3"/>
+        </w:numPr>
+        <w:spacing w:after="80"/>
+      </w:pPr>
+      <w:r>
+        <w:rPr>
+          <w:rFonts w:ascii="DejaVu Sans" w:cs="DejaVu Sans" w:eastAsia="DejaVu Sans" w:hAnsi="DejaVu Sans"/>
+          <w:b/>
+          <w:bCs/>
+        </w:rPr>
+        <w:t xml:space="preserve">Правило ⇧:</w:t>
+      </w:r>
+      <w:r>
+        <w:rPr>
+          <w:rFonts w:ascii="DejaVu Sans" w:cs="DejaVu Sans" w:eastAsia="DejaVu Sans" w:hAnsi="DejaVu Sans"/>
+          <w:b w:val="false"/>
+          <w:bCs w:val="false"/>
+        </w:rPr>
+        <w:t xml:space="preserve"> один підготовлений файл на том і на проєкт. Щоб зробити новий — спершу видали старий через ⋮.</w:t>
+      </w:r>
+    </w:p>
+    <w:p>
+      <w:pPr>
+        <w:pStyle w:val="ListParagraph"/>
+        <w:numPr>
+          <w:ilvl w:val="0"/>
+          <w:numId w:val="3"/>
+        </w:numPr>
+        <w:spacing w:after="80"/>
+      </w:pPr>
+      <w:r>
+        <w:rPr>
+          <w:rFonts w:ascii="DejaVu Sans" w:cs="DejaVu Sans" w:eastAsia="DejaVu Sans" w:hAnsi="DejaVu Sans"/>
+          <w:b w:val="false"/>
+          <w:bCs w:val="false"/>
+        </w:rPr>
+        <w:t xml:space="preserve">Ще один шлях для одного тому: ⋮ тому → «Експортувати .rdpkg» → вибрати, куди зберегти.</w:t>
+      </w:r>
+    </w:p>
+    <w:p>
+      <w:pPr>
+        <w:pStyle w:val="ListParagraph"/>
+        <w:numPr>
+          <w:ilvl w:val="0"/>
+          <w:numId w:val="3"/>
+        </w:numPr>
+        <w:spacing w:after="80"/>
+      </w:pPr>
+      <w:r>
+        <w:rPr>
+          <w:rFonts w:ascii="DejaVu Sans" w:cs="DejaVu Sans" w:eastAsia="DejaVu Sans" w:hAnsi="DejaVu Sans"/>
+          <w:b w:val="false"/>
+          <w:bCs w:val="false"/>
+        </w:rPr>
+        <w:t xml:space="preserve">Однойменні файли в папці не перезаписуються. Файл, який уже лежить у папці, застосунок звіряє за SHA-256: якщо збігся — пише «уже був», не копіює вдруге.</w:t>
+      </w:r>
+    </w:p>
+    <w:p>
+      <w:pPr>
+        <w:pStyle w:val="ListParagraph"/>
+        <w:numPr>
+          <w:ilvl w:val="0"/>
+          <w:numId w:val="3"/>
+        </w:numPr>
+        <w:spacing w:after="80"/>
+      </w:pPr>
+      <w:r>
+        <w:rPr>
+          <w:rFonts w:ascii="DejaVu Sans" w:cs="DejaVu Sans" w:eastAsia="DejaVu Sans" w:hAnsi="DejaVu Sans"/>
+          <w:b/>
+          <w:bCs/>
+        </w:rPr>
+        <w:t xml:space="preserve">«Вибрати лише нові для каталогу»</w:t>
+      </w:r>
+      <w:r>
+        <w:rPr>
+          <w:rFonts w:ascii="DejaVu Sans" w:cs="DejaVu Sans" w:eastAsia="DejaVu Sans" w:hAnsi="DejaVu Sans"/>
+          <w:b w:val="false"/>
+          <w:bCs w:val="false"/>
+        </w:rPr>
+        <w:t xml:space="preserve"> у кроці 1 сам ставить галочки на томи, яких ще нема в «Готові проєкти».</w:t>
+      </w:r>
+    </w:p>
+    <w:p>
+      <w:pPr>
+        <w:pStyle w:val="ListParagraph"/>
+        <w:numPr>
+          <w:ilvl w:val="0"/>
+          <w:numId w:val="3"/>
+        </w:numPr>
+        <w:spacing w:after="80"/>
+      </w:pPr>
+      <w:r>
+        <w:rPr>
+          <w:rFonts w:ascii="DejaVu Sans" w:cs="DejaVu Sans" w:eastAsia="DejaVu Sans" w:hAnsi="DejaVu Sans"/>
+          <w:b w:val="false"/>
+          <w:bCs w:val="false"/>
+        </w:rPr>
+        <w:t xml:space="preserve">На кроках 2 і 3 видно назву вибраної папки. У кінці в папку пишеться короткий JSON-звіт — навіть якщо щось не вдалося.</w:t>
+      </w:r>
+    </w:p>
+    <w:p>
+      <w:pPr>
+        <w:pBdr>
+          <w:left w:val="single" w:color="8A5A12" w:sz="18" w:space="8"/>
+        </w:pBdr>
+        <w:shd w:fill="FBF1DF" w:color="auto" w:val="clear"/>
+        <w:spacing w:after="160" w:before="120"/>
+      </w:pPr>
+      <w:r>
+        <w:rPr>
+          <w:rFonts w:ascii="DejaVu Sans" w:cs="DejaVu Sans" w:eastAsia="DejaVu Sans" w:hAnsi="DejaVu Sans"/>
+          <w:b/>
+          <w:bCs/>
+          <w:color w:val="8A5A12"/>
+        </w:rPr>
+        <w:t xml:space="preserve">Порада: експортуй томи в папку на телефоні, а на Google Диск вивантаж їх кнопкою «+» у застосунку Диск. Якщо одразу вибрати папку Диска, файли бере застосунок Диск і вивантажує сам — великі томи можуть годинами висіти в його черзі.</w:t>
+      </w:r>
+    </w:p>
+    <w:p>
+      <w:pPr>
+        <w:pBdr>
+          <w:left w:val="single" w:color="8A5A12" w:sz="18" w:space="8"/>
+        </w:pBdr>
+        <w:shd w:fill="FBF1DF" w:color="auto" w:val="clear"/>
+        <w:spacing w:after="160" w:before="120"/>
+      </w:pPr>
+      <w:r>
+        <w:rPr>
+          <w:rFonts w:ascii="DejaVu Sans" w:cs="DejaVu Sans" w:eastAsia="DejaVu Sans" w:hAnsi="DejaVu Sans"/>
+          <w:b/>
+          <w:bCs/>
+          <w:color w:val="8A5A12"/>
+        </w:rPr>
+        <w:t xml:space="preserve">Отриманий .rdproject відкривається на іншому телефоні: див. розділ «Проєкт із файлу (.rdproject)». Окремі томи .rdpkg застосунок відкриває через «Авто» на екрані проєкту.</w:t>
+      </w:r>
+    </w:p>
+    <w:p>
+      <w:r>
+        <w:br w:type="page"/>
+      </w:r>
+    </w:p>
+    <w:p>
+      <w:pPr>
+        <w:pStyle w:val="Heading1"/>
+      </w:pPr>
+      <w:r>
+        <w:rPr>
+          <w:rFonts w:ascii="DejaVu Sans" w:cs="DejaVu Sans" w:eastAsia="DejaVu Sans" w:hAnsi="DejaVu Sans"/>
+        </w:rPr>
+        <w:t xml:space="preserve">Довгі операції і «Скасувати»</w:t>
+      </w:r>
+    </w:p>
+    <w:p>
+      <w:pPr>
+        <w:spacing w:after="140"/>
+      </w:pPr>
+      <w:r>
+        <w:rPr>
+          <w:rFonts w:ascii="DejaVu Sans" w:cs="DejaVu Sans" w:eastAsia="DejaVu Sans" w:hAnsi="DejaVu Sans"/>
+          <w:b w:val="false"/>
+          <w:bCs w:val="false"/>
+        </w:rPr>
+        <w:t xml:space="preserve">Підготовка, експорт, імпорт і створення тому йдуть у фоні. Застосунок можна згорнути, прогрес видно у шторці. На екрані — картка з зеленою смугою.</w:t>
+      </w:r>
+    </w:p>
+    <w:p>
+      <w:pPr>
+        <w:spacing w:after="160" w:before="120" w:line="240" w:lineRule="auto"/>
+        <w:jc w:val="center"/>
+      </w:pPr>
+      <w:r>
+        <w:drawing>
+          <wp:inline distT="0" distB="0" distL="0" distR="0">
+            <wp:extent cx="5715000" cy="2800350"/>
+            <wp:effectExtent t="0" r="0" b="0" l="0"/>
+            <wp:docPr id="1" name="" descr="" title=""/>
+            <wp:cNvGraphicFramePr>
+              <a:graphicFrameLocks xmlns:a="http://schemas.openxmlformats.org/drawingml/2006/main" noChangeAspect="1"/>
+            </wp:cNvGraphicFramePr>
+            <a:graphic xmlns:a="http://schemas.openxmlformats.org/drawingml/2006/main">
+              <a:graphicData uri="http://schemas.openxmlformats.org/drawingml/2006/picture">
+                <pic:pic xmlns:pic="http://schemas.openxmlformats.org/drawingml/2006/picture">
+                  <pic:nvPicPr>
+                    <pic:cNvPr id="0" name="" descr=""/>
+                    <pic:cNvPicPr>
+                      <a:picLocks noChangeAspect="1" noChangeArrowheads="1"/>
+                    </pic:cNvPicPr>
+                  </pic:nvPicPr>
+                  <pic:blipFill>
+                    <a:blip r:embed="rId17" cstate="none"/>
+                    <a:srcRect/>
+                    <a:stretch>
+                      <a:fillRect/>
+                    </a:stretch>
+                  </pic:blipFill>
+                  <pic:spPr bwMode="auto">
+                    <a:xfrm>
+                      <a:off x="0" y="0"/>
                       <a:ext cx="5715000" cy="2800350"/>
                     </a:xfrm>
                     <a:prstGeom prst="rect">
@@ -2050,7 +2282,7 @@
           <w:sz w:val="18"/>
           <w:szCs w:val="18"/>
         </w:rPr>
-        <w:t xml:space="preserve">Посібник зібрано з коду застосунку v0.5.130. Якщо кнопка на телефоні називається інакше — правда за телефоном.</w:t>
+        <w:t xml:space="preserve">Посібник зібрано з коду застосунку v0.5.132. Якщо кнопка на телефоні називається інакше — правда за телефоном.</w:t>
       </w:r>
     </w:p>
     <w:sectPr>

</xml_diff>

<commit_message>
v0.5.133: fix .rdproject import (FileProvider path), pick volumes with ticks
M30s 2026-10-14 20:16: «Failed to find configured root … rdproject-import/
volume-10.rdpkg» on the first volume — the folder was missing in
file_paths.xml. «Том N/M» now counts in file order. Owner 20:15: ticks
per new volume, «Зняти всі галочки», counts/space/button follow the ticks.
Guide v0.5.133. Ships TODO 1–5.

Co-Authored-By: Claude Opus 5.5 <noreply@anthropic.com>
Claude-Session: https://claude.ai/code/session_01PiZUSQLfX7wkAjucLrRTbR
</commit_message>
<xml_diff>
--- a/docs/ua/Posibnyk-Renault-Docs.docx
+++ b/docs/ua/Posibnyk-Renault-Docs.docx
@@ -13,7 +13,7 @@
           <w:sz w:val="18"/>
           <w:szCs w:val="18"/>
         </w:rPr>
-        <w:t xml:space="preserve">RENAULT DOCS · v0.5.132 · 14.10.2026</w:t>
+        <w:t xml:space="preserve">RENAULT DOCS · v0.5.133 · 14.10.2026</w:t>
       </w:r>
     </w:p>
     <w:p>
@@ -952,7 +952,7 @@
       <w:r>
         <w:drawing>
           <wp:inline distT="0" distB="0" distL="0" distR="0">
-            <wp:extent cx="5553075" cy="6705600"/>
+            <wp:extent cx="5000625" cy="6858000"/>
             <wp:effectExtent t="0" r="0" b="0" l="0"/>
             <wp:docPr id="1" name="" descr="" title=""/>
             <wp:cNvGraphicFramePr>
@@ -977,7 +977,7 @@
                   <pic:spPr bwMode="auto">
                     <a:xfrm>
                       <a:off x="0" y="0"/>
-                      <a:ext cx="5553075" cy="6705600"/>
+                      <a:ext cx="5000625" cy="6858000"/>
                     </a:xfrm>
                     <a:prstGeom prst="rect">
                       <a:avLst/>
@@ -1006,6 +1006,32 @@
           <w:bCs w:val="false"/>
         </w:rPr>
         <w:t xml:space="preserve">Спершу застосунок лише читає початок файлу і показує, що в ньому є. Нічого не пише, доки не натиснеш «Імпортувати».</w:t>
+      </w:r>
+    </w:p>
+    <w:p>
+      <w:pPr>
+        <w:pStyle w:val="ListParagraph"/>
+        <w:numPr>
+          <w:ilvl w:val="0"/>
+          <w:numId w:val="3"/>
+        </w:numPr>
+        <w:spacing w:after="80"/>
+      </w:pPr>
+      <w:r>
+        <w:rPr>
+          <w:rFonts w:ascii="DejaVu Sans" w:cs="DejaVu Sans" w:eastAsia="DejaVu Sans" w:hAnsi="DejaVu Sans"/>
+          <w:b/>
+          <w:bCs/>
+        </w:rPr>
+        <w:t xml:space="preserve">Галочки</w:t>
+      </w:r>
+      <w:r>
+        <w:rPr>
+          <w:rFonts w:ascii="DejaVu Sans" w:cs="DejaVu Sans" w:eastAsia="DejaVu Sans" w:hAnsi="DejaVu Sans"/>
+          <w:b w:val="false"/>
+          <w:bCs w:val="false"/>
+        </w:rPr>
+        <w:t xml:space="preserve"> біля нових томів: усі відмічені, зніми з тих, що не потрібні («Зняти всі галочки» — і познач лише свої). Кнопка рахує вибрані, місце теж рахується для них.</w:t>
       </w:r>
     </w:p>
     <w:p>
@@ -2282,7 +2308,7 @@
           <w:sz w:val="18"/>
           <w:szCs w:val="18"/>
         </w:rPr>
-        <w:t xml:space="preserve">Посібник зібрано з коду застосунку v0.5.132. Якщо кнопка на телефоні називається інакше — правда за телефоном.</w:t>
+        <w:t xml:space="preserve">Посібник зібрано з коду застосунку v0.5.133. Якщо кнопка на телефоні називається інакше — правда за телефоном.</w:t>
       </w:r>
     </w:p>
     <w:sectPr>

</xml_diff>

<commit_message>
v0.5.133: .rdproject import fix, volume ticks, TODO 1–5 (#300)
M30s 2026-10-14 20:16: «Failed to find configured root … rdproject-import/
volume-10.rdpkg» on the first volume — the folder was missing in
file_paths.xml. «Том N/M» now counts in file order. Owner 20:15: ticks
per new volume, «Зняти всі галочки», counts/space/button follow the ticks.
Guide v0.5.133. Ships TODO 1–5.


Claude-Session: https://claude.ai/code/session_01PiZUSQLfX7wkAjucLrRTbR

Co-authored-by: Claude <noreply@anthropic.com>
</commit_message>
<xml_diff>
--- a/docs/ua/Posibnyk-Renault-Docs.docx
+++ b/docs/ua/Posibnyk-Renault-Docs.docx
@@ -13,7 +13,7 @@
           <w:sz w:val="18"/>
           <w:szCs w:val="18"/>
         </w:rPr>
-        <w:t xml:space="preserve">RENAULT DOCS · v0.5.132 · 14.10.2026</w:t>
+        <w:t xml:space="preserve">RENAULT DOCS · v0.5.133 · 14.10.2026</w:t>
       </w:r>
     </w:p>
     <w:p>
@@ -952,7 +952,7 @@
       <w:r>
         <w:drawing>
           <wp:inline distT="0" distB="0" distL="0" distR="0">
-            <wp:extent cx="5553075" cy="6705600"/>
+            <wp:extent cx="5000625" cy="6858000"/>
             <wp:effectExtent t="0" r="0" b="0" l="0"/>
             <wp:docPr id="1" name="" descr="" title=""/>
             <wp:cNvGraphicFramePr>
@@ -977,7 +977,7 @@
                   <pic:spPr bwMode="auto">
                     <a:xfrm>
                       <a:off x="0" y="0"/>
-                      <a:ext cx="5553075" cy="6705600"/>
+                      <a:ext cx="5000625" cy="6858000"/>
                     </a:xfrm>
                     <a:prstGeom prst="rect">
                       <a:avLst/>
@@ -1006,6 +1006,32 @@
           <w:bCs w:val="false"/>
         </w:rPr>
         <w:t xml:space="preserve">Спершу застосунок лише читає початок файлу і показує, що в ньому є. Нічого не пише, доки не натиснеш «Імпортувати».</w:t>
+      </w:r>
+    </w:p>
+    <w:p>
+      <w:pPr>
+        <w:pStyle w:val="ListParagraph"/>
+        <w:numPr>
+          <w:ilvl w:val="0"/>
+          <w:numId w:val="3"/>
+        </w:numPr>
+        <w:spacing w:after="80"/>
+      </w:pPr>
+      <w:r>
+        <w:rPr>
+          <w:rFonts w:ascii="DejaVu Sans" w:cs="DejaVu Sans" w:eastAsia="DejaVu Sans" w:hAnsi="DejaVu Sans"/>
+          <w:b/>
+          <w:bCs/>
+        </w:rPr>
+        <w:t xml:space="preserve">Галочки</w:t>
+      </w:r>
+      <w:r>
+        <w:rPr>
+          <w:rFonts w:ascii="DejaVu Sans" w:cs="DejaVu Sans" w:eastAsia="DejaVu Sans" w:hAnsi="DejaVu Sans"/>
+          <w:b w:val="false"/>
+          <w:bCs w:val="false"/>
+        </w:rPr>
+        <w:t xml:space="preserve"> біля нових томів: усі відмічені, зніми з тих, що не потрібні («Зняти всі галочки» — і познач лише свої). Кнопка рахує вибрані, місце теж рахується для них.</w:t>
       </w:r>
     </w:p>
     <w:p>
@@ -2282,7 +2308,7 @@
           <w:sz w:val="18"/>
           <w:szCs w:val="18"/>
         </w:rPr>
-        <w:t xml:space="preserve">Посібник зібрано з коду застосунку v0.5.132. Якщо кнопка на телефоні називається інакше — правда за телефоном.</w:t>
+        <w:t xml:space="preserve">Посібник зібрано з коду застосунку v0.5.133. Якщо кнопка на телефоні називається інакше — правда за телефоном.</w:t>
       </w:r>
     </w:p>
     <w:sectPr>

</xml_diff>

<commit_message>
v0.5.134: open .rdproject from Samsung My Files (file://, zip types, no type); one import bar; guide
Co-Authored-By: Claude Opus 5.5 <noreply@anthropic.com>
Claude-Session: https://claude.ai/code/session_01JoPFKSM9YRy9HQnrpo8HSu
</commit_message>
<xml_diff>
--- a/docs/ua/Posibnyk-Renault-Docs.docx
+++ b/docs/ua/Posibnyk-Renault-Docs.docx
@@ -13,7 +13,7 @@
           <w:sz w:val="18"/>
           <w:szCs w:val="18"/>
         </w:rPr>
-        <w:t xml:space="preserve">RENAULT DOCS · v0.5.133 · 14.10.2026</w:t>
+        <w:t xml:space="preserve">RENAULT DOCS · v0.5.134 · 14.10.2026</w:t>
       </w:r>
     </w:p>
     <w:p>
@@ -1111,7 +1111,43 @@
           <w:b w:val="false"/>
           <w:bCs w:val="false"/>
         </w:rPr>
+        <w:t xml:space="preserve">Під час імпорту зелена смуга — скільки файлу вже пройдено, від 0 до 100 % і без стрибків назад. Встановлення кожного тому видно в тексті: «Том 2/5 · NT8340A — встановлюю 40 %».</w:t>
+      </w:r>
+    </w:p>
+    <w:p>
+      <w:pPr>
+        <w:pStyle w:val="ListParagraph"/>
+        <w:numPr>
+          <w:ilvl w:val="0"/>
+          <w:numId w:val="3"/>
+        </w:numPr>
+        <w:spacing w:after="80"/>
+      </w:pPr>
+      <w:r>
+        <w:rPr>
+          <w:rFonts w:ascii="DejaVu Sans" w:cs="DejaVu Sans" w:eastAsia="DejaVu Sans" w:hAnsi="DejaVu Sans"/>
+          <w:b w:val="false"/>
+          <w:bCs w:val="false"/>
+        </w:rPr>
         <w:t xml:space="preserve">Можна натиснути «Скасувати» — поточний том не додасться, попередні лишаться. Наступний імпорт того самого файлу продовжить з того, чого бракує.</w:t>
+      </w:r>
+    </w:p>
+    <w:p>
+      <w:pPr>
+        <w:pStyle w:val="ListParagraph"/>
+        <w:numPr>
+          <w:ilvl w:val="0"/>
+          <w:numId w:val="3"/>
+        </w:numPr>
+        <w:spacing w:after="80"/>
+      </w:pPr>
+      <w:r>
+        <w:rPr>
+          <w:rFonts w:ascii="DejaVu Sans" w:cs="DejaVu Sans" w:eastAsia="DejaVu Sans" w:hAnsi="DejaVu Sans"/>
+          <w:b w:val="false"/>
+          <w:bCs w:val="false"/>
+        </w:rPr>
+        <w:t xml:space="preserve">Якщо файл відкрили з «Моїх файлів» і Android не дав його прочитати — на екрані буде кнопка «Вибрати цей файл ще раз»: вибери той самий файл у списку, далі все як звичайно.</w:t>
       </w:r>
     </w:p>
     <w:p>
@@ -2308,7 +2344,7 @@
           <w:sz w:val="18"/>
           <w:szCs w:val="18"/>
         </w:rPr>
-        <w:t xml:space="preserve">Посібник зібрано з коду застосунку v0.5.133. Якщо кнопка на телефоні називається інакше — правда за телефоном.</w:t>
+        <w:t xml:space="preserve">Посібник зібрано з коду застосунку v0.5.134. Якщо кнопка на телефоні називається інакше — правда за телефоном.</w:t>
       </w:r>
     </w:p>
     <w:sectPr>

</xml_diff>

<commit_message>
v0.5.134: .rdproject from Samsung «Мої файли», one import bar, phone QA v0.5.133 (#303)
* docs: phone QA v0.5.133 M30s — check 1 (ВИБРАНО buttons) pass

Co-Authored-By: Claude Opus 5.5 <noreply@anthropic.com>
Claude-Session: https://claude.ai/code/session_01JoPFKSM9YRy9HQnrpo8HSu

* docs: phone QA v0.5.133 M30s — checks 2–3 (› icon, wrap at , and /) pass

Co-Authored-By: Claude Opus 5.5 <noreply@anthropic.com>
Claude-Session: https://claude.ai/code/session_01JoPFKSM9YRy9HQnrpo8HSu

* docs: phone QA v0.5.133 M30s — check 4 (Open with from My Files) not pass

Co-Authored-By: Claude Opus 5.5 <noreply@anthropic.com>
Claude-Session: https://claude.ai/code/session_01JoPFKSM9YRy9HQnrpo8HSu

* v0.5.134: open .rdproject from Samsung My Files (file://, zip types, no type); one import bar; guide

Co-Authored-By: Claude Opus 5.5 <noreply@anthropic.com>
Claude-Session: https://claude.ai/code/session_01JoPFKSM9YRy9HQnrpo8HSu

---------

Co-authored-by: Claude <noreply@anthropic.com>
</commit_message>
<xml_diff>
--- a/docs/ua/Posibnyk-Renault-Docs.docx
+++ b/docs/ua/Posibnyk-Renault-Docs.docx
@@ -13,7 +13,7 @@
           <w:sz w:val="18"/>
           <w:szCs w:val="18"/>
         </w:rPr>
-        <w:t xml:space="preserve">RENAULT DOCS · v0.5.133 · 14.10.2026</w:t>
+        <w:t xml:space="preserve">RENAULT DOCS · v0.5.134 · 14.10.2026</w:t>
       </w:r>
     </w:p>
     <w:p>
@@ -1111,7 +1111,43 @@
           <w:b w:val="false"/>
           <w:bCs w:val="false"/>
         </w:rPr>
+        <w:t xml:space="preserve">Під час імпорту зелена смуга — скільки файлу вже пройдено, від 0 до 100 % і без стрибків назад. Встановлення кожного тому видно в тексті: «Том 2/5 · NT8340A — встановлюю 40 %».</w:t>
+      </w:r>
+    </w:p>
+    <w:p>
+      <w:pPr>
+        <w:pStyle w:val="ListParagraph"/>
+        <w:numPr>
+          <w:ilvl w:val="0"/>
+          <w:numId w:val="3"/>
+        </w:numPr>
+        <w:spacing w:after="80"/>
+      </w:pPr>
+      <w:r>
+        <w:rPr>
+          <w:rFonts w:ascii="DejaVu Sans" w:cs="DejaVu Sans" w:eastAsia="DejaVu Sans" w:hAnsi="DejaVu Sans"/>
+          <w:b w:val="false"/>
+          <w:bCs w:val="false"/>
+        </w:rPr>
         <w:t xml:space="preserve">Можна натиснути «Скасувати» — поточний том не додасться, попередні лишаться. Наступний імпорт того самого файлу продовжить з того, чого бракує.</w:t>
+      </w:r>
+    </w:p>
+    <w:p>
+      <w:pPr>
+        <w:pStyle w:val="ListParagraph"/>
+        <w:numPr>
+          <w:ilvl w:val="0"/>
+          <w:numId w:val="3"/>
+        </w:numPr>
+        <w:spacing w:after="80"/>
+      </w:pPr>
+      <w:r>
+        <w:rPr>
+          <w:rFonts w:ascii="DejaVu Sans" w:cs="DejaVu Sans" w:eastAsia="DejaVu Sans" w:hAnsi="DejaVu Sans"/>
+          <w:b w:val="false"/>
+          <w:bCs w:val="false"/>
+        </w:rPr>
+        <w:t xml:space="preserve">Якщо файл відкрили з «Моїх файлів» і Android не дав його прочитати — на екрані буде кнопка «Вибрати цей файл ще раз»: вибери той самий файл у списку, далі все як звичайно.</w:t>
       </w:r>
     </w:p>
     <w:p>
@@ -2308,7 +2344,7 @@
           <w:sz w:val="18"/>
           <w:szCs w:val="18"/>
         </w:rPr>
-        <w:t xml:space="preserve">Посібник зібрано з коду застосунку v0.5.133. Якщо кнопка на телефоні називається інакше — правда за телефоном.</w:t>
+        <w:t xml:space="preserve">Посібник зібрано з коду застосунку v0.5.134. Якщо кнопка на телефоні називається інакше — правда за телефоном.</w:t>
       </w:r>
     </w:p>
     <w:sectPr>

</xml_diff>

<commit_message>
docs: owner decision B — Samsung My Files stays unsupported; guide points to «Проєкт із файлу» / ES
Co-Authored-By: Claude Opus 5.5 <noreply@anthropic.com>
Claude-Session: https://claude.ai/code/session_01JoPFKSM9YRy9HQnrpo8HSu
</commit_message>
<xml_diff>
--- a/docs/ua/Posibnyk-Renault-Docs.docx
+++ b/docs/ua/Posibnyk-Renault-Docs.docx
@@ -952,7 +952,7 @@
       <w:r>
         <w:drawing>
           <wp:inline distT="0" distB="0" distL="0" distR="0">
-            <wp:extent cx="5000625" cy="6858000"/>
+            <wp:extent cx="5038725" cy="6858000"/>
             <wp:effectExtent t="0" r="0" b="0" l="0"/>
             <wp:docPr id="1" name="" descr="" title=""/>
             <wp:cNvGraphicFramePr>
@@ -977,7 +977,7 @@
                   <pic:spPr bwMode="auto">
                     <a:xfrm>
                       <a:off x="0" y="0"/>
-                      <a:ext cx="5000625" cy="6858000"/>
+                      <a:ext cx="5038725" cy="6858000"/>
                     </a:xfrm>
                     <a:prstGeom prst="rect">
                       <a:avLst/>
@@ -1144,10 +1144,36 @@
       <w:r>
         <w:rPr>
           <w:rFonts w:ascii="DejaVu Sans" w:cs="DejaVu Sans" w:eastAsia="DejaVu Sans" w:hAnsi="DejaVu Sans"/>
-          <w:b w:val="false"/>
-          <w:bCs w:val="false"/>
-        </w:rPr>
-        <w:t xml:space="preserve">Якщо файл відкрили з «Моїх файлів» і Android не дав його прочитати — на екрані буде кнопка «Вибрати цей файл ще раз»: вибери той самий файл у списку, далі все як звичайно.</w:t>
+          <w:b/>
+          <w:bCs/>
+        </w:rPr>
+        <w:t xml:space="preserve">«Мої файли» Samsung</w:t>
+      </w:r>
+      <w:r>
+        <w:rPr>
+          <w:rFonts w:ascii="DejaVu Sans" w:cs="DejaVu Sans" w:eastAsia="DejaVu Sans" w:hAnsi="DejaVu Sans"/>
+          <w:b w:val="false"/>
+          <w:bCs w:val="false"/>
+        </w:rPr>
+        <w:t xml:space="preserve"> не показує Renault Docs у «Відкрити за допомогою»: він не передає ні імені, ні типу файлу. Звідти — Головне → «Додати» → «Проєкт із файлу» (або ES Провідник).</w:t>
+      </w:r>
+    </w:p>
+    <w:p>
+      <w:pPr>
+        <w:pStyle w:val="ListParagraph"/>
+        <w:numPr>
+          <w:ilvl w:val="0"/>
+          <w:numId w:val="3"/>
+        </w:numPr>
+        <w:spacing w:after="80"/>
+      </w:pPr>
+      <w:r>
+        <w:rPr>
+          <w:rFonts w:ascii="DejaVu Sans" w:cs="DejaVu Sans" w:eastAsia="DejaVu Sans" w:hAnsi="DejaVu Sans"/>
+          <w:b w:val="false"/>
+          <w:bCs w:val="false"/>
+        </w:rPr>
+        <w:t xml:space="preserve">Якщо Android не дав прочитати файл — на екрані буде кнопка «Вибрати цей файл ще раз»: вибери той самий файл у списку, далі все як звичайно.</w:t>
       </w:r>
     </w:p>
     <w:p>

</xml_diff>

<commit_message>
docs: Samsung My Files intent finding; owner decision B; guide (#306)
* docs: Samsung My Files sends content://media/external/file/N with empty type (Phone Diagnostics 25)

Co-Authored-By: Claude Opus 5.5 <noreply@anthropic.com>
Claude-Session: https://claude.ai/code/session_01JoPFKSM9YRy9HQnrpo8HSu

* docs: owner decision B — Samsung My Files stays unsupported; guide points to «Проєкт із файлу» / ES

Co-Authored-By: Claude Opus 5.5 <noreply@anthropic.com>
Claude-Session: https://claude.ai/code/session_01JoPFKSM9YRy9HQnrpo8HSu

---------

Co-authored-by: Claude <noreply@anthropic.com>
</commit_message>
<xml_diff>
--- a/docs/ua/Posibnyk-Renault-Docs.docx
+++ b/docs/ua/Posibnyk-Renault-Docs.docx
@@ -952,7 +952,7 @@
       <w:r>
         <w:drawing>
           <wp:inline distT="0" distB="0" distL="0" distR="0">
-            <wp:extent cx="5000625" cy="6858000"/>
+            <wp:extent cx="5038725" cy="6858000"/>
             <wp:effectExtent t="0" r="0" b="0" l="0"/>
             <wp:docPr id="1" name="" descr="" title=""/>
             <wp:cNvGraphicFramePr>
@@ -977,7 +977,7 @@
                   <pic:spPr bwMode="auto">
                     <a:xfrm>
                       <a:off x="0" y="0"/>
-                      <a:ext cx="5000625" cy="6858000"/>
+                      <a:ext cx="5038725" cy="6858000"/>
                     </a:xfrm>
                     <a:prstGeom prst="rect">
                       <a:avLst/>
@@ -1144,10 +1144,36 @@
       <w:r>
         <w:rPr>
           <w:rFonts w:ascii="DejaVu Sans" w:cs="DejaVu Sans" w:eastAsia="DejaVu Sans" w:hAnsi="DejaVu Sans"/>
-          <w:b w:val="false"/>
-          <w:bCs w:val="false"/>
-        </w:rPr>
-        <w:t xml:space="preserve">Якщо файл відкрили з «Моїх файлів» і Android не дав його прочитати — на екрані буде кнопка «Вибрати цей файл ще раз»: вибери той самий файл у списку, далі все як звичайно.</w:t>
+          <w:b/>
+          <w:bCs/>
+        </w:rPr>
+        <w:t xml:space="preserve">«Мої файли» Samsung</w:t>
+      </w:r>
+      <w:r>
+        <w:rPr>
+          <w:rFonts w:ascii="DejaVu Sans" w:cs="DejaVu Sans" w:eastAsia="DejaVu Sans" w:hAnsi="DejaVu Sans"/>
+          <w:b w:val="false"/>
+          <w:bCs w:val="false"/>
+        </w:rPr>
+        <w:t xml:space="preserve"> не показує Renault Docs у «Відкрити за допомогою»: він не передає ні імені, ні типу файлу. Звідти — Головне → «Додати» → «Проєкт із файлу» (або ES Провідник).</w:t>
+      </w:r>
+    </w:p>
+    <w:p>
+      <w:pPr>
+        <w:pStyle w:val="ListParagraph"/>
+        <w:numPr>
+          <w:ilvl w:val="0"/>
+          <w:numId w:val="3"/>
+        </w:numPr>
+        <w:spacing w:after="80"/>
+      </w:pPr>
+      <w:r>
+        <w:rPr>
+          <w:rFonts w:ascii="DejaVu Sans" w:cs="DejaVu Sans" w:eastAsia="DejaVu Sans" w:hAnsi="DejaVu Sans"/>
+          <w:b w:val="false"/>
+          <w:bCs w:val="false"/>
+        </w:rPr>
+        <w:t xml:space="preserve">Якщо Android не дав прочитати файл — на екрані буде кнопка «Вибрати цей файл ще раз»: вибери той самий файл у списку, далі все як звичайно.</w:t>
       </w:r>
     </w:p>
     <w:p>

</xml_diff>

<commit_message>
v0.5.135: new volumes in the phone or on the memory card (TODO 1, step 1); TODO 5
Co-Authored-By: Claude Opus 5.5 <noreply@anthropic.com>
Claude-Session: https://claude.ai/code/session_01JoPFKSM9YRy9HQnrpo8HSu
</commit_message>
<xml_diff>
--- a/docs/ua/Posibnyk-Renault-Docs.docx
+++ b/docs/ua/Posibnyk-Renault-Docs.docx
@@ -13,7 +13,7 @@
           <w:sz w:val="18"/>
           <w:szCs w:val="18"/>
         </w:rPr>
-        <w:t xml:space="preserve">RENAULT DOCS · v0.5.134 · 14.10.2026</w:t>
+        <w:t xml:space="preserve">RENAULT DOCS · v0.5.135 · 14.10.2026</w:t>
       </w:r>
     </w:p>
     <w:p>
@@ -761,6 +761,32 @@
       </w:r>
     </w:p>
     <w:p>
+      <w:pPr>
+        <w:pStyle w:val="ListParagraph"/>
+        <w:numPr>
+          <w:ilvl w:val="0"/>
+          <w:numId w:val="3"/>
+        </w:numPr>
+        <w:spacing w:after="80"/>
+      </w:pPr>
+      <w:r>
+        <w:rPr>
+          <w:rFonts w:ascii="DejaVu Sans" w:cs="DejaVu Sans" w:eastAsia="DejaVu Sans" w:hAnsi="DejaVu Sans"/>
+          <w:b/>
+          <w:bCs/>
+        </w:rPr>
+        <w:t xml:space="preserve">Куди лягає том</w:t>
+      </w:r>
+      <w:r>
+        <w:rPr>
+          <w:rFonts w:ascii="DejaVu Sans" w:cs="DejaVu Sans" w:eastAsia="DejaVu Sans" w:hAnsi="DejaVu Sans"/>
+          <w:b w:val="false"/>
+          <w:bCs w:val="false"/>
+        </w:rPr>
+        <w:t xml:space="preserve"> — у телефон або на карту пам'яті: Налаштування → «Де зберігати нові томи». Том на карті підписаний «▣ на карті пам'яті».</w:t>
+      </w:r>
+    </w:p>
+    <w:p>
       <w:r>
         <w:br w:type="page"/>
       </w:r>
@@ -1023,6 +1049,32 @@
           <w:b/>
           <w:bCs/>
         </w:rPr>
+        <w:t xml:space="preserve">Куди</w:t>
+      </w:r>
+      <w:r>
+        <w:rPr>
+          <w:rFonts w:ascii="DejaVu Sans" w:cs="DejaVu Sans" w:eastAsia="DejaVu Sans" w:hAnsi="DejaVu Sans"/>
+          <w:b w:val="false"/>
+          <w:bCs w:val="false"/>
+        </w:rPr>
+        <w:t xml:space="preserve">: телефон або карта пам'яті — кнопка «Зберегти на карту пам'яті» / «Зберегти в телефон» (те саме, що в Налаштуваннях). Вільне місце рахується там, куди вибрано.</w:t>
+      </w:r>
+    </w:p>
+    <w:p>
+      <w:pPr>
+        <w:pStyle w:val="ListParagraph"/>
+        <w:numPr>
+          <w:ilvl w:val="0"/>
+          <w:numId w:val="3"/>
+        </w:numPr>
+        <w:spacing w:after="80"/>
+      </w:pPr>
+      <w:r>
+        <w:rPr>
+          <w:rFonts w:ascii="DejaVu Sans" w:cs="DejaVu Sans" w:eastAsia="DejaVu Sans" w:hAnsi="DejaVu Sans"/>
+          <w:b/>
+          <w:bCs/>
+        </w:rPr>
         <w:t xml:space="preserve">Галочки</w:t>
       </w:r>
       <w:r>
@@ -2227,6 +2279,50 @@
       <w:r>
         <w:rPr>
           <w:rFonts w:ascii="DejaVu Sans" w:cs="DejaVu Sans" w:eastAsia="DejaVu Sans" w:hAnsi="DejaVu Sans"/>
+          <w:b/>
+          <w:bCs/>
+        </w:rPr>
+        <w:t xml:space="preserve">«Де зберігати нові томи»</w:t>
+      </w:r>
+      <w:r>
+        <w:rPr>
+          <w:rFonts w:ascii="DejaVu Sans" w:cs="DejaVu Sans" w:eastAsia="DejaVu Sans" w:hAnsi="DejaVu Sans"/>
+          <w:b w:val="false"/>
+          <w:bCs w:val="false"/>
+        </w:rPr>
+        <w:t xml:space="preserve"> — «Телефон» або «Карта пам'яті», з вільним місцем. Карта видна, лише коли вставлена. Діє для всіх нових томів; томи, що вже є, лишаються там, де лежать. Оновлений том (той самий, новіша копія) лягає туди, що вибрано зараз.</w:t>
+      </w:r>
+    </w:p>
+    <w:p>
+      <w:pPr>
+        <w:pStyle w:val="ListParagraph"/>
+        <w:numPr>
+          <w:ilvl w:val="0"/>
+          <w:numId w:val="3"/>
+        </w:numPr>
+        <w:spacing w:after="80"/>
+      </w:pPr>
+      <w:r>
+        <w:rPr>
+          <w:rFonts w:ascii="DejaVu Sans" w:cs="DejaVu Sans" w:eastAsia="DejaVu Sans" w:hAnsi="DejaVu Sans"/>
+          <w:b w:val="false"/>
+          <w:bCs w:val="false"/>
+        </w:rPr>
+        <w:t xml:space="preserve">Якщо витягти карту, томи з неї підписані «карту не вставлено» і не відкриваються, доки карту не вставиш назад. Нічого не видаляється.</w:t>
+      </w:r>
+    </w:p>
+    <w:p>
+      <w:pPr>
+        <w:pStyle w:val="ListParagraph"/>
+        <w:numPr>
+          <w:ilvl w:val="0"/>
+          <w:numId w:val="3"/>
+        </w:numPr>
+        <w:spacing w:after="80"/>
+      </w:pPr>
+      <w:r>
+        <w:rPr>
+          <w:rFonts w:ascii="DejaVu Sans" w:cs="DejaVu Sans" w:eastAsia="DejaVu Sans" w:hAnsi="DejaVu Sans"/>
           <w:b w:val="false"/>
           <w:bCs w:val="false"/>
         </w:rPr>
@@ -2370,7 +2466,7 @@
           <w:sz w:val="18"/>
           <w:szCs w:val="18"/>
         </w:rPr>
-        <w:t xml:space="preserve">Посібник зібрано з коду застосунку v0.5.134. Якщо кнопка на телефоні називається інакше — правда за телефоном.</w:t>
+        <w:t xml:space="preserve">Посібник зібрано з коду застосунку v0.5.135. Якщо кнопка на телефоні називається інакше — правда за телефоном.</w:t>
       </w:r>
     </w:p>
     <w:sectPr>

</xml_diff>

<commit_message>
v0.5.135: new volumes in the phone or on the memory card (TODO 1, step 1); TODO 5 (#309)
Claude-Session: https://claude.ai/code/session_01JoPFKSM9YRy9HQnrpo8HSu

Co-authored-by: Claude <noreply@anthropic.com>
</commit_message>
<xml_diff>
--- a/docs/ua/Posibnyk-Renault-Docs.docx
+++ b/docs/ua/Posibnyk-Renault-Docs.docx
@@ -13,7 +13,7 @@
           <w:sz w:val="18"/>
           <w:szCs w:val="18"/>
         </w:rPr>
-        <w:t xml:space="preserve">RENAULT DOCS · v0.5.134 · 14.10.2026</w:t>
+        <w:t xml:space="preserve">RENAULT DOCS · v0.5.135 · 14.10.2026</w:t>
       </w:r>
     </w:p>
     <w:p>
@@ -761,6 +761,32 @@
       </w:r>
     </w:p>
     <w:p>
+      <w:pPr>
+        <w:pStyle w:val="ListParagraph"/>
+        <w:numPr>
+          <w:ilvl w:val="0"/>
+          <w:numId w:val="3"/>
+        </w:numPr>
+        <w:spacing w:after="80"/>
+      </w:pPr>
+      <w:r>
+        <w:rPr>
+          <w:rFonts w:ascii="DejaVu Sans" w:cs="DejaVu Sans" w:eastAsia="DejaVu Sans" w:hAnsi="DejaVu Sans"/>
+          <w:b/>
+          <w:bCs/>
+        </w:rPr>
+        <w:t xml:space="preserve">Куди лягає том</w:t>
+      </w:r>
+      <w:r>
+        <w:rPr>
+          <w:rFonts w:ascii="DejaVu Sans" w:cs="DejaVu Sans" w:eastAsia="DejaVu Sans" w:hAnsi="DejaVu Sans"/>
+          <w:b w:val="false"/>
+          <w:bCs w:val="false"/>
+        </w:rPr>
+        <w:t xml:space="preserve"> — у телефон або на карту пам'яті: Налаштування → «Де зберігати нові томи». Том на карті підписаний «▣ на карті пам'яті».</w:t>
+      </w:r>
+    </w:p>
+    <w:p>
       <w:r>
         <w:br w:type="page"/>
       </w:r>
@@ -1023,6 +1049,32 @@
           <w:b/>
           <w:bCs/>
         </w:rPr>
+        <w:t xml:space="preserve">Куди</w:t>
+      </w:r>
+      <w:r>
+        <w:rPr>
+          <w:rFonts w:ascii="DejaVu Sans" w:cs="DejaVu Sans" w:eastAsia="DejaVu Sans" w:hAnsi="DejaVu Sans"/>
+          <w:b w:val="false"/>
+          <w:bCs w:val="false"/>
+        </w:rPr>
+        <w:t xml:space="preserve">: телефон або карта пам'яті — кнопка «Зберегти на карту пам'яті» / «Зберегти в телефон» (те саме, що в Налаштуваннях). Вільне місце рахується там, куди вибрано.</w:t>
+      </w:r>
+    </w:p>
+    <w:p>
+      <w:pPr>
+        <w:pStyle w:val="ListParagraph"/>
+        <w:numPr>
+          <w:ilvl w:val="0"/>
+          <w:numId w:val="3"/>
+        </w:numPr>
+        <w:spacing w:after="80"/>
+      </w:pPr>
+      <w:r>
+        <w:rPr>
+          <w:rFonts w:ascii="DejaVu Sans" w:cs="DejaVu Sans" w:eastAsia="DejaVu Sans" w:hAnsi="DejaVu Sans"/>
+          <w:b/>
+          <w:bCs/>
+        </w:rPr>
         <w:t xml:space="preserve">Галочки</w:t>
       </w:r>
       <w:r>
@@ -2227,6 +2279,50 @@
       <w:r>
         <w:rPr>
           <w:rFonts w:ascii="DejaVu Sans" w:cs="DejaVu Sans" w:eastAsia="DejaVu Sans" w:hAnsi="DejaVu Sans"/>
+          <w:b/>
+          <w:bCs/>
+        </w:rPr>
+        <w:t xml:space="preserve">«Де зберігати нові томи»</w:t>
+      </w:r>
+      <w:r>
+        <w:rPr>
+          <w:rFonts w:ascii="DejaVu Sans" w:cs="DejaVu Sans" w:eastAsia="DejaVu Sans" w:hAnsi="DejaVu Sans"/>
+          <w:b w:val="false"/>
+          <w:bCs w:val="false"/>
+        </w:rPr>
+        <w:t xml:space="preserve"> — «Телефон» або «Карта пам'яті», з вільним місцем. Карта видна, лише коли вставлена. Діє для всіх нових томів; томи, що вже є, лишаються там, де лежать. Оновлений том (той самий, новіша копія) лягає туди, що вибрано зараз.</w:t>
+      </w:r>
+    </w:p>
+    <w:p>
+      <w:pPr>
+        <w:pStyle w:val="ListParagraph"/>
+        <w:numPr>
+          <w:ilvl w:val="0"/>
+          <w:numId w:val="3"/>
+        </w:numPr>
+        <w:spacing w:after="80"/>
+      </w:pPr>
+      <w:r>
+        <w:rPr>
+          <w:rFonts w:ascii="DejaVu Sans" w:cs="DejaVu Sans" w:eastAsia="DejaVu Sans" w:hAnsi="DejaVu Sans"/>
+          <w:b w:val="false"/>
+          <w:bCs w:val="false"/>
+        </w:rPr>
+        <w:t xml:space="preserve">Якщо витягти карту, томи з неї підписані «карту не вставлено» і не відкриваються, доки карту не вставиш назад. Нічого не видаляється.</w:t>
+      </w:r>
+    </w:p>
+    <w:p>
+      <w:pPr>
+        <w:pStyle w:val="ListParagraph"/>
+        <w:numPr>
+          <w:ilvl w:val="0"/>
+          <w:numId w:val="3"/>
+        </w:numPr>
+        <w:spacing w:after="80"/>
+      </w:pPr>
+      <w:r>
+        <w:rPr>
+          <w:rFonts w:ascii="DejaVu Sans" w:cs="DejaVu Sans" w:eastAsia="DejaVu Sans" w:hAnsi="DejaVu Sans"/>
           <w:b w:val="false"/>
           <w:bCs w:val="false"/>
         </w:rPr>
@@ -2370,7 +2466,7 @@
           <w:sz w:val="18"/>
           <w:szCs w:val="18"/>
         </w:rPr>
-        <w:t xml:space="preserve">Посібник зібрано з коду застосунку v0.5.134. Якщо кнопка на телефоні називається інакше — правда за телефоном.</w:t>
+        <w:t xml:space="preserve">Посібник зібрано з коду застосунку v0.5.135. Якщо кнопка на телефоні називається інакше — правда за телефоном.</w:t>
       </w:r>
     </w:p>
     <w:sectPr>

</xml_diff>

<commit_message>
v0.5.136: import killed with the process (daily 6:00 restart) is closed as broken off, not shown forever
Co-Authored-By: Claude Opus 5.5 <noreply@anthropic.com>
Claude-Session: https://claude.ai/code/session_01JoPFKSM9YRy9HQnrpo8HSu
</commit_message>
<xml_diff>
--- a/docs/ua/Posibnyk-Renault-Docs.docx
+++ b/docs/ua/Posibnyk-Renault-Docs.docx
@@ -13,7 +13,7 @@
           <w:sz w:val="18"/>
           <w:szCs w:val="18"/>
         </w:rPr>
-        <w:t xml:space="preserve">RENAULT DOCS · v0.5.135 · 14.10.2026</w:t>
+        <w:t xml:space="preserve">RENAULT DOCS · v0.5.136 · 14.10.2026</w:t>
       </w:r>
     </w:p>
     <w:p>
@@ -1196,6 +1196,24 @@
       <w:r>
         <w:rPr>
           <w:rFonts w:ascii="DejaVu Sans" w:cs="DejaVu Sans" w:eastAsia="DejaVu Sans" w:hAnsi="DejaVu Sans"/>
+          <w:b w:val="false"/>
+          <w:bCs w:val="false"/>
+        </w:rPr>
+        <w:t xml:space="preserve">Якщо телефон перезавантажився або Android зупинив застосунок посеред імпорту, екран скаже «Імпорт обірвався» і скільки томів уже додано. Відкрий той самий файл ще раз — додадуться лише томи, яких бракує.</w:t>
+      </w:r>
+    </w:p>
+    <w:p>
+      <w:pPr>
+        <w:pStyle w:val="ListParagraph"/>
+        <w:numPr>
+          <w:ilvl w:val="0"/>
+          <w:numId w:val="3"/>
+        </w:numPr>
+        <w:spacing w:after="80"/>
+      </w:pPr>
+      <w:r>
+        <w:rPr>
+          <w:rFonts w:ascii="DejaVu Sans" w:cs="DejaVu Sans" w:eastAsia="DejaVu Sans" w:hAnsi="DejaVu Sans"/>
           <w:b/>
           <w:bCs/>
         </w:rPr>
@@ -2466,7 +2484,7 @@
           <w:sz w:val="18"/>
           <w:szCs w:val="18"/>
         </w:rPr>
-        <w:t xml:space="preserve">Посібник зібрано з коду застосунку v0.5.135. Якщо кнопка на телефоні називається інакше — правда за телефоном.</w:t>
+        <w:t xml:space="preserve">Посібник зібрано з коду застосунку v0.5.136. Якщо кнопка на телефоні називається інакше — правда за телефоном.</w:t>
       </w:r>
     </w:p>
     <w:sectPr>

</xml_diff>

<commit_message>
v0.5.136: import killed with the process (daily 6:00 restart) is closed as broken off, not shown forever (#313)
Claude-Session: https://claude.ai/code/session_01JoPFKSM9YRy9HQnrpo8HSu

Co-authored-by: Claude <noreply@anthropic.com>
</commit_message>
<xml_diff>
--- a/docs/ua/Posibnyk-Renault-Docs.docx
+++ b/docs/ua/Posibnyk-Renault-Docs.docx
@@ -13,7 +13,7 @@
           <w:sz w:val="18"/>
           <w:szCs w:val="18"/>
         </w:rPr>
-        <w:t xml:space="preserve">RENAULT DOCS · v0.5.135 · 14.10.2026</w:t>
+        <w:t xml:space="preserve">RENAULT DOCS · v0.5.136 · 14.10.2026</w:t>
       </w:r>
     </w:p>
     <w:p>
@@ -1196,6 +1196,24 @@
       <w:r>
         <w:rPr>
           <w:rFonts w:ascii="DejaVu Sans" w:cs="DejaVu Sans" w:eastAsia="DejaVu Sans" w:hAnsi="DejaVu Sans"/>
+          <w:b w:val="false"/>
+          <w:bCs w:val="false"/>
+        </w:rPr>
+        <w:t xml:space="preserve">Якщо телефон перезавантажився або Android зупинив застосунок посеред імпорту, екран скаже «Імпорт обірвався» і скільки томів уже додано. Відкрий той самий файл ще раз — додадуться лише томи, яких бракує.</w:t>
+      </w:r>
+    </w:p>
+    <w:p>
+      <w:pPr>
+        <w:pStyle w:val="ListParagraph"/>
+        <w:numPr>
+          <w:ilvl w:val="0"/>
+          <w:numId w:val="3"/>
+        </w:numPr>
+        <w:spacing w:after="80"/>
+      </w:pPr>
+      <w:r>
+        <w:rPr>
+          <w:rFonts w:ascii="DejaVu Sans" w:cs="DejaVu Sans" w:eastAsia="DejaVu Sans" w:hAnsi="DejaVu Sans"/>
           <w:b/>
           <w:bCs/>
         </w:rPr>
@@ -2466,7 +2484,7 @@
           <w:sz w:val="18"/>
           <w:szCs w:val="18"/>
         </w:rPr>
-        <w:t xml:space="preserve">Посібник зібрано з коду застосунку v0.5.135. Якщо кнопка на телефоні називається інакше — правда за телефоном.</w:t>
+        <w:t xml:space="preserve">Посібник зібрано з коду застосунку v0.5.136. Якщо кнопка на телефоні називається інакше — правда за телефоном.</w:t>
       </w:r>
     </w:p>
     <w:sectPr>

</xml_diff>

<commit_message>
feat: read a volume from its .rdpkg archive — stage 1 (v0.5.141)
Archives plan v2, stage 1 (owner 2026-10-17 00:32). «Зробити архів тому» packs the
installed folder into rdpkg-archive/<id>.rdpkg next to the volumes folder, checks every
file (size + CRC) against the folder, and only then the volume is read from the archive.
Provider and resolver read entries from the archive; PDFs are copied once into the phone
cache for PdfRenderer. The folder stays; «Читати з папки / з архіву» switch in the menu.

Co-Authored-By: Claude Opus 5.5 <noreply@anthropic.com>
Claude-Session: https://claude.ai/code/session_01JoQj3TqS8Lc5hjZ9xLwbV8
</commit_message>
<xml_diff>
--- a/docs/ua/Posibnyk-Renault-Docs.docx
+++ b/docs/ua/Posibnyk-Renault-Docs.docx
@@ -13,7 +13,7 @@
           <w:sz w:val="18"/>
           <w:szCs w:val="18"/>
         </w:rPr>
-        <w:t xml:space="preserve">RENAULT DOCS · v0.5.139 · 14.10.2026</w:t>
+        <w:t xml:space="preserve">RENAULT DOCS · v0.5.141 · 17.10.2026</w:t>
       </w:r>
     </w:p>
     <w:p>
@@ -1574,6 +1574,68 @@
       </w:r>
     </w:p>
     <w:p>
+      <w:pPr>
+        <w:pStyle w:val="ListParagraph"/>
+        <w:numPr>
+          <w:ilvl w:val="0"/>
+          <w:numId w:val="3"/>
+        </w:numPr>
+        <w:spacing w:after="80"/>
+      </w:pPr>
+      <w:r>
+        <w:rPr>
+          <w:rFonts w:ascii="DejaVu Sans" w:cs="DejaVu Sans" w:eastAsia="DejaVu Sans" w:hAnsi="DejaVu Sans"/>
+          <w:b/>
+          <w:bCs/>
+        </w:rPr>
+        <w:t xml:space="preserve">Архів тому</w:t>
+      </w:r>
+      <w:r>
+        <w:rPr>
+          <w:rFonts w:ascii="DejaVu Sans" w:cs="DejaVu Sans" w:eastAsia="DejaVu Sans" w:hAnsi="DejaVu Sans"/>
+          <w:b w:val="false"/>
+          <w:bCs w:val="false"/>
+        </w:rPr>
+        <w:t xml:space="preserve"> (з v0.5.141): ⋮ тому → «Зробити архів тому» пакує том в один файл .rdpkg поруч (там само — у телефоні чи на карті) і перевіряє кожен файл. Після цього том читається з цього одного файлу. Папка тому лишається як була — нічого не видаляється.</w:t>
+      </w:r>
+    </w:p>
+    <w:p>
+      <w:pPr>
+        <w:pStyle w:val="ListParagraph"/>
+        <w:numPr>
+          <w:ilvl w:val="0"/>
+          <w:numId w:val="3"/>
+        </w:numPr>
+        <w:spacing w:after="80"/>
+      </w:pPr>
+      <w:r>
+        <w:rPr>
+          <w:rFonts w:ascii="DejaVu Sans" w:cs="DejaVu Sans" w:eastAsia="DejaVu Sans" w:hAnsi="DejaVu Sans"/>
+          <w:b w:val="false"/>
+          <w:bCs w:val="false"/>
+        </w:rPr>
+        <w:t xml:space="preserve">У тому ж меню: «Читається з архіву ✓» і перемикач «Читати з папки» / «Читати з архіву». Якщо том встановили заново — «Архів тому застарів — зробити заново».</w:t>
+      </w:r>
+    </w:p>
+    <w:p>
+      <w:pPr>
+        <w:pStyle w:val="ListParagraph"/>
+        <w:numPr>
+          <w:ilvl w:val="0"/>
+          <w:numId w:val="3"/>
+        </w:numPr>
+        <w:spacing w:after="80"/>
+      </w:pPr>
+      <w:r>
+        <w:rPr>
+          <w:rFonts w:ascii="DejaVu Sans" w:cs="DejaVu Sans" w:eastAsia="DejaVu Sans" w:hAnsi="DejaVu Sans"/>
+          <w:b w:val="false"/>
+          <w:bCs w:val="false"/>
+        </w:rPr>
+        <w:t xml:space="preserve">PDF з архіву перший раз відкривається трохи довше: його копія кладеться в пам'ять телефона (до ~300 МБ, не на карту), далі — одразу. Звільняє ту саму «Очистити кеш».</w:t>
+      </w:r>
+    </w:p>
+    <w:p>
       <w:r>
         <w:br w:type="page"/>
       </w:r>
@@ -2570,7 +2632,7 @@
           <w:sz w:val="18"/>
           <w:szCs w:val="18"/>
         </w:rPr>
-        <w:t xml:space="preserve">Посібник зібрано з коду застосунку v0.5.139. Якщо кнопка на телефоні називається інакше — правда за телефоном.</w:t>
+        <w:t xml:space="preserve">Посібник зібрано з коду застосунку v0.5.141. Якщо кнопка на телефоні називається інакше — правда за телефоном.</w:t>
       </w:r>
     </w:p>
     <w:sectPr>

</xml_diff>

<commit_message>
feat: read a volume from its .rdpkg archive — stage 1 (v0.5.141) (#367)
Archives plan v2, stage 1 (owner 2026-10-17 00:32). «Зробити архів тому» packs the
installed folder into rdpkg-archive/<id>.rdpkg next to the volumes folder, checks every
file (size + CRC) against the folder, and only then the volume is read from the archive.
Provider and resolver read entries from the archive; PDFs are copied once into the phone
cache for PdfRenderer. The folder stays; «Читати з папки / з архіву» switch in the menu.


Claude-Session: https://claude.ai/code/session_01JoQj3TqS8Lc5hjZ9xLwbV8

Co-authored-by: Claude <noreply@anthropic.com>
</commit_message>
<xml_diff>
--- a/docs/ua/Posibnyk-Renault-Docs.docx
+++ b/docs/ua/Posibnyk-Renault-Docs.docx
@@ -13,7 +13,7 @@
           <w:sz w:val="18"/>
           <w:szCs w:val="18"/>
         </w:rPr>
-        <w:t xml:space="preserve">RENAULT DOCS · v0.5.139 · 14.10.2026</w:t>
+        <w:t xml:space="preserve">RENAULT DOCS · v0.5.141 · 17.10.2026</w:t>
       </w:r>
     </w:p>
     <w:p>
@@ -1574,6 +1574,68 @@
       </w:r>
     </w:p>
     <w:p>
+      <w:pPr>
+        <w:pStyle w:val="ListParagraph"/>
+        <w:numPr>
+          <w:ilvl w:val="0"/>
+          <w:numId w:val="3"/>
+        </w:numPr>
+        <w:spacing w:after="80"/>
+      </w:pPr>
+      <w:r>
+        <w:rPr>
+          <w:rFonts w:ascii="DejaVu Sans" w:cs="DejaVu Sans" w:eastAsia="DejaVu Sans" w:hAnsi="DejaVu Sans"/>
+          <w:b/>
+          <w:bCs/>
+        </w:rPr>
+        <w:t xml:space="preserve">Архів тому</w:t>
+      </w:r>
+      <w:r>
+        <w:rPr>
+          <w:rFonts w:ascii="DejaVu Sans" w:cs="DejaVu Sans" w:eastAsia="DejaVu Sans" w:hAnsi="DejaVu Sans"/>
+          <w:b w:val="false"/>
+          <w:bCs w:val="false"/>
+        </w:rPr>
+        <w:t xml:space="preserve"> (з v0.5.141): ⋮ тому → «Зробити архів тому» пакує том в один файл .rdpkg поруч (там само — у телефоні чи на карті) і перевіряє кожен файл. Після цього том читається з цього одного файлу. Папка тому лишається як була — нічого не видаляється.</w:t>
+      </w:r>
+    </w:p>
+    <w:p>
+      <w:pPr>
+        <w:pStyle w:val="ListParagraph"/>
+        <w:numPr>
+          <w:ilvl w:val="0"/>
+          <w:numId w:val="3"/>
+        </w:numPr>
+        <w:spacing w:after="80"/>
+      </w:pPr>
+      <w:r>
+        <w:rPr>
+          <w:rFonts w:ascii="DejaVu Sans" w:cs="DejaVu Sans" w:eastAsia="DejaVu Sans" w:hAnsi="DejaVu Sans"/>
+          <w:b w:val="false"/>
+          <w:bCs w:val="false"/>
+        </w:rPr>
+        <w:t xml:space="preserve">У тому ж меню: «Читається з архіву ✓» і перемикач «Читати з папки» / «Читати з архіву». Якщо том встановили заново — «Архів тому застарів — зробити заново».</w:t>
+      </w:r>
+    </w:p>
+    <w:p>
+      <w:pPr>
+        <w:pStyle w:val="ListParagraph"/>
+        <w:numPr>
+          <w:ilvl w:val="0"/>
+          <w:numId w:val="3"/>
+        </w:numPr>
+        <w:spacing w:after="80"/>
+      </w:pPr>
+      <w:r>
+        <w:rPr>
+          <w:rFonts w:ascii="DejaVu Sans" w:cs="DejaVu Sans" w:eastAsia="DejaVu Sans" w:hAnsi="DejaVu Sans"/>
+          <w:b w:val="false"/>
+          <w:bCs w:val="false"/>
+        </w:rPr>
+        <w:t xml:space="preserve">PDF з архіву перший раз відкривається трохи довше: його копія кладеться в пам'ять телефона (до ~300 МБ, не на карту), далі — одразу. Звільняє ту саму «Очистити кеш».</w:t>
+      </w:r>
+    </w:p>
+    <w:p>
       <w:r>
         <w:br w:type="page"/>
       </w:r>
@@ -2570,7 +2632,7 @@
           <w:sz w:val="18"/>
           <w:szCs w:val="18"/>
         </w:rPr>
-        <w:t xml:space="preserve">Посібник зібрано з коду застосунку v0.5.139. Якщо кнопка на телефоні називається інакше — правда за телефоном.</w:t>
+        <w:t xml:space="preserve">Посібник зібрано з коду застосунку v0.5.141. Якщо кнопка на телефоні називається інакше — правда за телефоном.</w:t>
       </w:r>
     </w:p>
     <w:sectPr>

</xml_diff>

<commit_message>
feat: v0.5.143 — archives stage 2 (import as one checked file) + TODO 19 (ZIP checked while written)
Co-Authored-By: Claude Opus 5.5 <noreply@anthropic.com>
Claude-Session: https://claude.ai/code/session_01WTSwEMANd5NnU1jU5TpNs1
</commit_message>
<xml_diff>
--- a/docs/ua/Posibnyk-Renault-Docs.docx
+++ b/docs/ua/Posibnyk-Renault-Docs.docx
@@ -1633,6 +1633,50 @@
           <w:bCs w:val="false"/>
         </w:rPr>
         <w:t xml:space="preserve">PDF з архіву перший раз відкривається трохи довше: його копія кладеться в пам'ять телефона (до ~300 МБ, не на карту), далі — одразу. Звільняє ту саму «Очистити кеш».</w:t>
+      </w:r>
+    </w:p>
+    <w:p>
+      <w:pPr>
+        <w:pStyle w:val="ListParagraph"/>
+        <w:numPr>
+          <w:ilvl w:val="0"/>
+          <w:numId w:val="3"/>
+        </w:numPr>
+        <w:spacing w:after="80"/>
+      </w:pPr>
+      <w:r>
+        <w:rPr>
+          <w:rFonts w:ascii="DejaVu Sans" w:cs="DejaVu Sans" w:eastAsia="DejaVu Sans" w:hAnsi="DejaVu Sans"/>
+          <w:b/>
+          <w:bCs/>
+        </w:rPr>
+        <w:t xml:space="preserve">Імпорт одним файлом</w:t>
+      </w:r>
+      <w:r>
+        <w:rPr>
+          <w:rFonts w:ascii="DejaVu Sans" w:cs="DejaVu Sans" w:eastAsia="DejaVu Sans" w:hAnsi="DejaVu Sans"/>
+          <w:b w:val="false"/>
+          <w:bCs w:val="false"/>
+        </w:rPr>
+        <w:t xml:space="preserve"> (з v0.5.143): новий том з .rdpkg, .rdproject чи «Готових проєктів» кладеться одним файлом і одразу читається з нього — без розпакування тисяч файлів, тож на карту пам'яті це хвилини, а не години. Спершу застосунок копіює файл, потім перевіряє кожен файл усередині; пошкоджений том не встановлюється. У меню такого тому — «Том — один файл-архів ✓».</w:t>
+      </w:r>
+    </w:p>
+    <w:p>
+      <w:pPr>
+        <w:pStyle w:val="ListParagraph"/>
+        <w:numPr>
+          <w:ilvl w:val="0"/>
+          <w:numId w:val="3"/>
+        </w:numPr>
+        <w:spacing w:after="80"/>
+      </w:pPr>
+      <w:r>
+        <w:rPr>
+          <w:rFonts w:ascii="DejaVu Sans" w:cs="DejaVu Sans" w:eastAsia="DejaVu Sans" w:hAnsi="DejaVu Sans"/>
+          <w:b w:val="false"/>
+          <w:bCs w:val="false"/>
+        </w:rPr>
+        <w:t xml:space="preserve">Експорт, «Поділитися томом» і .rdproject (з v0.5.143) перевіряють готовий файл ще під час запису: якщо він вийшов пошкодженим, експорт зупиняється з поясненням, а пошкоджений файл прибирається. Сам том не змінюється.</w:t>
       </w:r>
     </w:p>
     <w:p>

</xml_diff>

<commit_message>
feat: v0.5.143 — archives stage 2 (import as one checked file) + TODO 19 (ZIP checked while written) (#378)
Claude-Session: https://claude.ai/code/session_01WTSwEMANd5NnU1jU5TpNs1

Co-authored-by: Claude <noreply@anthropic.com>
</commit_message>
<xml_diff>
--- a/docs/ua/Posibnyk-Renault-Docs.docx
+++ b/docs/ua/Posibnyk-Renault-Docs.docx
@@ -1633,6 +1633,50 @@
           <w:bCs w:val="false"/>
         </w:rPr>
         <w:t xml:space="preserve">PDF з архіву перший раз відкривається трохи довше: його копія кладеться в пам'ять телефона (до ~300 МБ, не на карту), далі — одразу. Звільняє ту саму «Очистити кеш».</w:t>
+      </w:r>
+    </w:p>
+    <w:p>
+      <w:pPr>
+        <w:pStyle w:val="ListParagraph"/>
+        <w:numPr>
+          <w:ilvl w:val="0"/>
+          <w:numId w:val="3"/>
+        </w:numPr>
+        <w:spacing w:after="80"/>
+      </w:pPr>
+      <w:r>
+        <w:rPr>
+          <w:rFonts w:ascii="DejaVu Sans" w:cs="DejaVu Sans" w:eastAsia="DejaVu Sans" w:hAnsi="DejaVu Sans"/>
+          <w:b/>
+          <w:bCs/>
+        </w:rPr>
+        <w:t xml:space="preserve">Імпорт одним файлом</w:t>
+      </w:r>
+      <w:r>
+        <w:rPr>
+          <w:rFonts w:ascii="DejaVu Sans" w:cs="DejaVu Sans" w:eastAsia="DejaVu Sans" w:hAnsi="DejaVu Sans"/>
+          <w:b w:val="false"/>
+          <w:bCs w:val="false"/>
+        </w:rPr>
+        <w:t xml:space="preserve"> (з v0.5.143): новий том з .rdpkg, .rdproject чи «Готових проєктів» кладеться одним файлом і одразу читається з нього — без розпакування тисяч файлів, тож на карту пам'яті це хвилини, а не години. Спершу застосунок копіює файл, потім перевіряє кожен файл усередині; пошкоджений том не встановлюється. У меню такого тому — «Том — один файл-архів ✓».</w:t>
+      </w:r>
+    </w:p>
+    <w:p>
+      <w:pPr>
+        <w:pStyle w:val="ListParagraph"/>
+        <w:numPr>
+          <w:ilvl w:val="0"/>
+          <w:numId w:val="3"/>
+        </w:numPr>
+        <w:spacing w:after="80"/>
+      </w:pPr>
+      <w:r>
+        <w:rPr>
+          <w:rFonts w:ascii="DejaVu Sans" w:cs="DejaVu Sans" w:eastAsia="DejaVu Sans" w:hAnsi="DejaVu Sans"/>
+          <w:b w:val="false"/>
+          <w:bCs w:val="false"/>
+        </w:rPr>
+        <w:t xml:space="preserve">Експорт, «Поділитися томом» і .rdproject (з v0.5.143) перевіряють готовий файл ще під час запису: якщо він вийшов пошкодженим, експорт зупиняється з поясненням, а пошкоджений файл прибирається. Сам том не змінюється.</w:t>
       </w:r>
     </w:p>
     <w:p>

</xml_diff>

<commit_message>
v0.5.153: Core Stable scope agreed; user guide catches up with v0.5.142–0.5.152
- docs/plans/2026-10-17_CORE_STABLE_SCOPE.md (owner 20:10 «Так»)
- guide: delete volumes with files, app update from Google Drive, leftovers of
  broken-off imports, «Знайдено файлів: N», version line; rebuilt MD/Word/PDF/app page
- whats_new, test_v05153_guide_core_stable, ledger, STATUS

Co-Authored-By: Claude Opus 5.5 <noreply@anthropic.com>
Claude-Session: https://claude.ai/code/session_01LFFBa5wqqsfDYvUqkzLrnE
</commit_message>
<xml_diff>
--- a/docs/ua/Posibnyk-Renault-Docs.docx
+++ b/docs/ua/Posibnyk-Renault-Docs.docx
@@ -13,7 +13,7 @@
           <w:sz w:val="18"/>
           <w:szCs w:val="18"/>
         </w:rPr>
-        <w:t xml:space="preserve">RENAULT DOCS · v0.5.141 · 17.10.2026</w:t>
+        <w:t xml:space="preserve">RENAULT DOCS · v0.5.153 · 17.10.2026</w:t>
       </w:r>
     </w:p>
     <w:p>
@@ -200,6 +200,36 @@
           <w:rFonts w:ascii="DejaVu Sans" w:cs="DejaVu Sans" w:eastAsia="DejaVu Sans" w:hAnsi="DejaVu Sans"/>
         </w:rPr>
         <w:t xml:space="preserve">Довгі операції і «Скасувати»</w:t>
+      </w:r>
+    </w:p>
+    <w:p>
+      <w:pPr>
+        <w:pStyle w:val="ListParagraph"/>
+        <w:numPr>
+          <w:ilvl w:val="0"/>
+          <w:numId w:val="2"/>
+        </w:numPr>
+      </w:pPr>
+      <w:r>
+        <w:rPr>
+          <w:rFonts w:ascii="DejaVu Sans" w:cs="DejaVu Sans" w:eastAsia="DejaVu Sans" w:hAnsi="DejaVu Sans"/>
+        </w:rPr>
+        <w:t xml:space="preserve">Видалити томи разом з файлами</w:t>
+      </w:r>
+    </w:p>
+    <w:p>
+      <w:pPr>
+        <w:pStyle w:val="ListParagraph"/>
+        <w:numPr>
+          <w:ilvl w:val="0"/>
+          <w:numId w:val="2"/>
+        </w:numPr>
+      </w:pPr>
+      <w:r>
+        <w:rPr>
+          <w:rFonts w:ascii="DejaVu Sans" w:cs="DejaVu Sans" w:eastAsia="DejaVu Sans" w:hAnsi="DejaVu Sans"/>
+        </w:rPr>
+        <w:t xml:space="preserve">Оновлення застосунку з Google Диска</w:t>
       </w:r>
     </w:p>
     <w:p>
@@ -594,7 +624,38 @@
           <w:b w:val="false"/>
           <w:bCs w:val="false"/>
         </w:rPr>
+        <w:t xml:space="preserve">«Видалити томи разом з файлами…» — стирає вибрані томи разом з їхніми файлами (див. розділ «Видалити томи разом з файлами»).</w:t>
+      </w:r>
+    </w:p>
+    <w:p>
+      <w:pPr>
+        <w:pStyle w:val="ListParagraph"/>
+        <w:numPr>
+          <w:ilvl w:val="0"/>
+          <w:numId w:val="3"/>
+        </w:numPr>
+        <w:spacing w:after="80"/>
+      </w:pPr>
+      <w:r>
+        <w:rPr>
+          <w:rFonts w:ascii="DejaVu Sans" w:cs="DejaVu Sans" w:eastAsia="DejaVu Sans" w:hAnsi="DejaVu Sans"/>
+          <w:b w:val="false"/>
+          <w:bCs w:val="false"/>
+        </w:rPr>
         <w:t xml:space="preserve">«Видалити проєкт» — прибирає проєкт зі списку. Файли на телефоні не видаляються.</w:t>
+      </w:r>
+    </w:p>
+    <w:p>
+      <w:pPr>
+        <w:spacing w:after="140"/>
+      </w:pPr>
+      <w:r>
+        <w:rPr>
+          <w:rFonts w:ascii="DejaVu Sans" w:cs="DejaVu Sans" w:eastAsia="DejaVu Sans" w:hAnsi="DejaVu Sans"/>
+          <w:b w:val="false"/>
+          <w:bCs w:val="false"/>
+        </w:rPr>
+        <w:t xml:space="preserve">Під панеллю «Додати» завжди видно рядок з версією застосунку.</w:t>
       </w:r>
     </w:p>
     <w:p>
@@ -2408,6 +2469,42 @@
       </w:r>
     </w:p>
     <w:p>
+      <w:pPr>
+        <w:pStyle w:val="ListParagraph"/>
+        <w:numPr>
+          <w:ilvl w:val="0"/>
+          <w:numId w:val="3"/>
+        </w:numPr>
+        <w:spacing w:after="80"/>
+      </w:pPr>
+      <w:r>
+        <w:rPr>
+          <w:rFonts w:ascii="DejaVu Sans" w:cs="DejaVu Sans" w:eastAsia="DejaVu Sans" w:hAnsi="DejaVu Sans"/>
+          <w:b w:val="false"/>
+          <w:bCs w:val="false"/>
+        </w:rPr>
+        <w:t xml:space="preserve">Поки застосунок шукає файли тому (на початку підготовки чи стирання), смуга біжить через усю ширину без відсотків, а під нею видно «Знайдено файлів: N».</w:t>
+      </w:r>
+    </w:p>
+    <w:p>
+      <w:pPr>
+        <w:pStyle w:val="ListParagraph"/>
+        <w:numPr>
+          <w:ilvl w:val="0"/>
+          <w:numId w:val="3"/>
+        </w:numPr>
+        <w:spacing w:after="80"/>
+      </w:pPr>
+      <w:r>
+        <w:rPr>
+          <w:rFonts w:ascii="DejaVu Sans" w:cs="DejaVu Sans" w:eastAsia="DejaVu Sans" w:hAnsi="DejaVu Sans"/>
+          <w:b w:val="false"/>
+          <w:bCs w:val="false"/>
+        </w:rPr>
+        <w:t xml:space="preserve">Довгий рядок на картці (код тому, дата) переходить на другий рядок, а не обрізається посередині.</w:t>
+      </w:r>
+    </w:p>
+    <w:p>
       <w:r>
         <w:br w:type="page"/>
       </w:r>
@@ -2420,78 +2517,478 @@
         <w:rPr>
           <w:rFonts w:ascii="DejaVu Sans" w:cs="DejaVu Sans" w:eastAsia="DejaVu Sans" w:hAnsi="DejaVu Sans"/>
         </w:rPr>
-        <w:t xml:space="preserve">Налаштування</w:t>
-      </w:r>
-    </w:p>
-    <w:p>
-      <w:pPr>
-        <w:pStyle w:val="ListParagraph"/>
-        <w:numPr>
-          <w:ilvl w:val="0"/>
-          <w:numId w:val="3"/>
-        </w:numPr>
-        <w:spacing w:after="80"/>
-      </w:pPr>
-      <w:r>
-        <w:rPr>
-          <w:rFonts w:ascii="DejaVu Sans" w:cs="DejaVu Sans" w:eastAsia="DejaVu Sans" w:hAnsi="DejaVu Sans"/>
-          <w:b w:val="false"/>
-          <w:bCs w:val="false"/>
-        </w:rPr>
-        <w:t xml:space="preserve">«Відкривати dataset» — Modern або Classic за замовчуванням.</w:t>
-      </w:r>
-    </w:p>
-    <w:p>
-      <w:pPr>
-        <w:pStyle w:val="ListParagraph"/>
-        <w:numPr>
-          <w:ilvl w:val="0"/>
-          <w:numId w:val="3"/>
-        </w:numPr>
-        <w:spacing w:after="80"/>
-      </w:pPr>
-      <w:r>
-        <w:rPr>
-          <w:rFonts w:ascii="DejaVu Sans" w:cs="DejaVu Sans" w:eastAsia="DejaVu Sans" w:hAnsi="DejaVu Sans"/>
-          <w:b w:val="false"/>
-          <w:bCs w:val="false"/>
-        </w:rPr>
-        <w:t xml:space="preserve">«Масштаб за замовчуванням» — 85%, 100% (за шириною), 120%, 150%, 200%.</w:t>
-      </w:r>
-    </w:p>
-    <w:p>
-      <w:pPr>
-        <w:pStyle w:val="ListParagraph"/>
-        <w:numPr>
-          <w:ilvl w:val="0"/>
-          <w:numId w:val="3"/>
-        </w:numPr>
-        <w:spacing w:after="80"/>
-      </w:pPr>
-      <w:r>
-        <w:rPr>
-          <w:rFonts w:ascii="DejaVu Sans" w:cs="DejaVu Sans" w:eastAsia="DejaVu Sans" w:hAnsi="DejaVu Sans"/>
-          <w:b w:val="false"/>
-          <w:bCs w:val="false"/>
-        </w:rPr>
-        <w:t xml:space="preserve">«Крок кнопок − / +» — ±5%, ±10% або ±20%.</w:t>
-      </w:r>
-    </w:p>
-    <w:p>
-      <w:pPr>
-        <w:pStyle w:val="ListParagraph"/>
-        <w:numPr>
-          <w:ilvl w:val="0"/>
-          <w:numId w:val="3"/>
-        </w:numPr>
-        <w:spacing w:after="80"/>
-      </w:pPr>
+        <w:t xml:space="preserve">Видалити томи разом з файлами</w:t>
+      </w:r>
+    </w:p>
+    <w:p>
+      <w:pPr>
+        <w:spacing w:after="140"/>
+      </w:pPr>
+      <w:r>
+        <w:rPr>
+          <w:rFonts w:ascii="DejaVu Sans" w:cs="DejaVu Sans" w:eastAsia="DejaVu Sans" w:hAnsi="DejaVu Sans"/>
+          <w:b w:val="false"/>
+          <w:bCs w:val="false"/>
+        </w:rPr>
+        <w:t xml:space="preserve">Звичайне «Видалити з проєкту» (⋮ тому) прибирає том лише зі списку — файли лишаються. Щоб звільнити місце, є окрема дія, яка стирає й файли.</w:t>
+      </w:r>
+    </w:p>
+    <w:p>
+      <w:pPr>
+        <w:spacing w:after="160" w:before="120" w:line="240" w:lineRule="auto"/>
+        <w:jc w:val="center"/>
+      </w:pPr>
+      <w:r>
+        <w:drawing>
+          <wp:inline distT="0" distB="0" distL="0" distR="0">
+            <wp:extent cx="4076700" cy="6858000"/>
+            <wp:effectExtent t="0" r="0" b="0" l="0"/>
+            <wp:docPr id="1" name="" descr="" title=""/>
+            <wp:cNvGraphicFramePr>
+              <a:graphicFrameLocks xmlns:a="http://schemas.openxmlformats.org/drawingml/2006/main" noChangeAspect="1"/>
+            </wp:cNvGraphicFramePr>
+            <a:graphic xmlns:a="http://schemas.openxmlformats.org/drawingml/2006/main">
+              <a:graphicData uri="http://schemas.openxmlformats.org/drawingml/2006/picture">
+                <pic:pic xmlns:pic="http://schemas.openxmlformats.org/drawingml/2006/picture">
+                  <pic:nvPicPr>
+                    <pic:cNvPr id="0" name="" descr=""/>
+                    <pic:cNvPicPr>
+                      <a:picLocks noChangeAspect="1" noChangeArrowheads="1"/>
+                    </pic:cNvPicPr>
+                  </pic:nvPicPr>
+                  <pic:blipFill>
+                    <a:blip r:embed="rId18" cstate="none"/>
+                    <a:srcRect/>
+                    <a:stretch>
+                      <a:fillRect/>
+                    </a:stretch>
+                  </pic:blipFill>
+                  <pic:spPr bwMode="auto">
+                    <a:xfrm>
+                      <a:off x="0" y="0"/>
+                      <a:ext cx="4076700" cy="6858000"/>
+                    </a:xfrm>
+                    <a:prstGeom prst="rect">
+                      <a:avLst/>
+                    </a:prstGeom>
+                  </pic:spPr>
+                </pic:pic>
+              </a:graphicData>
+            </a:graphic>
+          </wp:inline>
+        </w:drawing>
+      </w:r>
+    </w:p>
+    <w:p>
+      <w:pPr>
+        <w:pStyle w:val="ListParagraph"/>
+        <w:numPr>
+          <w:ilvl w:val="0"/>
+          <w:numId w:val="3"/>
+        </w:numPr>
+        <w:spacing w:after="80"/>
+      </w:pPr>
+      <w:r>
+        <w:rPr>
+          <w:rFonts w:ascii="DejaVu Sans" w:cs="DejaVu Sans" w:eastAsia="DejaVu Sans" w:hAnsi="DejaVu Sans"/>
+          <w:b w:val="false"/>
+          <w:bCs w:val="false"/>
+        </w:rPr>
+        <w:t xml:space="preserve">Це </w:t>
+      </w:r>
       <w:r>
         <w:rPr>
           <w:rFonts w:ascii="DejaVu Sans" w:cs="DejaVu Sans" w:eastAsia="DejaVu Sans" w:hAnsi="DejaVu Sans"/>
           <w:b/>
           <w:bCs/>
         </w:rPr>
+        <w:t xml:space="preserve">назавжди</w:t>
+      </w:r>
+      <w:r>
+        <w:rPr>
+          <w:rFonts w:ascii="DejaVu Sans" w:cs="DejaVu Sans" w:eastAsia="DejaVu Sans" w:hAnsi="DejaVu Sans"/>
+          <w:b w:val="false"/>
+          <w:bCs w:val="false"/>
+        </w:rPr>
+        <w:t xml:space="preserve">: повернути том можна лише новим імпортом (.rdpkg, .rdproject або «Готові проєкти»).</w:t>
+      </w:r>
+    </w:p>
+    <w:p>
+      <w:pPr>
+        <w:pStyle w:val="ListParagraph"/>
+        <w:numPr>
+          <w:ilvl w:val="0"/>
+          <w:numId w:val="3"/>
+        </w:numPr>
+        <w:spacing w:after="80"/>
+      </w:pPr>
+      <w:r>
+        <w:rPr>
+          <w:rFonts w:ascii="DejaVu Sans" w:cs="DejaVu Sans" w:eastAsia="DejaVu Sans" w:hAnsi="DejaVu Sans"/>
+          <w:b w:val="false"/>
+          <w:bCs w:val="false"/>
+        </w:rPr>
+        <w:t xml:space="preserve">Підтвердження окреме, з кількістю томів. Без «Видалити назавжди» нічого не стирається.</w:t>
+      </w:r>
+    </w:p>
+    <w:p>
+      <w:pPr>
+        <w:pStyle w:val="ListParagraph"/>
+        <w:numPr>
+          <w:ilvl w:val="0"/>
+          <w:numId w:val="3"/>
+        </w:numPr>
+        <w:spacing w:after="80"/>
+      </w:pPr>
+      <w:r>
+        <w:rPr>
+          <w:rFonts w:ascii="DejaVu Sans" w:cs="DejaVu Sans" w:eastAsia="DejaVu Sans" w:hAnsi="DejaVu Sans"/>
+          <w:b w:val="false"/>
+          <w:bCs w:val="false"/>
+        </w:rPr>
+        <w:t xml:space="preserve">Томи прибираються зі списку миттєво, а файли стираються у фоні — смуга на головній і в шторці. Застосунок можна згорнути.</w:t>
+      </w:r>
+    </w:p>
+    <w:p>
+      <w:pPr>
+        <w:pStyle w:val="ListParagraph"/>
+        <w:numPr>
+          <w:ilvl w:val="0"/>
+          <w:numId w:val="3"/>
+        </w:numPr>
+        <w:spacing w:after="80"/>
+      </w:pPr>
+      <w:r>
+        <w:rPr>
+          <w:rFonts w:ascii="DejaVu Sans" w:cs="DejaVu Sans" w:eastAsia="DejaVu Sans" w:hAnsi="DejaVu Sans"/>
+          <w:b w:val="false"/>
+          <w:bCs w:val="false"/>
+        </w:rPr>
+        <w:t xml:space="preserve">Розпакований том — це тисячі дрібних файлів, на карті пам'яті старого телефона стирання може йти пів години. Том одним файлом стирається за мить.</w:t>
+      </w:r>
+    </w:p>
+    <w:p>
+      <w:pPr>
+        <w:pStyle w:val="ListParagraph"/>
+        <w:numPr>
+          <w:ilvl w:val="0"/>
+          <w:numId w:val="3"/>
+        </w:numPr>
+        <w:spacing w:after="80"/>
+      </w:pPr>
+      <w:r>
+        <w:rPr>
+          <w:rFonts w:ascii="DejaVu Sans" w:cs="DejaVu Sans" w:eastAsia="DejaVu Sans" w:hAnsi="DejaVu Sans"/>
+          <w:b w:val="false"/>
+          <w:bCs w:val="false"/>
+        </w:rPr>
+        <w:t xml:space="preserve">Якщо застосунок закрили або телефон перезапустився посеред стирання, воно продовжиться саме, коли знову відкриєш головний екран. Поки стирання не скінчилось, у меню ⋮ проєкту видно «Стираю у фоні файли видалених томів · лишилось N».</w:t>
+      </w:r>
+    </w:p>
+    <w:p>
+      <w:pPr>
+        <w:pStyle w:val="ListParagraph"/>
+        <w:numPr>
+          <w:ilvl w:val="0"/>
+          <w:numId w:val="3"/>
+        </w:numPr>
+        <w:spacing w:after="80"/>
+      </w:pPr>
+      <w:r>
+        <w:rPr>
+          <w:rFonts w:ascii="DejaVu Sans" w:cs="DejaVu Sans" w:eastAsia="DejaVu Sans" w:hAnsi="DejaVu Sans"/>
+          <w:b w:val="false"/>
+          <w:bCs w:val="false"/>
+        </w:rPr>
+        <w:t xml:space="preserve">Оригінальні архіви, файли .rdpkg / .rdproject поза застосунком і файли на Google Диску не чіпаються.</w:t>
+      </w:r>
+    </w:p>
+    <w:p>
+      <w:r>
+        <w:br w:type="page"/>
+      </w:r>
+    </w:p>
+    <w:p>
+      <w:pPr>
+        <w:pStyle w:val="Heading1"/>
+      </w:pPr>
+      <w:r>
+        <w:rPr>
+          <w:rFonts w:ascii="DejaVu Sans" w:cs="DejaVu Sans" w:eastAsia="DejaVu Sans" w:hAnsi="DejaVu Sans"/>
+        </w:rPr>
+        <w:t xml:space="preserve">Оновлення застосунку з Google Диска</w:t>
+      </w:r>
+    </w:p>
+    <w:p>
+      <w:pPr>
+        <w:spacing w:after="140"/>
+      </w:pPr>
+      <w:r>
+        <w:rPr>
+          <w:rFonts w:ascii="DejaVu Sans" w:cs="DejaVu Sans" w:eastAsia="DejaVu Sans" w:hAnsi="DejaVu Sans"/>
+          <w:b w:val="false"/>
+          <w:bCs w:val="false"/>
+        </w:rPr>
+        <w:t xml:space="preserve">Нову версію можна отримати прямо в застосунку, без меню Termux: Налаштування → «Про програму» → «Оновлення застосунку» → «Перевірити оновлення».</w:t>
+      </w:r>
+    </w:p>
+    <w:p>
+      <w:pPr>
+        <w:spacing w:after="160" w:before="120" w:line="240" w:lineRule="auto"/>
+        <w:jc w:val="center"/>
+      </w:pPr>
+      <w:r>
+        <w:drawing>
+          <wp:inline distT="0" distB="0" distL="0" distR="0">
+            <wp:extent cx="5715000" cy="5105400"/>
+            <wp:effectExtent t="0" r="0" b="0" l="0"/>
+            <wp:docPr id="1" name="" descr="" title=""/>
+            <wp:cNvGraphicFramePr>
+              <a:graphicFrameLocks xmlns:a="http://schemas.openxmlformats.org/drawingml/2006/main" noChangeAspect="1"/>
+            </wp:cNvGraphicFramePr>
+            <a:graphic xmlns:a="http://schemas.openxmlformats.org/drawingml/2006/main">
+              <a:graphicData uri="http://schemas.openxmlformats.org/drawingml/2006/picture">
+                <pic:pic xmlns:pic="http://schemas.openxmlformats.org/drawingml/2006/picture">
+                  <pic:nvPicPr>
+                    <pic:cNvPr id="0" name="" descr=""/>
+                    <pic:cNvPicPr>
+                      <a:picLocks noChangeAspect="1" noChangeArrowheads="1"/>
+                    </pic:cNvPicPr>
+                  </pic:nvPicPr>
+                  <pic:blipFill>
+                    <a:blip r:embed="rId19" cstate="none"/>
+                    <a:srcRect/>
+                    <a:stretch>
+                      <a:fillRect/>
+                    </a:stretch>
+                  </pic:blipFill>
+                  <pic:spPr bwMode="auto">
+                    <a:xfrm>
+                      <a:off x="0" y="0"/>
+                      <a:ext cx="5715000" cy="5105400"/>
+                    </a:xfrm>
+                    <a:prstGeom prst="rect">
+                      <a:avLst/>
+                    </a:prstGeom>
+                  </pic:spPr>
+                </pic:pic>
+              </a:graphicData>
+            </a:graphic>
+          </wp:inline>
+        </w:drawing>
+      </w:r>
+    </w:p>
+    <w:p>
+      <w:pPr>
+        <w:pStyle w:val="ListParagraph"/>
+        <w:numPr>
+          <w:ilvl w:val="0"/>
+          <w:numId w:val="3"/>
+        </w:numPr>
+        <w:spacing w:after="80"/>
+      </w:pPr>
+      <w:r>
+        <w:rPr>
+          <w:rFonts w:ascii="DejaVu Sans" w:cs="DejaVu Sans" w:eastAsia="DejaVu Sans" w:hAnsi="DejaVu Sans"/>
+          <w:b w:val="false"/>
+          <w:bCs w:val="false"/>
+        </w:rPr>
+        <w:t xml:space="preserve">Оновлювати не обов'язково — «Не зараз» нічого не змінює.</w:t>
+      </w:r>
+    </w:p>
+    <w:p>
+      <w:pPr>
+        <w:pStyle w:val="ListParagraph"/>
+        <w:numPr>
+          <w:ilvl w:val="0"/>
+          <w:numId w:val="3"/>
+        </w:numPr>
+        <w:spacing w:after="80"/>
+      </w:pPr>
+      <w:r>
+        <w:rPr>
+          <w:rFonts w:ascii="DejaVu Sans" w:cs="DejaVu Sans" w:eastAsia="DejaVu Sans" w:hAnsi="DejaVu Sans"/>
+          <w:b w:val="false"/>
+          <w:bCs w:val="false"/>
+        </w:rPr>
+        <w:t xml:space="preserve">Проєкти, томи й налаштування після оновлення лишаються.</w:t>
+      </w:r>
+    </w:p>
+    <w:p>
+      <w:pPr>
+        <w:pStyle w:val="ListParagraph"/>
+        <w:numPr>
+          <w:ilvl w:val="0"/>
+          <w:numId w:val="3"/>
+        </w:numPr>
+        <w:spacing w:after="80"/>
+      </w:pPr>
+      <w:r>
+        <w:rPr>
+          <w:rFonts w:ascii="DejaVu Sans" w:cs="DejaVu Sans" w:eastAsia="DejaVu Sans" w:hAnsi="DejaVu Sans"/>
+          <w:b w:val="false"/>
+          <w:bCs w:val="false"/>
+        </w:rPr>
+        <w:t xml:space="preserve">Файл ставиться, лише якщо збіглися розмір, контрольна сума, версія й ключ підпису. Інакше — пояснення, і нічого не встановлюється.</w:t>
+      </w:r>
+    </w:p>
+    <w:p>
+      <w:pPr>
+        <w:pStyle w:val="ListParagraph"/>
+        <w:numPr>
+          <w:ilvl w:val="0"/>
+          <w:numId w:val="3"/>
+        </w:numPr>
+        <w:spacing w:after="80"/>
+      </w:pPr>
+      <w:r>
+        <w:rPr>
+          <w:rFonts w:ascii="DejaVu Sans" w:cs="DejaVu Sans" w:eastAsia="DejaVu Sans" w:hAnsi="DejaVu Sans"/>
+          <w:b w:val="false"/>
+          <w:bCs w:val="false"/>
+        </w:rPr>
+        <w:t xml:space="preserve">Перший раз Android попросить дозвіл: «Відкрити дозвіл» → «Дозволити з цього джерела» → «Назад» — далі встановлення почнеться саме. Один дозвіл — один раз.</w:t>
+      </w:r>
+    </w:p>
+    <w:p>
+      <w:pPr>
+        <w:pStyle w:val="ListParagraph"/>
+        <w:numPr>
+          <w:ilvl w:val="0"/>
+          <w:numId w:val="3"/>
+        </w:numPr>
+        <w:spacing w:after="80"/>
+      </w:pPr>
+      <w:r>
+        <w:rPr>
+          <w:rFonts w:ascii="DejaVu Sans" w:cs="DejaVu Sans" w:eastAsia="DejaVu Sans" w:hAnsi="DejaVu Sans"/>
+          <w:b w:val="false"/>
+          <w:bCs w:val="false"/>
+        </w:rPr>
+        <w:t xml:space="preserve">Потрібен інтернет. Посилання на оновлення вже вбудоване — вставляти нічого не треба.</w:t>
+      </w:r>
+    </w:p>
+    <w:p>
+      <w:pPr>
+        <w:pStyle w:val="ListParagraph"/>
+        <w:numPr>
+          <w:ilvl w:val="0"/>
+          <w:numId w:val="3"/>
+        </w:numPr>
+        <w:spacing w:after="80"/>
+      </w:pPr>
+      <w:r>
+        <w:rPr>
+          <w:rFonts w:ascii="DejaVu Sans" w:cs="DejaVu Sans" w:eastAsia="DejaVu Sans" w:hAnsi="DejaVu Sans"/>
+          <w:b w:val="false"/>
+          <w:bCs w:val="false"/>
+        </w:rPr>
+        <w:t xml:space="preserve">Раз на день застосунок сам тихо перевіряє Диск і показує вікно, лише коли є новіша версія.</w:t>
+      </w:r>
+    </w:p>
+    <w:p>
+      <w:pPr>
+        <w:pStyle w:val="ListParagraph"/>
+        <w:numPr>
+          <w:ilvl w:val="0"/>
+          <w:numId w:val="3"/>
+        </w:numPr>
+        <w:spacing w:after="80"/>
+      </w:pPr>
+      <w:r>
+        <w:rPr>
+          <w:rFonts w:ascii="DejaVu Sans" w:cs="DejaVu Sans" w:eastAsia="DejaVu Sans" w:hAnsi="DejaVu Sans"/>
+          <w:b w:val="false"/>
+          <w:bCs w:val="false"/>
+        </w:rPr>
+        <w:t xml:space="preserve">Пункт «Опублікувати цю версію на Диск (автор)» — лише для телефона автора, який викладає нові версії. Звичайному користувачу він не потрібен.</w:t>
+      </w:r>
+    </w:p>
+    <w:p>
+      <w:r>
+        <w:br w:type="page"/>
+      </w:r>
+    </w:p>
+    <w:p>
+      <w:pPr>
+        <w:pStyle w:val="Heading1"/>
+      </w:pPr>
+      <w:r>
+        <w:rPr>
+          <w:rFonts w:ascii="DejaVu Sans" w:cs="DejaVu Sans" w:eastAsia="DejaVu Sans" w:hAnsi="DejaVu Sans"/>
+        </w:rPr>
+        <w:t xml:space="preserve">Налаштування</w:t>
+      </w:r>
+    </w:p>
+    <w:p>
+      <w:pPr>
+        <w:pStyle w:val="ListParagraph"/>
+        <w:numPr>
+          <w:ilvl w:val="0"/>
+          <w:numId w:val="3"/>
+        </w:numPr>
+        <w:spacing w:after="80"/>
+      </w:pPr>
+      <w:r>
+        <w:rPr>
+          <w:rFonts w:ascii="DejaVu Sans" w:cs="DejaVu Sans" w:eastAsia="DejaVu Sans" w:hAnsi="DejaVu Sans"/>
+          <w:b w:val="false"/>
+          <w:bCs w:val="false"/>
+        </w:rPr>
+        <w:t xml:space="preserve">«Відкривати dataset» — Modern або Classic за замовчуванням.</w:t>
+      </w:r>
+    </w:p>
+    <w:p>
+      <w:pPr>
+        <w:pStyle w:val="ListParagraph"/>
+        <w:numPr>
+          <w:ilvl w:val="0"/>
+          <w:numId w:val="3"/>
+        </w:numPr>
+        <w:spacing w:after="80"/>
+      </w:pPr>
+      <w:r>
+        <w:rPr>
+          <w:rFonts w:ascii="DejaVu Sans" w:cs="DejaVu Sans" w:eastAsia="DejaVu Sans" w:hAnsi="DejaVu Sans"/>
+          <w:b w:val="false"/>
+          <w:bCs w:val="false"/>
+        </w:rPr>
+        <w:t xml:space="preserve">«Масштаб за замовчуванням» — 85%, 100% (за шириною), 120%, 150%, 200%.</w:t>
+      </w:r>
+    </w:p>
+    <w:p>
+      <w:pPr>
+        <w:pStyle w:val="ListParagraph"/>
+        <w:numPr>
+          <w:ilvl w:val="0"/>
+          <w:numId w:val="3"/>
+        </w:numPr>
+        <w:spacing w:after="80"/>
+      </w:pPr>
+      <w:r>
+        <w:rPr>
+          <w:rFonts w:ascii="DejaVu Sans" w:cs="DejaVu Sans" w:eastAsia="DejaVu Sans" w:hAnsi="DejaVu Sans"/>
+          <w:b w:val="false"/>
+          <w:bCs w:val="false"/>
+        </w:rPr>
+        <w:t xml:space="preserve">«Крок кнопок − / +» — ±5%, ±10% або ±20%.</w:t>
+      </w:r>
+    </w:p>
+    <w:p>
+      <w:pPr>
+        <w:pStyle w:val="ListParagraph"/>
+        <w:numPr>
+          <w:ilvl w:val="0"/>
+          <w:numId w:val="3"/>
+        </w:numPr>
+        <w:spacing w:after="80"/>
+      </w:pPr>
+      <w:r>
+        <w:rPr>
+          <w:rFonts w:ascii="DejaVu Sans" w:cs="DejaVu Sans" w:eastAsia="DejaVu Sans" w:hAnsi="DejaVu Sans"/>
+          <w:b/>
+          <w:bCs/>
+        </w:rPr>
         <w:t xml:space="preserve">«Де зберігати нові томи»</w:t>
       </w:r>
       <w:r>
@@ -2533,6 +3030,32 @@
       <w:r>
         <w:rPr>
           <w:rFonts w:ascii="DejaVu Sans" w:cs="DejaVu Sans" w:eastAsia="DejaVu Sans" w:hAnsi="DejaVu Sans"/>
+          <w:b/>
+          <w:bCs/>
+        </w:rPr>
+        <w:t xml:space="preserve">«Залишки обірваних імпортів»</w:t>
+      </w:r>
+      <w:r>
+        <w:rPr>
+          <w:rFonts w:ascii="DejaVu Sans" w:cs="DejaVu Sans" w:eastAsia="DejaVu Sans" w:hAnsi="DejaVu Sans"/>
+          <w:b w:val="false"/>
+          <w:bCs w:val="false"/>
+        </w:rPr>
+        <w:t xml:space="preserve"> (розділ «Томи») — недороблені файли, що лишились, коли імпорт або архів тому обірвався. Спершу список назв, прибрати — лише кнопкою «Прибрати». Готові томи цим не зачіпаються.</w:t>
+      </w:r>
+    </w:p>
+    <w:p>
+      <w:pPr>
+        <w:pStyle w:val="ListParagraph"/>
+        <w:numPr>
+          <w:ilvl w:val="0"/>
+          <w:numId w:val="3"/>
+        </w:numPr>
+        <w:spacing w:after="80"/>
+      </w:pPr>
+      <w:r>
+        <w:rPr>
+          <w:rFonts w:ascii="DejaVu Sans" w:cs="DejaVu Sans" w:eastAsia="DejaVu Sans" w:hAnsi="DejaVu Sans"/>
           <w:b w:val="false"/>
           <w:bCs w:val="false"/>
         </w:rPr>
@@ -2576,6 +3099,24 @@
       </w:r>
     </w:p>
     <w:p>
+      <w:pPr>
+        <w:pStyle w:val="ListParagraph"/>
+        <w:numPr>
+          <w:ilvl w:val="0"/>
+          <w:numId w:val="3"/>
+        </w:numPr>
+        <w:spacing w:after="80"/>
+      </w:pPr>
+      <w:r>
+        <w:rPr>
+          <w:rFonts w:ascii="DejaVu Sans" w:cs="DejaVu Sans" w:eastAsia="DejaVu Sans" w:hAnsi="DejaVu Sans"/>
+          <w:b w:val="false"/>
+          <w:bCs w:val="false"/>
+        </w:rPr>
+        <w:t xml:space="preserve">«Про програму» → «Оновлення застосунку» — див. розділ «Оновлення застосунку з Google Диска».</w:t>
+      </w:r>
+    </w:p>
+    <w:p>
       <w:r>
         <w:br w:type="page"/>
       </w:r>
@@ -2643,6 +3184,42 @@
           <w:bCs w:val="false"/>
         </w:rPr>
         <w:t xml:space="preserve">Видалити проєкт чи том зі списку — не те саме, що видалити файли: файли на телефоні лишаються.</w:t>
+      </w:r>
+    </w:p>
+    <w:p>
+      <w:pPr>
+        <w:pStyle w:val="ListParagraph"/>
+        <w:numPr>
+          <w:ilvl w:val="0"/>
+          <w:numId w:val="3"/>
+        </w:numPr>
+        <w:spacing w:after="80"/>
+      </w:pPr>
+      <w:r>
+        <w:rPr>
+          <w:rFonts w:ascii="DejaVu Sans" w:cs="DejaVu Sans" w:eastAsia="DejaVu Sans" w:hAnsi="DejaVu Sans"/>
+          <w:b w:val="false"/>
+          <w:bCs w:val="false"/>
+        </w:rPr>
+        <w:t xml:space="preserve">Файли томів стирає лише «Видалити томи разом з файлами…» — з окремим підтвердженням «Видалити назавжди».</w:t>
+      </w:r>
+    </w:p>
+    <w:p>
+      <w:pPr>
+        <w:pStyle w:val="ListParagraph"/>
+        <w:numPr>
+          <w:ilvl w:val="0"/>
+          <w:numId w:val="3"/>
+        </w:numPr>
+        <w:spacing w:after="80"/>
+      </w:pPr>
+      <w:r>
+        <w:rPr>
+          <w:rFonts w:ascii="DejaVu Sans" w:cs="DejaVu Sans" w:eastAsia="DejaVu Sans" w:hAnsi="DejaVu Sans"/>
+          <w:b w:val="false"/>
+          <w:bCs w:val="false"/>
+        </w:rPr>
+        <w:t xml:space="preserve">Файли томів — лише для застосунку: Галерея і служба медіа їх не індексують.</w:t>
       </w:r>
     </w:p>
     <w:p>
@@ -2676,7 +3253,7 @@
           <w:sz w:val="18"/>
           <w:szCs w:val="18"/>
         </w:rPr>
-        <w:t xml:space="preserve">Посібник зібрано з коду застосунку v0.5.141. Якщо кнопка на телефоні називається інакше — правда за телефоном.</w:t>
+        <w:t xml:space="preserve">Посібник зібрано з коду застосунку v0.5.153. Якщо кнопка на телефоні називається інакше — правда за телефоном.</w:t>
       </w:r>
     </w:p>
     <w:sectPr>

</xml_diff>

<commit_message>
v0.5.153: Core Stable scope agreed; user guide catches up with v0.5.142–0.5.152 (#414)
- docs/plans/2026-10-17_CORE_STABLE_SCOPE.md (owner 20:10 «Так»)
- guide: delete volumes with files, app update from Google Drive, leftovers of
  broken-off imports, «Знайдено файлів: N», version line; rebuilt MD/Word/PDF/app page
- whats_new, test_v05153_guide_core_stable, ledger, STATUS


Claude-Session: https://claude.ai/code/session_01LFFBa5wqqsfDYvUqkzLrnE

Co-authored-by: Claude <noreply@anthropic.com>
</commit_message>
<xml_diff>
--- a/docs/ua/Posibnyk-Renault-Docs.docx
+++ b/docs/ua/Posibnyk-Renault-Docs.docx
@@ -13,7 +13,7 @@
           <w:sz w:val="18"/>
           <w:szCs w:val="18"/>
         </w:rPr>
-        <w:t xml:space="preserve">RENAULT DOCS · v0.5.141 · 17.10.2026</w:t>
+        <w:t xml:space="preserve">RENAULT DOCS · v0.5.153 · 17.10.2026</w:t>
       </w:r>
     </w:p>
     <w:p>
@@ -200,6 +200,36 @@
           <w:rFonts w:ascii="DejaVu Sans" w:cs="DejaVu Sans" w:eastAsia="DejaVu Sans" w:hAnsi="DejaVu Sans"/>
         </w:rPr>
         <w:t xml:space="preserve">Довгі операції і «Скасувати»</w:t>
+      </w:r>
+    </w:p>
+    <w:p>
+      <w:pPr>
+        <w:pStyle w:val="ListParagraph"/>
+        <w:numPr>
+          <w:ilvl w:val="0"/>
+          <w:numId w:val="2"/>
+        </w:numPr>
+      </w:pPr>
+      <w:r>
+        <w:rPr>
+          <w:rFonts w:ascii="DejaVu Sans" w:cs="DejaVu Sans" w:eastAsia="DejaVu Sans" w:hAnsi="DejaVu Sans"/>
+        </w:rPr>
+        <w:t xml:space="preserve">Видалити томи разом з файлами</w:t>
+      </w:r>
+    </w:p>
+    <w:p>
+      <w:pPr>
+        <w:pStyle w:val="ListParagraph"/>
+        <w:numPr>
+          <w:ilvl w:val="0"/>
+          <w:numId w:val="2"/>
+        </w:numPr>
+      </w:pPr>
+      <w:r>
+        <w:rPr>
+          <w:rFonts w:ascii="DejaVu Sans" w:cs="DejaVu Sans" w:eastAsia="DejaVu Sans" w:hAnsi="DejaVu Sans"/>
+        </w:rPr>
+        <w:t xml:space="preserve">Оновлення застосунку з Google Диска</w:t>
       </w:r>
     </w:p>
     <w:p>
@@ -594,7 +624,38 @@
           <w:b w:val="false"/>
           <w:bCs w:val="false"/>
         </w:rPr>
+        <w:t xml:space="preserve">«Видалити томи разом з файлами…» — стирає вибрані томи разом з їхніми файлами (див. розділ «Видалити томи разом з файлами»).</w:t>
+      </w:r>
+    </w:p>
+    <w:p>
+      <w:pPr>
+        <w:pStyle w:val="ListParagraph"/>
+        <w:numPr>
+          <w:ilvl w:val="0"/>
+          <w:numId w:val="3"/>
+        </w:numPr>
+        <w:spacing w:after="80"/>
+      </w:pPr>
+      <w:r>
+        <w:rPr>
+          <w:rFonts w:ascii="DejaVu Sans" w:cs="DejaVu Sans" w:eastAsia="DejaVu Sans" w:hAnsi="DejaVu Sans"/>
+          <w:b w:val="false"/>
+          <w:bCs w:val="false"/>
+        </w:rPr>
         <w:t xml:space="preserve">«Видалити проєкт» — прибирає проєкт зі списку. Файли на телефоні не видаляються.</w:t>
+      </w:r>
+    </w:p>
+    <w:p>
+      <w:pPr>
+        <w:spacing w:after="140"/>
+      </w:pPr>
+      <w:r>
+        <w:rPr>
+          <w:rFonts w:ascii="DejaVu Sans" w:cs="DejaVu Sans" w:eastAsia="DejaVu Sans" w:hAnsi="DejaVu Sans"/>
+          <w:b w:val="false"/>
+          <w:bCs w:val="false"/>
+        </w:rPr>
+        <w:t xml:space="preserve">Під панеллю «Додати» завжди видно рядок з версією застосунку.</w:t>
       </w:r>
     </w:p>
     <w:p>
@@ -2408,6 +2469,42 @@
       </w:r>
     </w:p>
     <w:p>
+      <w:pPr>
+        <w:pStyle w:val="ListParagraph"/>
+        <w:numPr>
+          <w:ilvl w:val="0"/>
+          <w:numId w:val="3"/>
+        </w:numPr>
+        <w:spacing w:after="80"/>
+      </w:pPr>
+      <w:r>
+        <w:rPr>
+          <w:rFonts w:ascii="DejaVu Sans" w:cs="DejaVu Sans" w:eastAsia="DejaVu Sans" w:hAnsi="DejaVu Sans"/>
+          <w:b w:val="false"/>
+          <w:bCs w:val="false"/>
+        </w:rPr>
+        <w:t xml:space="preserve">Поки застосунок шукає файли тому (на початку підготовки чи стирання), смуга біжить через усю ширину без відсотків, а під нею видно «Знайдено файлів: N».</w:t>
+      </w:r>
+    </w:p>
+    <w:p>
+      <w:pPr>
+        <w:pStyle w:val="ListParagraph"/>
+        <w:numPr>
+          <w:ilvl w:val="0"/>
+          <w:numId w:val="3"/>
+        </w:numPr>
+        <w:spacing w:after="80"/>
+      </w:pPr>
+      <w:r>
+        <w:rPr>
+          <w:rFonts w:ascii="DejaVu Sans" w:cs="DejaVu Sans" w:eastAsia="DejaVu Sans" w:hAnsi="DejaVu Sans"/>
+          <w:b w:val="false"/>
+          <w:bCs w:val="false"/>
+        </w:rPr>
+        <w:t xml:space="preserve">Довгий рядок на картці (код тому, дата) переходить на другий рядок, а не обрізається посередині.</w:t>
+      </w:r>
+    </w:p>
+    <w:p>
       <w:r>
         <w:br w:type="page"/>
       </w:r>
@@ -2420,78 +2517,478 @@
         <w:rPr>
           <w:rFonts w:ascii="DejaVu Sans" w:cs="DejaVu Sans" w:eastAsia="DejaVu Sans" w:hAnsi="DejaVu Sans"/>
         </w:rPr>
-        <w:t xml:space="preserve">Налаштування</w:t>
-      </w:r>
-    </w:p>
-    <w:p>
-      <w:pPr>
-        <w:pStyle w:val="ListParagraph"/>
-        <w:numPr>
-          <w:ilvl w:val="0"/>
-          <w:numId w:val="3"/>
-        </w:numPr>
-        <w:spacing w:after="80"/>
-      </w:pPr>
-      <w:r>
-        <w:rPr>
-          <w:rFonts w:ascii="DejaVu Sans" w:cs="DejaVu Sans" w:eastAsia="DejaVu Sans" w:hAnsi="DejaVu Sans"/>
-          <w:b w:val="false"/>
-          <w:bCs w:val="false"/>
-        </w:rPr>
-        <w:t xml:space="preserve">«Відкривати dataset» — Modern або Classic за замовчуванням.</w:t>
-      </w:r>
-    </w:p>
-    <w:p>
-      <w:pPr>
-        <w:pStyle w:val="ListParagraph"/>
-        <w:numPr>
-          <w:ilvl w:val="0"/>
-          <w:numId w:val="3"/>
-        </w:numPr>
-        <w:spacing w:after="80"/>
-      </w:pPr>
-      <w:r>
-        <w:rPr>
-          <w:rFonts w:ascii="DejaVu Sans" w:cs="DejaVu Sans" w:eastAsia="DejaVu Sans" w:hAnsi="DejaVu Sans"/>
-          <w:b w:val="false"/>
-          <w:bCs w:val="false"/>
-        </w:rPr>
-        <w:t xml:space="preserve">«Масштаб за замовчуванням» — 85%, 100% (за шириною), 120%, 150%, 200%.</w:t>
-      </w:r>
-    </w:p>
-    <w:p>
-      <w:pPr>
-        <w:pStyle w:val="ListParagraph"/>
-        <w:numPr>
-          <w:ilvl w:val="0"/>
-          <w:numId w:val="3"/>
-        </w:numPr>
-        <w:spacing w:after="80"/>
-      </w:pPr>
-      <w:r>
-        <w:rPr>
-          <w:rFonts w:ascii="DejaVu Sans" w:cs="DejaVu Sans" w:eastAsia="DejaVu Sans" w:hAnsi="DejaVu Sans"/>
-          <w:b w:val="false"/>
-          <w:bCs w:val="false"/>
-        </w:rPr>
-        <w:t xml:space="preserve">«Крок кнопок − / +» — ±5%, ±10% або ±20%.</w:t>
-      </w:r>
-    </w:p>
-    <w:p>
-      <w:pPr>
-        <w:pStyle w:val="ListParagraph"/>
-        <w:numPr>
-          <w:ilvl w:val="0"/>
-          <w:numId w:val="3"/>
-        </w:numPr>
-        <w:spacing w:after="80"/>
-      </w:pPr>
+        <w:t xml:space="preserve">Видалити томи разом з файлами</w:t>
+      </w:r>
+    </w:p>
+    <w:p>
+      <w:pPr>
+        <w:spacing w:after="140"/>
+      </w:pPr>
+      <w:r>
+        <w:rPr>
+          <w:rFonts w:ascii="DejaVu Sans" w:cs="DejaVu Sans" w:eastAsia="DejaVu Sans" w:hAnsi="DejaVu Sans"/>
+          <w:b w:val="false"/>
+          <w:bCs w:val="false"/>
+        </w:rPr>
+        <w:t xml:space="preserve">Звичайне «Видалити з проєкту» (⋮ тому) прибирає том лише зі списку — файли лишаються. Щоб звільнити місце, є окрема дія, яка стирає й файли.</w:t>
+      </w:r>
+    </w:p>
+    <w:p>
+      <w:pPr>
+        <w:spacing w:after="160" w:before="120" w:line="240" w:lineRule="auto"/>
+        <w:jc w:val="center"/>
+      </w:pPr>
+      <w:r>
+        <w:drawing>
+          <wp:inline distT="0" distB="0" distL="0" distR="0">
+            <wp:extent cx="4076700" cy="6858000"/>
+            <wp:effectExtent t="0" r="0" b="0" l="0"/>
+            <wp:docPr id="1" name="" descr="" title=""/>
+            <wp:cNvGraphicFramePr>
+              <a:graphicFrameLocks xmlns:a="http://schemas.openxmlformats.org/drawingml/2006/main" noChangeAspect="1"/>
+            </wp:cNvGraphicFramePr>
+            <a:graphic xmlns:a="http://schemas.openxmlformats.org/drawingml/2006/main">
+              <a:graphicData uri="http://schemas.openxmlformats.org/drawingml/2006/picture">
+                <pic:pic xmlns:pic="http://schemas.openxmlformats.org/drawingml/2006/picture">
+                  <pic:nvPicPr>
+                    <pic:cNvPr id="0" name="" descr=""/>
+                    <pic:cNvPicPr>
+                      <a:picLocks noChangeAspect="1" noChangeArrowheads="1"/>
+                    </pic:cNvPicPr>
+                  </pic:nvPicPr>
+                  <pic:blipFill>
+                    <a:blip r:embed="rId18" cstate="none"/>
+                    <a:srcRect/>
+                    <a:stretch>
+                      <a:fillRect/>
+                    </a:stretch>
+                  </pic:blipFill>
+                  <pic:spPr bwMode="auto">
+                    <a:xfrm>
+                      <a:off x="0" y="0"/>
+                      <a:ext cx="4076700" cy="6858000"/>
+                    </a:xfrm>
+                    <a:prstGeom prst="rect">
+                      <a:avLst/>
+                    </a:prstGeom>
+                  </pic:spPr>
+                </pic:pic>
+              </a:graphicData>
+            </a:graphic>
+          </wp:inline>
+        </w:drawing>
+      </w:r>
+    </w:p>
+    <w:p>
+      <w:pPr>
+        <w:pStyle w:val="ListParagraph"/>
+        <w:numPr>
+          <w:ilvl w:val="0"/>
+          <w:numId w:val="3"/>
+        </w:numPr>
+        <w:spacing w:after="80"/>
+      </w:pPr>
+      <w:r>
+        <w:rPr>
+          <w:rFonts w:ascii="DejaVu Sans" w:cs="DejaVu Sans" w:eastAsia="DejaVu Sans" w:hAnsi="DejaVu Sans"/>
+          <w:b w:val="false"/>
+          <w:bCs w:val="false"/>
+        </w:rPr>
+        <w:t xml:space="preserve">Це </w:t>
+      </w:r>
       <w:r>
         <w:rPr>
           <w:rFonts w:ascii="DejaVu Sans" w:cs="DejaVu Sans" w:eastAsia="DejaVu Sans" w:hAnsi="DejaVu Sans"/>
           <w:b/>
           <w:bCs/>
         </w:rPr>
+        <w:t xml:space="preserve">назавжди</w:t>
+      </w:r>
+      <w:r>
+        <w:rPr>
+          <w:rFonts w:ascii="DejaVu Sans" w:cs="DejaVu Sans" w:eastAsia="DejaVu Sans" w:hAnsi="DejaVu Sans"/>
+          <w:b w:val="false"/>
+          <w:bCs w:val="false"/>
+        </w:rPr>
+        <w:t xml:space="preserve">: повернути том можна лише новим імпортом (.rdpkg, .rdproject або «Готові проєкти»).</w:t>
+      </w:r>
+    </w:p>
+    <w:p>
+      <w:pPr>
+        <w:pStyle w:val="ListParagraph"/>
+        <w:numPr>
+          <w:ilvl w:val="0"/>
+          <w:numId w:val="3"/>
+        </w:numPr>
+        <w:spacing w:after="80"/>
+      </w:pPr>
+      <w:r>
+        <w:rPr>
+          <w:rFonts w:ascii="DejaVu Sans" w:cs="DejaVu Sans" w:eastAsia="DejaVu Sans" w:hAnsi="DejaVu Sans"/>
+          <w:b w:val="false"/>
+          <w:bCs w:val="false"/>
+        </w:rPr>
+        <w:t xml:space="preserve">Підтвердження окреме, з кількістю томів. Без «Видалити назавжди» нічого не стирається.</w:t>
+      </w:r>
+    </w:p>
+    <w:p>
+      <w:pPr>
+        <w:pStyle w:val="ListParagraph"/>
+        <w:numPr>
+          <w:ilvl w:val="0"/>
+          <w:numId w:val="3"/>
+        </w:numPr>
+        <w:spacing w:after="80"/>
+      </w:pPr>
+      <w:r>
+        <w:rPr>
+          <w:rFonts w:ascii="DejaVu Sans" w:cs="DejaVu Sans" w:eastAsia="DejaVu Sans" w:hAnsi="DejaVu Sans"/>
+          <w:b w:val="false"/>
+          <w:bCs w:val="false"/>
+        </w:rPr>
+        <w:t xml:space="preserve">Томи прибираються зі списку миттєво, а файли стираються у фоні — смуга на головній і в шторці. Застосунок можна згорнути.</w:t>
+      </w:r>
+    </w:p>
+    <w:p>
+      <w:pPr>
+        <w:pStyle w:val="ListParagraph"/>
+        <w:numPr>
+          <w:ilvl w:val="0"/>
+          <w:numId w:val="3"/>
+        </w:numPr>
+        <w:spacing w:after="80"/>
+      </w:pPr>
+      <w:r>
+        <w:rPr>
+          <w:rFonts w:ascii="DejaVu Sans" w:cs="DejaVu Sans" w:eastAsia="DejaVu Sans" w:hAnsi="DejaVu Sans"/>
+          <w:b w:val="false"/>
+          <w:bCs w:val="false"/>
+        </w:rPr>
+        <w:t xml:space="preserve">Розпакований том — це тисячі дрібних файлів, на карті пам'яті старого телефона стирання може йти пів години. Том одним файлом стирається за мить.</w:t>
+      </w:r>
+    </w:p>
+    <w:p>
+      <w:pPr>
+        <w:pStyle w:val="ListParagraph"/>
+        <w:numPr>
+          <w:ilvl w:val="0"/>
+          <w:numId w:val="3"/>
+        </w:numPr>
+        <w:spacing w:after="80"/>
+      </w:pPr>
+      <w:r>
+        <w:rPr>
+          <w:rFonts w:ascii="DejaVu Sans" w:cs="DejaVu Sans" w:eastAsia="DejaVu Sans" w:hAnsi="DejaVu Sans"/>
+          <w:b w:val="false"/>
+          <w:bCs w:val="false"/>
+        </w:rPr>
+        <w:t xml:space="preserve">Якщо застосунок закрили або телефон перезапустився посеред стирання, воно продовжиться саме, коли знову відкриєш головний екран. Поки стирання не скінчилось, у меню ⋮ проєкту видно «Стираю у фоні файли видалених томів · лишилось N».</w:t>
+      </w:r>
+    </w:p>
+    <w:p>
+      <w:pPr>
+        <w:pStyle w:val="ListParagraph"/>
+        <w:numPr>
+          <w:ilvl w:val="0"/>
+          <w:numId w:val="3"/>
+        </w:numPr>
+        <w:spacing w:after="80"/>
+      </w:pPr>
+      <w:r>
+        <w:rPr>
+          <w:rFonts w:ascii="DejaVu Sans" w:cs="DejaVu Sans" w:eastAsia="DejaVu Sans" w:hAnsi="DejaVu Sans"/>
+          <w:b w:val="false"/>
+          <w:bCs w:val="false"/>
+        </w:rPr>
+        <w:t xml:space="preserve">Оригінальні архіви, файли .rdpkg / .rdproject поза застосунком і файли на Google Диску не чіпаються.</w:t>
+      </w:r>
+    </w:p>
+    <w:p>
+      <w:r>
+        <w:br w:type="page"/>
+      </w:r>
+    </w:p>
+    <w:p>
+      <w:pPr>
+        <w:pStyle w:val="Heading1"/>
+      </w:pPr>
+      <w:r>
+        <w:rPr>
+          <w:rFonts w:ascii="DejaVu Sans" w:cs="DejaVu Sans" w:eastAsia="DejaVu Sans" w:hAnsi="DejaVu Sans"/>
+        </w:rPr>
+        <w:t xml:space="preserve">Оновлення застосунку з Google Диска</w:t>
+      </w:r>
+    </w:p>
+    <w:p>
+      <w:pPr>
+        <w:spacing w:after="140"/>
+      </w:pPr>
+      <w:r>
+        <w:rPr>
+          <w:rFonts w:ascii="DejaVu Sans" w:cs="DejaVu Sans" w:eastAsia="DejaVu Sans" w:hAnsi="DejaVu Sans"/>
+          <w:b w:val="false"/>
+          <w:bCs w:val="false"/>
+        </w:rPr>
+        <w:t xml:space="preserve">Нову версію можна отримати прямо в застосунку, без меню Termux: Налаштування → «Про програму» → «Оновлення застосунку» → «Перевірити оновлення».</w:t>
+      </w:r>
+    </w:p>
+    <w:p>
+      <w:pPr>
+        <w:spacing w:after="160" w:before="120" w:line="240" w:lineRule="auto"/>
+        <w:jc w:val="center"/>
+      </w:pPr>
+      <w:r>
+        <w:drawing>
+          <wp:inline distT="0" distB="0" distL="0" distR="0">
+            <wp:extent cx="5715000" cy="5105400"/>
+            <wp:effectExtent t="0" r="0" b="0" l="0"/>
+            <wp:docPr id="1" name="" descr="" title=""/>
+            <wp:cNvGraphicFramePr>
+              <a:graphicFrameLocks xmlns:a="http://schemas.openxmlformats.org/drawingml/2006/main" noChangeAspect="1"/>
+            </wp:cNvGraphicFramePr>
+            <a:graphic xmlns:a="http://schemas.openxmlformats.org/drawingml/2006/main">
+              <a:graphicData uri="http://schemas.openxmlformats.org/drawingml/2006/picture">
+                <pic:pic xmlns:pic="http://schemas.openxmlformats.org/drawingml/2006/picture">
+                  <pic:nvPicPr>
+                    <pic:cNvPr id="0" name="" descr=""/>
+                    <pic:cNvPicPr>
+                      <a:picLocks noChangeAspect="1" noChangeArrowheads="1"/>
+                    </pic:cNvPicPr>
+                  </pic:nvPicPr>
+                  <pic:blipFill>
+                    <a:blip r:embed="rId19" cstate="none"/>
+                    <a:srcRect/>
+                    <a:stretch>
+                      <a:fillRect/>
+                    </a:stretch>
+                  </pic:blipFill>
+                  <pic:spPr bwMode="auto">
+                    <a:xfrm>
+                      <a:off x="0" y="0"/>
+                      <a:ext cx="5715000" cy="5105400"/>
+                    </a:xfrm>
+                    <a:prstGeom prst="rect">
+                      <a:avLst/>
+                    </a:prstGeom>
+                  </pic:spPr>
+                </pic:pic>
+              </a:graphicData>
+            </a:graphic>
+          </wp:inline>
+        </w:drawing>
+      </w:r>
+    </w:p>
+    <w:p>
+      <w:pPr>
+        <w:pStyle w:val="ListParagraph"/>
+        <w:numPr>
+          <w:ilvl w:val="0"/>
+          <w:numId w:val="3"/>
+        </w:numPr>
+        <w:spacing w:after="80"/>
+      </w:pPr>
+      <w:r>
+        <w:rPr>
+          <w:rFonts w:ascii="DejaVu Sans" w:cs="DejaVu Sans" w:eastAsia="DejaVu Sans" w:hAnsi="DejaVu Sans"/>
+          <w:b w:val="false"/>
+          <w:bCs w:val="false"/>
+        </w:rPr>
+        <w:t xml:space="preserve">Оновлювати не обов'язково — «Не зараз» нічого не змінює.</w:t>
+      </w:r>
+    </w:p>
+    <w:p>
+      <w:pPr>
+        <w:pStyle w:val="ListParagraph"/>
+        <w:numPr>
+          <w:ilvl w:val="0"/>
+          <w:numId w:val="3"/>
+        </w:numPr>
+        <w:spacing w:after="80"/>
+      </w:pPr>
+      <w:r>
+        <w:rPr>
+          <w:rFonts w:ascii="DejaVu Sans" w:cs="DejaVu Sans" w:eastAsia="DejaVu Sans" w:hAnsi="DejaVu Sans"/>
+          <w:b w:val="false"/>
+          <w:bCs w:val="false"/>
+        </w:rPr>
+        <w:t xml:space="preserve">Проєкти, томи й налаштування після оновлення лишаються.</w:t>
+      </w:r>
+    </w:p>
+    <w:p>
+      <w:pPr>
+        <w:pStyle w:val="ListParagraph"/>
+        <w:numPr>
+          <w:ilvl w:val="0"/>
+          <w:numId w:val="3"/>
+        </w:numPr>
+        <w:spacing w:after="80"/>
+      </w:pPr>
+      <w:r>
+        <w:rPr>
+          <w:rFonts w:ascii="DejaVu Sans" w:cs="DejaVu Sans" w:eastAsia="DejaVu Sans" w:hAnsi="DejaVu Sans"/>
+          <w:b w:val="false"/>
+          <w:bCs w:val="false"/>
+        </w:rPr>
+        <w:t xml:space="preserve">Файл ставиться, лише якщо збіглися розмір, контрольна сума, версія й ключ підпису. Інакше — пояснення, і нічого не встановлюється.</w:t>
+      </w:r>
+    </w:p>
+    <w:p>
+      <w:pPr>
+        <w:pStyle w:val="ListParagraph"/>
+        <w:numPr>
+          <w:ilvl w:val="0"/>
+          <w:numId w:val="3"/>
+        </w:numPr>
+        <w:spacing w:after="80"/>
+      </w:pPr>
+      <w:r>
+        <w:rPr>
+          <w:rFonts w:ascii="DejaVu Sans" w:cs="DejaVu Sans" w:eastAsia="DejaVu Sans" w:hAnsi="DejaVu Sans"/>
+          <w:b w:val="false"/>
+          <w:bCs w:val="false"/>
+        </w:rPr>
+        <w:t xml:space="preserve">Перший раз Android попросить дозвіл: «Відкрити дозвіл» → «Дозволити з цього джерела» → «Назад» — далі встановлення почнеться саме. Один дозвіл — один раз.</w:t>
+      </w:r>
+    </w:p>
+    <w:p>
+      <w:pPr>
+        <w:pStyle w:val="ListParagraph"/>
+        <w:numPr>
+          <w:ilvl w:val="0"/>
+          <w:numId w:val="3"/>
+        </w:numPr>
+        <w:spacing w:after="80"/>
+      </w:pPr>
+      <w:r>
+        <w:rPr>
+          <w:rFonts w:ascii="DejaVu Sans" w:cs="DejaVu Sans" w:eastAsia="DejaVu Sans" w:hAnsi="DejaVu Sans"/>
+          <w:b w:val="false"/>
+          <w:bCs w:val="false"/>
+        </w:rPr>
+        <w:t xml:space="preserve">Потрібен інтернет. Посилання на оновлення вже вбудоване — вставляти нічого не треба.</w:t>
+      </w:r>
+    </w:p>
+    <w:p>
+      <w:pPr>
+        <w:pStyle w:val="ListParagraph"/>
+        <w:numPr>
+          <w:ilvl w:val="0"/>
+          <w:numId w:val="3"/>
+        </w:numPr>
+        <w:spacing w:after="80"/>
+      </w:pPr>
+      <w:r>
+        <w:rPr>
+          <w:rFonts w:ascii="DejaVu Sans" w:cs="DejaVu Sans" w:eastAsia="DejaVu Sans" w:hAnsi="DejaVu Sans"/>
+          <w:b w:val="false"/>
+          <w:bCs w:val="false"/>
+        </w:rPr>
+        <w:t xml:space="preserve">Раз на день застосунок сам тихо перевіряє Диск і показує вікно, лише коли є новіша версія.</w:t>
+      </w:r>
+    </w:p>
+    <w:p>
+      <w:pPr>
+        <w:pStyle w:val="ListParagraph"/>
+        <w:numPr>
+          <w:ilvl w:val="0"/>
+          <w:numId w:val="3"/>
+        </w:numPr>
+        <w:spacing w:after="80"/>
+      </w:pPr>
+      <w:r>
+        <w:rPr>
+          <w:rFonts w:ascii="DejaVu Sans" w:cs="DejaVu Sans" w:eastAsia="DejaVu Sans" w:hAnsi="DejaVu Sans"/>
+          <w:b w:val="false"/>
+          <w:bCs w:val="false"/>
+        </w:rPr>
+        <w:t xml:space="preserve">Пункт «Опублікувати цю версію на Диск (автор)» — лише для телефона автора, який викладає нові версії. Звичайному користувачу він не потрібен.</w:t>
+      </w:r>
+    </w:p>
+    <w:p>
+      <w:r>
+        <w:br w:type="page"/>
+      </w:r>
+    </w:p>
+    <w:p>
+      <w:pPr>
+        <w:pStyle w:val="Heading1"/>
+      </w:pPr>
+      <w:r>
+        <w:rPr>
+          <w:rFonts w:ascii="DejaVu Sans" w:cs="DejaVu Sans" w:eastAsia="DejaVu Sans" w:hAnsi="DejaVu Sans"/>
+        </w:rPr>
+        <w:t xml:space="preserve">Налаштування</w:t>
+      </w:r>
+    </w:p>
+    <w:p>
+      <w:pPr>
+        <w:pStyle w:val="ListParagraph"/>
+        <w:numPr>
+          <w:ilvl w:val="0"/>
+          <w:numId w:val="3"/>
+        </w:numPr>
+        <w:spacing w:after="80"/>
+      </w:pPr>
+      <w:r>
+        <w:rPr>
+          <w:rFonts w:ascii="DejaVu Sans" w:cs="DejaVu Sans" w:eastAsia="DejaVu Sans" w:hAnsi="DejaVu Sans"/>
+          <w:b w:val="false"/>
+          <w:bCs w:val="false"/>
+        </w:rPr>
+        <w:t xml:space="preserve">«Відкривати dataset» — Modern або Classic за замовчуванням.</w:t>
+      </w:r>
+    </w:p>
+    <w:p>
+      <w:pPr>
+        <w:pStyle w:val="ListParagraph"/>
+        <w:numPr>
+          <w:ilvl w:val="0"/>
+          <w:numId w:val="3"/>
+        </w:numPr>
+        <w:spacing w:after="80"/>
+      </w:pPr>
+      <w:r>
+        <w:rPr>
+          <w:rFonts w:ascii="DejaVu Sans" w:cs="DejaVu Sans" w:eastAsia="DejaVu Sans" w:hAnsi="DejaVu Sans"/>
+          <w:b w:val="false"/>
+          <w:bCs w:val="false"/>
+        </w:rPr>
+        <w:t xml:space="preserve">«Масштаб за замовчуванням» — 85%, 100% (за шириною), 120%, 150%, 200%.</w:t>
+      </w:r>
+    </w:p>
+    <w:p>
+      <w:pPr>
+        <w:pStyle w:val="ListParagraph"/>
+        <w:numPr>
+          <w:ilvl w:val="0"/>
+          <w:numId w:val="3"/>
+        </w:numPr>
+        <w:spacing w:after="80"/>
+      </w:pPr>
+      <w:r>
+        <w:rPr>
+          <w:rFonts w:ascii="DejaVu Sans" w:cs="DejaVu Sans" w:eastAsia="DejaVu Sans" w:hAnsi="DejaVu Sans"/>
+          <w:b w:val="false"/>
+          <w:bCs w:val="false"/>
+        </w:rPr>
+        <w:t xml:space="preserve">«Крок кнопок − / +» — ±5%, ±10% або ±20%.</w:t>
+      </w:r>
+    </w:p>
+    <w:p>
+      <w:pPr>
+        <w:pStyle w:val="ListParagraph"/>
+        <w:numPr>
+          <w:ilvl w:val="0"/>
+          <w:numId w:val="3"/>
+        </w:numPr>
+        <w:spacing w:after="80"/>
+      </w:pPr>
+      <w:r>
+        <w:rPr>
+          <w:rFonts w:ascii="DejaVu Sans" w:cs="DejaVu Sans" w:eastAsia="DejaVu Sans" w:hAnsi="DejaVu Sans"/>
+          <w:b/>
+          <w:bCs/>
+        </w:rPr>
         <w:t xml:space="preserve">«Де зберігати нові томи»</w:t>
       </w:r>
       <w:r>
@@ -2533,6 +3030,32 @@
       <w:r>
         <w:rPr>
           <w:rFonts w:ascii="DejaVu Sans" w:cs="DejaVu Sans" w:eastAsia="DejaVu Sans" w:hAnsi="DejaVu Sans"/>
+          <w:b/>
+          <w:bCs/>
+        </w:rPr>
+        <w:t xml:space="preserve">«Залишки обірваних імпортів»</w:t>
+      </w:r>
+      <w:r>
+        <w:rPr>
+          <w:rFonts w:ascii="DejaVu Sans" w:cs="DejaVu Sans" w:eastAsia="DejaVu Sans" w:hAnsi="DejaVu Sans"/>
+          <w:b w:val="false"/>
+          <w:bCs w:val="false"/>
+        </w:rPr>
+        <w:t xml:space="preserve"> (розділ «Томи») — недороблені файли, що лишились, коли імпорт або архів тому обірвався. Спершу список назв, прибрати — лише кнопкою «Прибрати». Готові томи цим не зачіпаються.</w:t>
+      </w:r>
+    </w:p>
+    <w:p>
+      <w:pPr>
+        <w:pStyle w:val="ListParagraph"/>
+        <w:numPr>
+          <w:ilvl w:val="0"/>
+          <w:numId w:val="3"/>
+        </w:numPr>
+        <w:spacing w:after="80"/>
+      </w:pPr>
+      <w:r>
+        <w:rPr>
+          <w:rFonts w:ascii="DejaVu Sans" w:cs="DejaVu Sans" w:eastAsia="DejaVu Sans" w:hAnsi="DejaVu Sans"/>
           <w:b w:val="false"/>
           <w:bCs w:val="false"/>
         </w:rPr>
@@ -2576,6 +3099,24 @@
       </w:r>
     </w:p>
     <w:p>
+      <w:pPr>
+        <w:pStyle w:val="ListParagraph"/>
+        <w:numPr>
+          <w:ilvl w:val="0"/>
+          <w:numId w:val="3"/>
+        </w:numPr>
+        <w:spacing w:after="80"/>
+      </w:pPr>
+      <w:r>
+        <w:rPr>
+          <w:rFonts w:ascii="DejaVu Sans" w:cs="DejaVu Sans" w:eastAsia="DejaVu Sans" w:hAnsi="DejaVu Sans"/>
+          <w:b w:val="false"/>
+          <w:bCs w:val="false"/>
+        </w:rPr>
+        <w:t xml:space="preserve">«Про програму» → «Оновлення застосунку» — див. розділ «Оновлення застосунку з Google Диска».</w:t>
+      </w:r>
+    </w:p>
+    <w:p>
       <w:r>
         <w:br w:type="page"/>
       </w:r>
@@ -2643,6 +3184,42 @@
           <w:bCs w:val="false"/>
         </w:rPr>
         <w:t xml:space="preserve">Видалити проєкт чи том зі списку — не те саме, що видалити файли: файли на телефоні лишаються.</w:t>
+      </w:r>
+    </w:p>
+    <w:p>
+      <w:pPr>
+        <w:pStyle w:val="ListParagraph"/>
+        <w:numPr>
+          <w:ilvl w:val="0"/>
+          <w:numId w:val="3"/>
+        </w:numPr>
+        <w:spacing w:after="80"/>
+      </w:pPr>
+      <w:r>
+        <w:rPr>
+          <w:rFonts w:ascii="DejaVu Sans" w:cs="DejaVu Sans" w:eastAsia="DejaVu Sans" w:hAnsi="DejaVu Sans"/>
+          <w:b w:val="false"/>
+          <w:bCs w:val="false"/>
+        </w:rPr>
+        <w:t xml:space="preserve">Файли томів стирає лише «Видалити томи разом з файлами…» — з окремим підтвердженням «Видалити назавжди».</w:t>
+      </w:r>
+    </w:p>
+    <w:p>
+      <w:pPr>
+        <w:pStyle w:val="ListParagraph"/>
+        <w:numPr>
+          <w:ilvl w:val="0"/>
+          <w:numId w:val="3"/>
+        </w:numPr>
+        <w:spacing w:after="80"/>
+      </w:pPr>
+      <w:r>
+        <w:rPr>
+          <w:rFonts w:ascii="DejaVu Sans" w:cs="DejaVu Sans" w:eastAsia="DejaVu Sans" w:hAnsi="DejaVu Sans"/>
+          <w:b w:val="false"/>
+          <w:bCs w:val="false"/>
+        </w:rPr>
+        <w:t xml:space="preserve">Файли томів — лише для застосунку: Галерея і служба медіа їх не індексують.</w:t>
       </w:r>
     </w:p>
     <w:p>
@@ -2676,7 +3253,7 @@
           <w:sz w:val="18"/>
           <w:szCs w:val="18"/>
         </w:rPr>
-        <w:t xml:space="preserve">Посібник зібрано з коду застосунку v0.5.141. Якщо кнопка на телефоні називається інакше — правда за телефоном.</w:t>
+        <w:t xml:space="preserve">Посібник зібрано з коду застосунку v0.5.153. Якщо кнопка на телефоні називається інакше — правда за телефоном.</w:t>
       </w:r>
     </w:p>
     <w:sectPr>

</xml_diff>

<commit_message>
feat: Renodocs 0.6.0 — separate app (com.saney.renodocs) beside Renault Docs 0.5.153
- applicationId com.saney.renodocs, versionName 0.6.0 / code 170
- user-visible name Renodocs (app label, dialogs, notifications, guide rebuilt)
- own Drive update channel: no built-in manifest id; Renodocs.apk / renodocs-onovlennia.json
- tests that pinned the old name / 0.5.1xx updated

Co-Authored-By: Claude Opus 5.5 <noreply@anthropic.com>
Claude-Session: https://claude.ai/code/session_01VZo22Pt7joqJruUWdX7Ahb
</commit_message>
<xml_diff>
--- a/docs/ua/Posibnyk-Renault-Docs.docx
+++ b/docs/ua/Posibnyk-Renault-Docs.docx
@@ -13,7 +13,7 @@
           <w:sz w:val="18"/>
           <w:szCs w:val="18"/>
         </w:rPr>
-        <w:t xml:space="preserve">RENAULT DOCS · v0.5.153 · 17.10.2026</w:t>
+        <w:t xml:space="preserve">RENAULT DOCS · v0.6.0 · 18.10.2026</w:t>
       </w:r>
     </w:p>
     <w:p>
@@ -288,7 +288,7 @@
           <w:b w:val="false"/>
           <w:bCs w:val="false"/>
         </w:rPr>
-        <w:t xml:space="preserve">Renault Docs відкриває на телефоні оригінальну технічну документацію Renault — ту, що колись працювала лише на Windows: розділи ремонту, електросхеми, розʼєми, PDF.</w:t>
+        <w:t xml:space="preserve">Renodocs відкриває на телефоні оригінальну технічну документацію Renault — ту, що колись працювала лише на Windows: розділи ремонту, електросхеми, розʼєми, PDF.</w:t>
       </w:r>
     </w:p>
     <w:p>
@@ -873,7 +873,7 @@
           <w:b w:val="false"/>
           <w:bCs w:val="false"/>
         </w:rPr>
-        <w:t xml:space="preserve">Головне → «Готові проєкти» відкриває каталог Renault Docs з Google Диска (потрібен інтернет). Угорі видно версію каталогу, нижче — картки проєктів: роки документації і скільки томів.</w:t>
+        <w:t xml:space="preserve">Головне → «Готові проєкти» відкриває каталог Renodocs з Google Диска (потрібен інтернет). Угорі видно версію каталогу, нижче — картки проєктів: роки документації і скільки томів.</w:t>
       </w:r>
     </w:p>
     <w:p>
@@ -1354,7 +1354,7 @@
           <w:b w:val="false"/>
           <w:bCs w:val="false"/>
         </w:rPr>
-        <w:t xml:space="preserve"> не показує Renault Docs у «Відкрити за допомогою»: він не передає ні імені, ні типу файлу. Звідти — Головне → «Додати» → «Проєкт із файлу» (або ES Провідник).</w:t>
+        <w:t xml:space="preserve"> не показує Renodocs у «Відкрити за допомогою»: він не передає ні імені, ні типу файлу. Звідти — Головне → «Додати» → «Проєкт із файлу» (або ES Провідник).</w:t>
       </w:r>
     </w:p>
     <w:p>
@@ -1918,7 +1918,7 @@
           <w:b w:val="false"/>
           <w:bCs w:val="false"/>
         </w:rPr>
-        <w:t xml:space="preserve">Сторінки, які вже відкривав, застосунок пам'ятає (до ~200 МБ у пам'яті телефона, не на карті) — вдруге схема з'являється одразу, навіть після перезапуску. Цю пам'ять звільняє Android: Налаштування → Програми → Renault Docs → Пам'ять → «Очистити кеш» (томи й проєкти не зникають).</w:t>
+        <w:t xml:space="preserve">Сторінки, які вже відкривав, застосунок пам'ятає (до ~200 МБ у пам'яті телефона, не на карті) — вдруге схема з'являється одразу, навіть після перезапуску. Цю пам'ять звільняє Android: Налаштування → Програми → Renodocs → Пам'ять → «Очистити кеш» (томи й проєкти не зникають).</w:t>
       </w:r>
     </w:p>
     <w:p>
@@ -3253,7 +3253,7 @@
           <w:sz w:val="18"/>
           <w:szCs w:val="18"/>
         </w:rPr>
-        <w:t xml:space="preserve">Посібник зібрано з коду застосунку v0.5.153. Якщо кнопка на телефоні називається інакше — правда за телефоном.</w:t>
+        <w:t xml:space="preserve">Посібник зібрано з коду застосунку v0.6.0. Якщо кнопка на телефоні називається інакше — правда за телефоном.</w:t>
       </w:r>
     </w:p>
     <w:sectPr>

</xml_diff>

<commit_message>
feat: Renodocs 0.6.0 — separate app (com.saney.renodocs) beside Renault Docs 0.5.153 (#434)
- applicationId com.saney.renodocs, versionName 0.6.0 / code 170
- user-visible name Renodocs (app label, dialogs, notifications, guide rebuilt)
- own Drive update channel: no built-in manifest id; Renodocs.apk / renodocs-onovlennia.json
- tests that pinned the old name / 0.5.1xx updated


Claude-Session: https://claude.ai/code/session_01VZo22Pt7joqJruUWdX7Ahb

Co-authored-by: Claude <noreply@anthropic.com>
</commit_message>
<xml_diff>
--- a/docs/ua/Posibnyk-Renault-Docs.docx
+++ b/docs/ua/Posibnyk-Renault-Docs.docx
@@ -13,7 +13,7 @@
           <w:sz w:val="18"/>
           <w:szCs w:val="18"/>
         </w:rPr>
-        <w:t xml:space="preserve">RENAULT DOCS · v0.5.153 · 17.10.2026</w:t>
+        <w:t xml:space="preserve">RENAULT DOCS · v0.6.0 · 18.10.2026</w:t>
       </w:r>
     </w:p>
     <w:p>
@@ -288,7 +288,7 @@
           <w:b w:val="false"/>
           <w:bCs w:val="false"/>
         </w:rPr>
-        <w:t xml:space="preserve">Renault Docs відкриває на телефоні оригінальну технічну документацію Renault — ту, що колись працювала лише на Windows: розділи ремонту, електросхеми, розʼєми, PDF.</w:t>
+        <w:t xml:space="preserve">Renodocs відкриває на телефоні оригінальну технічну документацію Renault — ту, що колись працювала лише на Windows: розділи ремонту, електросхеми, розʼєми, PDF.</w:t>
       </w:r>
     </w:p>
     <w:p>
@@ -873,7 +873,7 @@
           <w:b w:val="false"/>
           <w:bCs w:val="false"/>
         </w:rPr>
-        <w:t xml:space="preserve">Головне → «Готові проєкти» відкриває каталог Renault Docs з Google Диска (потрібен інтернет). Угорі видно версію каталогу, нижче — картки проєктів: роки документації і скільки томів.</w:t>
+        <w:t xml:space="preserve">Головне → «Готові проєкти» відкриває каталог Renodocs з Google Диска (потрібен інтернет). Угорі видно версію каталогу, нижче — картки проєктів: роки документації і скільки томів.</w:t>
       </w:r>
     </w:p>
     <w:p>
@@ -1354,7 +1354,7 @@
           <w:b w:val="false"/>
           <w:bCs w:val="false"/>
         </w:rPr>
-        <w:t xml:space="preserve"> не показує Renault Docs у «Відкрити за допомогою»: він не передає ні імені, ні типу файлу. Звідти — Головне → «Додати» → «Проєкт із файлу» (або ES Провідник).</w:t>
+        <w:t xml:space="preserve"> не показує Renodocs у «Відкрити за допомогою»: він не передає ні імені, ні типу файлу. Звідти — Головне → «Додати» → «Проєкт із файлу» (або ES Провідник).</w:t>
       </w:r>
     </w:p>
     <w:p>
@@ -1918,7 +1918,7 @@
           <w:b w:val="false"/>
           <w:bCs w:val="false"/>
         </w:rPr>
-        <w:t xml:space="preserve">Сторінки, які вже відкривав, застосунок пам'ятає (до ~200 МБ у пам'яті телефона, не на карті) — вдруге схема з'являється одразу, навіть після перезапуску. Цю пам'ять звільняє Android: Налаштування → Програми → Renault Docs → Пам'ять → «Очистити кеш» (томи й проєкти не зникають).</w:t>
+        <w:t xml:space="preserve">Сторінки, які вже відкривав, застосунок пам'ятає (до ~200 МБ у пам'яті телефона, не на карті) — вдруге схема з'являється одразу, навіть після перезапуску. Цю пам'ять звільняє Android: Налаштування → Програми → Renodocs → Пам'ять → «Очистити кеш» (томи й проєкти не зникають).</w:t>
       </w:r>
     </w:p>
     <w:p>
@@ -3253,7 +3253,7 @@
           <w:sz w:val="18"/>
           <w:szCs w:val="18"/>
         </w:rPr>
-        <w:t xml:space="preserve">Посібник зібрано з коду застосунку v0.5.153. Якщо кнопка на телефоні називається інакше — правда за телефоном.</w:t>
+        <w:t xml:space="preserve">Посібник зібрано з коду застосунку v0.6.0. Якщо кнопка на телефоні називається інакше — правда за телефоном.</w:t>
       </w:r>
     </w:p>
     <w:sectPr>

</xml_diff>